<commit_message>
added SaaS, PaaS and IaaS in programming mental models
</commit_message>
<xml_diff>
--- a/programming_mental_models/p1_programming_mental_models.docx
+++ b/programming_mental_models/p1_programming_mental_models.docx
@@ -101,7 +101,23 @@
           <w:sz w:val="36"/>
           <w:szCs w:val="36"/>
         </w:rPr>
-        <w:t>Think in Systems (not in Components)……………………..3</w:t>
+        <w:t xml:space="preserve">Think in Systems (not in </w:t>
+      </w:r>
+      <w:proofErr w:type="gramStart"/>
+      <w:r>
+        <w:rPr>
+          <w:sz w:val="36"/>
+          <w:szCs w:val="36"/>
+        </w:rPr>
+        <w:t>Components)…</w:t>
+      </w:r>
+      <w:proofErr w:type="gramEnd"/>
+      <w:r>
+        <w:rPr>
+          <w:sz w:val="36"/>
+          <w:szCs w:val="36"/>
+        </w:rPr>
+        <w:t>…………………..3</w:t>
       </w:r>
     </w:p>
     <w:p>
@@ -192,7 +208,23 @@
           <w:sz w:val="36"/>
           <w:szCs w:val="36"/>
         </w:rPr>
-        <w:t>Dynamic Programming…………………………………………..7</w:t>
+        <w:t>Dynamic Programming………………………………………</w:t>
+      </w:r>
+      <w:proofErr w:type="gramStart"/>
+      <w:r>
+        <w:rPr>
+          <w:sz w:val="36"/>
+          <w:szCs w:val="36"/>
+        </w:rPr>
+        <w:t>…..</w:t>
+      </w:r>
+      <w:proofErr w:type="gramEnd"/>
+      <w:r>
+        <w:rPr>
+          <w:sz w:val="36"/>
+          <w:szCs w:val="36"/>
+        </w:rPr>
+        <w:t>7</w:t>
       </w:r>
     </w:p>
     <w:p>
@@ -213,7 +245,23 @@
           <w:sz w:val="36"/>
           <w:szCs w:val="36"/>
         </w:rPr>
-        <w:t>If condition inversing……………………………………………..9</w:t>
+        <w:t>If condition inversing…………………………………………</w:t>
+      </w:r>
+      <w:proofErr w:type="gramStart"/>
+      <w:r>
+        <w:rPr>
+          <w:sz w:val="36"/>
+          <w:szCs w:val="36"/>
+        </w:rPr>
+        <w:t>…..</w:t>
+      </w:r>
+      <w:proofErr w:type="gramEnd"/>
+      <w:r>
+        <w:rPr>
+          <w:sz w:val="36"/>
+          <w:szCs w:val="36"/>
+        </w:rPr>
+        <w:t>9</w:t>
       </w:r>
     </w:p>
     <w:p>
@@ -239,6 +287,27 @@
     </w:p>
     <w:p>
       <w:pPr>
+        <w:pStyle w:val="ListParagraph"/>
+        <w:numPr>
+          <w:ilvl w:val="0"/>
+          <w:numId w:val="5"/>
+        </w:numPr>
+        <w:jc w:val="both"/>
+        <w:rPr>
+          <w:sz w:val="36"/>
+          <w:szCs w:val="36"/>
+        </w:rPr>
+      </w:pPr>
+      <w:r>
+        <w:rPr>
+          <w:sz w:val="36"/>
+          <w:szCs w:val="36"/>
+        </w:rPr>
+        <w:t>SaaS, PaaS &amp; IaaS…………………………………………….12</w:t>
+      </w:r>
+    </w:p>
+    <w:p>
+      <w:pPr>
         <w:rPr>
           <w:sz w:val="36"/>
           <w:szCs w:val="36"/>
@@ -340,7 +409,27 @@
           <w:sz w:val="36"/>
           <w:szCs w:val="36"/>
         </w:rPr>
-        <w:t xml:space="preserve"> State machine</w:t>
+        <w:t xml:space="preserve"> </w:t>
+      </w:r>
+      <w:proofErr w:type="gramStart"/>
+      <w:r>
+        <w:rPr>
+          <w:b/>
+          <w:bCs/>
+          <w:sz w:val="36"/>
+          <w:szCs w:val="36"/>
+        </w:rPr>
+        <w:t>State</w:t>
+      </w:r>
+      <w:proofErr w:type="gramEnd"/>
+      <w:r>
+        <w:rPr>
+          <w:b/>
+          <w:bCs/>
+          <w:sz w:val="36"/>
+          <w:szCs w:val="36"/>
+        </w:rPr>
+        <w:t xml:space="preserve"> machine</w:t>
       </w:r>
       <w:r>
         <w:rPr>
@@ -2000,15 +2089,27 @@
         <w:t xml:space="preserve">        return </w:t>
       </w:r>
       <w:proofErr w:type="spellStart"/>
-      <w:r>
-        <w:rPr>
-          <w:b/>
-          <w:bCs/>
-          <w:color w:val="D86DCB" w:themeColor="accent5" w:themeTint="99"/>
-          <w:sz w:val="36"/>
-          <w:szCs w:val="36"/>
-        </w:rPr>
-        <w:t>self.__name</w:t>
+      <w:proofErr w:type="gramStart"/>
+      <w:r>
+        <w:rPr>
+          <w:b/>
+          <w:bCs/>
+          <w:color w:val="D86DCB" w:themeColor="accent5" w:themeTint="99"/>
+          <w:sz w:val="36"/>
+          <w:szCs w:val="36"/>
+        </w:rPr>
+        <w:t>self._</w:t>
+      </w:r>
+      <w:proofErr w:type="gramEnd"/>
+      <w:r>
+        <w:rPr>
+          <w:b/>
+          <w:bCs/>
+          <w:color w:val="D86DCB" w:themeColor="accent5" w:themeTint="99"/>
+          <w:sz w:val="36"/>
+          <w:szCs w:val="36"/>
+        </w:rPr>
+        <w:t>_name</w:t>
       </w:r>
       <w:proofErr w:type="spellEnd"/>
     </w:p>
@@ -2078,15 +2179,27 @@
         <w:t xml:space="preserve">        return </w:t>
       </w:r>
       <w:proofErr w:type="spellStart"/>
-      <w:r>
-        <w:rPr>
-          <w:b/>
-          <w:bCs/>
-          <w:color w:val="D86DCB" w:themeColor="accent5" w:themeTint="99"/>
-          <w:sz w:val="36"/>
-          <w:szCs w:val="36"/>
-        </w:rPr>
-        <w:t>self.__price</w:t>
+      <w:proofErr w:type="gramStart"/>
+      <w:r>
+        <w:rPr>
+          <w:b/>
+          <w:bCs/>
+          <w:color w:val="D86DCB" w:themeColor="accent5" w:themeTint="99"/>
+          <w:sz w:val="36"/>
+          <w:szCs w:val="36"/>
+        </w:rPr>
+        <w:t>self._</w:t>
+      </w:r>
+      <w:proofErr w:type="gramEnd"/>
+      <w:r>
+        <w:rPr>
+          <w:b/>
+          <w:bCs/>
+          <w:color w:val="D86DCB" w:themeColor="accent5" w:themeTint="99"/>
+          <w:sz w:val="36"/>
+          <w:szCs w:val="36"/>
+        </w:rPr>
+        <w:t>_price</w:t>
       </w:r>
       <w:proofErr w:type="spellEnd"/>
     </w:p>
@@ -2120,7 +2233,18 @@
           <w:sz w:val="36"/>
           <w:szCs w:val="36"/>
         </w:rPr>
-        <w:t>set_name</w:t>
+        <w:t>set_</w:t>
+      </w:r>
+      <w:proofErr w:type="gramStart"/>
+      <w:r>
+        <w:rPr>
+          <w:b/>
+          <w:bCs/>
+          <w:color w:val="D86DCB" w:themeColor="accent5" w:themeTint="99"/>
+          <w:sz w:val="36"/>
+          <w:szCs w:val="36"/>
+        </w:rPr>
+        <w:t>name</w:t>
       </w:r>
       <w:proofErr w:type="spellEnd"/>
       <w:r>
@@ -2131,7 +2255,18 @@
           <w:sz w:val="36"/>
           <w:szCs w:val="36"/>
         </w:rPr>
-        <w:t>(self, price):</w:t>
+        <w:t>(</w:t>
+      </w:r>
+      <w:proofErr w:type="gramEnd"/>
+      <w:r>
+        <w:rPr>
+          <w:b/>
+          <w:bCs/>
+          <w:color w:val="D86DCB" w:themeColor="accent5" w:themeTint="99"/>
+          <w:sz w:val="36"/>
+          <w:szCs w:val="36"/>
+        </w:rPr>
+        <w:t>self, price):</w:t>
       </w:r>
     </w:p>
     <w:p>
@@ -2156,15 +2291,27 @@
         <w:t xml:space="preserve">        </w:t>
       </w:r>
       <w:proofErr w:type="spellStart"/>
-      <w:r>
-        <w:rPr>
-          <w:b/>
-          <w:bCs/>
-          <w:color w:val="D86DCB" w:themeColor="accent5" w:themeTint="99"/>
-          <w:sz w:val="36"/>
-          <w:szCs w:val="36"/>
-        </w:rPr>
-        <w:t>self.__price</w:t>
+      <w:proofErr w:type="gramStart"/>
+      <w:r>
+        <w:rPr>
+          <w:b/>
+          <w:bCs/>
+          <w:color w:val="D86DCB" w:themeColor="accent5" w:themeTint="99"/>
+          <w:sz w:val="36"/>
+          <w:szCs w:val="36"/>
+        </w:rPr>
+        <w:t>self._</w:t>
+      </w:r>
+      <w:proofErr w:type="gramEnd"/>
+      <w:r>
+        <w:rPr>
+          <w:b/>
+          <w:bCs/>
+          <w:color w:val="D86DCB" w:themeColor="accent5" w:themeTint="99"/>
+          <w:sz w:val="36"/>
+          <w:szCs w:val="36"/>
+        </w:rPr>
+        <w:t>_price</w:t>
       </w:r>
       <w:proofErr w:type="spellEnd"/>
       <w:r>
@@ -2208,6 +2355,216 @@
           <w:sz w:val="36"/>
           <w:szCs w:val="36"/>
         </w:rPr>
+        <w:t>apply_</w:t>
+      </w:r>
+      <w:proofErr w:type="gramStart"/>
+      <w:r>
+        <w:rPr>
+          <w:b/>
+          <w:bCs/>
+          <w:color w:val="D86DCB" w:themeColor="accent5" w:themeTint="99"/>
+          <w:sz w:val="36"/>
+          <w:szCs w:val="36"/>
+        </w:rPr>
+        <w:t>discount</w:t>
+      </w:r>
+      <w:proofErr w:type="spellEnd"/>
+      <w:r>
+        <w:rPr>
+          <w:b/>
+          <w:bCs/>
+          <w:color w:val="D86DCB" w:themeColor="accent5" w:themeTint="99"/>
+          <w:sz w:val="36"/>
+          <w:szCs w:val="36"/>
+        </w:rPr>
+        <w:t>(</w:t>
+      </w:r>
+      <w:proofErr w:type="gramEnd"/>
+      <w:r>
+        <w:rPr>
+          <w:b/>
+          <w:bCs/>
+          <w:color w:val="D86DCB" w:themeColor="accent5" w:themeTint="99"/>
+          <w:sz w:val="36"/>
+          <w:szCs w:val="36"/>
+        </w:rPr>
+        <w:t>self, pct):</w:t>
+      </w:r>
+    </w:p>
+    <w:p>
+      <w:pPr>
+        <w:jc w:val="both"/>
+        <w:rPr>
+          <w:b/>
+          <w:bCs/>
+          <w:color w:val="D86DCB" w:themeColor="accent5" w:themeTint="99"/>
+          <w:sz w:val="36"/>
+          <w:szCs w:val="36"/>
+        </w:rPr>
+      </w:pPr>
+      <w:r>
+        <w:rPr>
+          <w:b/>
+          <w:bCs/>
+          <w:color w:val="D86DCB" w:themeColor="accent5" w:themeTint="99"/>
+          <w:sz w:val="36"/>
+          <w:szCs w:val="36"/>
+        </w:rPr>
+        <w:t xml:space="preserve">        </w:t>
+      </w:r>
+      <w:proofErr w:type="gramStart"/>
+      <w:r>
+        <w:rPr>
+          <w:b/>
+          <w:bCs/>
+          <w:color w:val="D86DCB" w:themeColor="accent5" w:themeTint="99"/>
+          <w:sz w:val="36"/>
+          <w:szCs w:val="36"/>
+        </w:rPr>
+        <w:t xml:space="preserve">return  </w:t>
+      </w:r>
+      <w:proofErr w:type="spellStart"/>
+      <w:r>
+        <w:rPr>
+          <w:b/>
+          <w:bCs/>
+          <w:color w:val="D86DCB" w:themeColor="accent5" w:themeTint="99"/>
+          <w:sz w:val="36"/>
+          <w:szCs w:val="36"/>
+        </w:rPr>
+        <w:t>self</w:t>
+      </w:r>
+      <w:proofErr w:type="gramEnd"/>
+      <w:r>
+        <w:rPr>
+          <w:b/>
+          <w:bCs/>
+          <w:color w:val="D86DCB" w:themeColor="accent5" w:themeTint="99"/>
+          <w:sz w:val="36"/>
+          <w:szCs w:val="36"/>
+        </w:rPr>
+        <w:t>.__price</w:t>
+      </w:r>
+      <w:proofErr w:type="spellEnd"/>
+      <w:r>
+        <w:rPr>
+          <w:b/>
+          <w:bCs/>
+          <w:color w:val="D86DCB" w:themeColor="accent5" w:themeTint="99"/>
+          <w:sz w:val="36"/>
+          <w:szCs w:val="36"/>
+        </w:rPr>
+        <w:t xml:space="preserve"> * (1 - pct/100)</w:t>
+      </w:r>
+    </w:p>
+    <w:p>
+      <w:pPr>
+        <w:jc w:val="both"/>
+        <w:rPr>
+          <w:b/>
+          <w:bCs/>
+          <w:color w:val="D86DCB" w:themeColor="accent5" w:themeTint="99"/>
+          <w:sz w:val="36"/>
+          <w:szCs w:val="36"/>
+        </w:rPr>
+      </w:pPr>
+    </w:p>
+    <w:p>
+      <w:pPr>
+        <w:jc w:val="both"/>
+        <w:rPr>
+          <w:b/>
+          <w:bCs/>
+          <w:color w:val="D86DCB" w:themeColor="accent5" w:themeTint="99"/>
+          <w:sz w:val="36"/>
+          <w:szCs w:val="36"/>
+        </w:rPr>
+      </w:pPr>
+      <w:r>
+        <w:rPr>
+          <w:b/>
+          <w:bCs/>
+          <w:color w:val="D86DCB" w:themeColor="accent5" w:themeTint="99"/>
+          <w:sz w:val="36"/>
+          <w:szCs w:val="36"/>
+        </w:rPr>
+        <w:t>class Subscription:</w:t>
+      </w:r>
+    </w:p>
+    <w:p>
+      <w:pPr>
+        <w:jc w:val="both"/>
+        <w:rPr>
+          <w:b/>
+          <w:bCs/>
+          <w:color w:val="D86DCB" w:themeColor="accent5" w:themeTint="99"/>
+          <w:sz w:val="36"/>
+          <w:szCs w:val="36"/>
+        </w:rPr>
+      </w:pPr>
+      <w:r>
+        <w:rPr>
+          <w:b/>
+          <w:bCs/>
+          <w:color w:val="D86DCB" w:themeColor="accent5" w:themeTint="99"/>
+          <w:sz w:val="36"/>
+          <w:szCs w:val="36"/>
+        </w:rPr>
+        <w:t xml:space="preserve">    __monthly = 0.0</w:t>
+      </w:r>
+    </w:p>
+    <w:p>
+      <w:pPr>
+        <w:jc w:val="both"/>
+        <w:rPr>
+          <w:b/>
+          <w:bCs/>
+          <w:color w:val="D86DCB" w:themeColor="accent5" w:themeTint="99"/>
+          <w:sz w:val="36"/>
+          <w:szCs w:val="36"/>
+        </w:rPr>
+      </w:pPr>
+      <w:r>
+        <w:rPr>
+          <w:b/>
+          <w:bCs/>
+          <w:color w:val="D86DCB" w:themeColor="accent5" w:themeTint="99"/>
+          <w:sz w:val="36"/>
+          <w:szCs w:val="36"/>
+        </w:rPr>
+        <w:t xml:space="preserve">    __months = 0</w:t>
+      </w:r>
+    </w:p>
+    <w:p>
+      <w:pPr>
+        <w:jc w:val="both"/>
+        <w:rPr>
+          <w:b/>
+          <w:bCs/>
+          <w:color w:val="D86DCB" w:themeColor="accent5" w:themeTint="99"/>
+          <w:sz w:val="36"/>
+          <w:szCs w:val="36"/>
+        </w:rPr>
+      </w:pPr>
+      <w:r>
+        <w:rPr>
+          <w:b/>
+          <w:bCs/>
+          <w:color w:val="D86DCB" w:themeColor="accent5" w:themeTint="99"/>
+          <w:sz w:val="36"/>
+          <w:szCs w:val="36"/>
+        </w:rPr>
+        <w:t xml:space="preserve">    def </w:t>
+      </w:r>
+      <w:proofErr w:type="spellStart"/>
+      <w:r>
+        <w:rPr>
+          <w:b/>
+          <w:bCs/>
+          <w:color w:val="D86DCB" w:themeColor="accent5" w:themeTint="99"/>
+          <w:sz w:val="36"/>
+          <w:szCs w:val="36"/>
+        </w:rPr>
         <w:t>apply_discount</w:t>
       </w:r>
       <w:proofErr w:type="spellEnd"/>
@@ -2219,206 +2576,52 @@
           <w:sz w:val="36"/>
           <w:szCs w:val="36"/>
         </w:rPr>
-        <w:t>(self, pct):</w:t>
-      </w:r>
-    </w:p>
-    <w:p>
-      <w:pPr>
-        <w:jc w:val="both"/>
-        <w:rPr>
-          <w:b/>
-          <w:bCs/>
-          <w:color w:val="D86DCB" w:themeColor="accent5" w:themeTint="99"/>
-          <w:sz w:val="36"/>
-          <w:szCs w:val="36"/>
-        </w:rPr>
-      </w:pPr>
-      <w:r>
-        <w:rPr>
-          <w:b/>
-          <w:bCs/>
-          <w:color w:val="D86DCB" w:themeColor="accent5" w:themeTint="99"/>
-          <w:sz w:val="36"/>
-          <w:szCs w:val="36"/>
-        </w:rPr>
-        <w:t xml:space="preserve">        return  </w:t>
+        <w:t>(self):</w:t>
+      </w:r>
+    </w:p>
+    <w:p>
+      <w:pPr>
+        <w:jc w:val="both"/>
+        <w:rPr>
+          <w:b/>
+          <w:bCs/>
+          <w:color w:val="D86DCB" w:themeColor="accent5" w:themeTint="99"/>
+          <w:sz w:val="36"/>
+          <w:szCs w:val="36"/>
+        </w:rPr>
+      </w:pPr>
+      <w:r>
+        <w:rPr>
+          <w:b/>
+          <w:bCs/>
+          <w:color w:val="D86DCB" w:themeColor="accent5" w:themeTint="99"/>
+          <w:sz w:val="36"/>
+          <w:szCs w:val="36"/>
+        </w:rPr>
+        <w:t xml:space="preserve">        if </w:t>
       </w:r>
       <w:proofErr w:type="spellStart"/>
-      <w:r>
-        <w:rPr>
-          <w:b/>
-          <w:bCs/>
-          <w:color w:val="D86DCB" w:themeColor="accent5" w:themeTint="99"/>
-          <w:sz w:val="36"/>
-          <w:szCs w:val="36"/>
-        </w:rPr>
-        <w:t>self.__price</w:t>
-      </w:r>
-      <w:proofErr w:type="spellEnd"/>
-      <w:r>
-        <w:rPr>
-          <w:b/>
-          <w:bCs/>
-          <w:color w:val="D86DCB" w:themeColor="accent5" w:themeTint="99"/>
-          <w:sz w:val="36"/>
-          <w:szCs w:val="36"/>
-        </w:rPr>
-        <w:t xml:space="preserve"> * (1 - pct/100)</w:t>
-      </w:r>
-    </w:p>
-    <w:p>
-      <w:pPr>
-        <w:jc w:val="both"/>
-        <w:rPr>
-          <w:b/>
-          <w:bCs/>
-          <w:color w:val="D86DCB" w:themeColor="accent5" w:themeTint="99"/>
-          <w:sz w:val="36"/>
-          <w:szCs w:val="36"/>
-        </w:rPr>
-      </w:pPr>
-    </w:p>
-    <w:p>
-      <w:pPr>
-        <w:jc w:val="both"/>
-        <w:rPr>
-          <w:b/>
-          <w:bCs/>
-          <w:color w:val="D86DCB" w:themeColor="accent5" w:themeTint="99"/>
-          <w:sz w:val="36"/>
-          <w:szCs w:val="36"/>
-        </w:rPr>
-      </w:pPr>
-      <w:r>
-        <w:rPr>
-          <w:b/>
-          <w:bCs/>
-          <w:color w:val="D86DCB" w:themeColor="accent5" w:themeTint="99"/>
-          <w:sz w:val="36"/>
-          <w:szCs w:val="36"/>
-        </w:rPr>
-        <w:t>class Subscription:</w:t>
-      </w:r>
-    </w:p>
-    <w:p>
-      <w:pPr>
-        <w:jc w:val="both"/>
-        <w:rPr>
-          <w:b/>
-          <w:bCs/>
-          <w:color w:val="D86DCB" w:themeColor="accent5" w:themeTint="99"/>
-          <w:sz w:val="36"/>
-          <w:szCs w:val="36"/>
-        </w:rPr>
-      </w:pPr>
-      <w:r>
-        <w:rPr>
-          <w:b/>
-          <w:bCs/>
-          <w:color w:val="D86DCB" w:themeColor="accent5" w:themeTint="99"/>
-          <w:sz w:val="36"/>
-          <w:szCs w:val="36"/>
-        </w:rPr>
-        <w:t xml:space="preserve">    __monthly = 0.0</w:t>
-      </w:r>
-    </w:p>
-    <w:p>
-      <w:pPr>
-        <w:jc w:val="both"/>
-        <w:rPr>
-          <w:b/>
-          <w:bCs/>
-          <w:color w:val="D86DCB" w:themeColor="accent5" w:themeTint="99"/>
-          <w:sz w:val="36"/>
-          <w:szCs w:val="36"/>
-        </w:rPr>
-      </w:pPr>
-      <w:r>
-        <w:rPr>
-          <w:b/>
-          <w:bCs/>
-          <w:color w:val="D86DCB" w:themeColor="accent5" w:themeTint="99"/>
-          <w:sz w:val="36"/>
-          <w:szCs w:val="36"/>
-        </w:rPr>
-        <w:t xml:space="preserve">    __months = 0</w:t>
-      </w:r>
-    </w:p>
-    <w:p>
-      <w:pPr>
-        <w:jc w:val="both"/>
-        <w:rPr>
-          <w:b/>
-          <w:bCs/>
-          <w:color w:val="D86DCB" w:themeColor="accent5" w:themeTint="99"/>
-          <w:sz w:val="36"/>
-          <w:szCs w:val="36"/>
-        </w:rPr>
-      </w:pPr>
-      <w:r>
-        <w:rPr>
-          <w:b/>
-          <w:bCs/>
-          <w:color w:val="D86DCB" w:themeColor="accent5" w:themeTint="99"/>
-          <w:sz w:val="36"/>
-          <w:szCs w:val="36"/>
-        </w:rPr>
-        <w:t xml:space="preserve">    def </w:t>
-      </w:r>
-      <w:proofErr w:type="spellStart"/>
-      <w:r>
-        <w:rPr>
-          <w:b/>
-          <w:bCs/>
-          <w:color w:val="D86DCB" w:themeColor="accent5" w:themeTint="99"/>
-          <w:sz w:val="36"/>
-          <w:szCs w:val="36"/>
-        </w:rPr>
-        <w:t>apply_discount</w:t>
-      </w:r>
-      <w:proofErr w:type="spellEnd"/>
-      <w:r>
-        <w:rPr>
-          <w:b/>
-          <w:bCs/>
-          <w:color w:val="D86DCB" w:themeColor="accent5" w:themeTint="99"/>
-          <w:sz w:val="36"/>
-          <w:szCs w:val="36"/>
-        </w:rPr>
-        <w:t>(self):</w:t>
-      </w:r>
-    </w:p>
-    <w:p>
-      <w:pPr>
-        <w:jc w:val="both"/>
-        <w:rPr>
-          <w:b/>
-          <w:bCs/>
-          <w:color w:val="D86DCB" w:themeColor="accent5" w:themeTint="99"/>
-          <w:sz w:val="36"/>
-          <w:szCs w:val="36"/>
-        </w:rPr>
-      </w:pPr>
-      <w:r>
-        <w:rPr>
-          <w:b/>
-          <w:bCs/>
-          <w:color w:val="D86DCB" w:themeColor="accent5" w:themeTint="99"/>
-          <w:sz w:val="36"/>
-          <w:szCs w:val="36"/>
-        </w:rPr>
-        <w:t xml:space="preserve">        if </w:t>
-      </w:r>
-      <w:proofErr w:type="spellStart"/>
-      <w:r>
-        <w:rPr>
-          <w:b/>
-          <w:bCs/>
-          <w:color w:val="D86DCB" w:themeColor="accent5" w:themeTint="99"/>
-          <w:sz w:val="36"/>
-          <w:szCs w:val="36"/>
-        </w:rPr>
-        <w:t>self.__months</w:t>
+      <w:proofErr w:type="gramStart"/>
+      <w:r>
+        <w:rPr>
+          <w:b/>
+          <w:bCs/>
+          <w:color w:val="D86DCB" w:themeColor="accent5" w:themeTint="99"/>
+          <w:sz w:val="36"/>
+          <w:szCs w:val="36"/>
+        </w:rPr>
+        <w:t>self._</w:t>
+      </w:r>
+      <w:proofErr w:type="gramEnd"/>
+      <w:r>
+        <w:rPr>
+          <w:b/>
+          <w:bCs/>
+          <w:color w:val="D86DCB" w:themeColor="accent5" w:themeTint="99"/>
+          <w:sz w:val="36"/>
+          <w:szCs w:val="36"/>
+        </w:rPr>
+        <w:t>_months</w:t>
       </w:r>
       <w:proofErr w:type="spellEnd"/>
       <w:r>
@@ -2455,15 +2658,27 @@
         <w:t xml:space="preserve">            return </w:t>
       </w:r>
       <w:proofErr w:type="spellStart"/>
-      <w:r>
-        <w:rPr>
-          <w:b/>
-          <w:bCs/>
-          <w:color w:val="D86DCB" w:themeColor="accent5" w:themeTint="99"/>
-          <w:sz w:val="36"/>
-          <w:szCs w:val="36"/>
-        </w:rPr>
-        <w:t>self.__monthly</w:t>
+      <w:proofErr w:type="gramStart"/>
+      <w:r>
+        <w:rPr>
+          <w:b/>
+          <w:bCs/>
+          <w:color w:val="D86DCB" w:themeColor="accent5" w:themeTint="99"/>
+          <w:sz w:val="36"/>
+          <w:szCs w:val="36"/>
+        </w:rPr>
+        <w:t>self._</w:t>
+      </w:r>
+      <w:proofErr w:type="gramEnd"/>
+      <w:r>
+        <w:rPr>
+          <w:b/>
+          <w:bCs/>
+          <w:color w:val="D86DCB" w:themeColor="accent5" w:themeTint="99"/>
+          <w:sz w:val="36"/>
+          <w:szCs w:val="36"/>
+        </w:rPr>
+        <w:t>_monthly</w:t>
       </w:r>
       <w:proofErr w:type="spellEnd"/>
       <w:r>
@@ -2499,15 +2714,27 @@
         <w:t xml:space="preserve">        return </w:t>
       </w:r>
       <w:proofErr w:type="spellStart"/>
-      <w:r>
-        <w:rPr>
-          <w:b/>
-          <w:bCs/>
-          <w:color w:val="D86DCB" w:themeColor="accent5" w:themeTint="99"/>
-          <w:sz w:val="36"/>
-          <w:szCs w:val="36"/>
-        </w:rPr>
-        <w:t>self.__monthly</w:t>
+      <w:proofErr w:type="gramStart"/>
+      <w:r>
+        <w:rPr>
+          <w:b/>
+          <w:bCs/>
+          <w:color w:val="D86DCB" w:themeColor="accent5" w:themeTint="99"/>
+          <w:sz w:val="36"/>
+          <w:szCs w:val="36"/>
+        </w:rPr>
+        <w:t>self._</w:t>
+      </w:r>
+      <w:proofErr w:type="gramEnd"/>
+      <w:r>
+        <w:rPr>
+          <w:b/>
+          <w:bCs/>
+          <w:color w:val="D86DCB" w:themeColor="accent5" w:themeTint="99"/>
+          <w:sz w:val="36"/>
+          <w:szCs w:val="36"/>
+        </w:rPr>
+        <w:t>_monthly</w:t>
       </w:r>
       <w:proofErr w:type="spellEnd"/>
     </w:p>
@@ -2552,7 +2779,29 @@
           <w:sz w:val="36"/>
           <w:szCs w:val="36"/>
         </w:rPr>
-        <w:t>p = Product()</w:t>
+        <w:t xml:space="preserve">p = </w:t>
+      </w:r>
+      <w:proofErr w:type="gramStart"/>
+      <w:r>
+        <w:rPr>
+          <w:b/>
+          <w:bCs/>
+          <w:color w:val="D86DCB" w:themeColor="accent5" w:themeTint="99"/>
+          <w:sz w:val="36"/>
+          <w:szCs w:val="36"/>
+        </w:rPr>
+        <w:t>Product(</w:t>
+      </w:r>
+      <w:proofErr w:type="gramEnd"/>
+      <w:r>
+        <w:rPr>
+          <w:b/>
+          <w:bCs/>
+          <w:color w:val="D86DCB" w:themeColor="accent5" w:themeTint="99"/>
+          <w:sz w:val="36"/>
+          <w:szCs w:val="36"/>
+        </w:rPr>
+        <w:t>)</w:t>
       </w:r>
     </w:p>
     <w:p>
@@ -2629,7 +2878,18 @@
           <w:sz w:val="36"/>
           <w:szCs w:val="36"/>
         </w:rPr>
-        <w:t>p.get_price</w:t>
+        <w:t>p.get_</w:t>
+      </w:r>
+      <w:proofErr w:type="gramStart"/>
+      <w:r>
+        <w:rPr>
+          <w:b/>
+          <w:bCs/>
+          <w:color w:val="D86DCB" w:themeColor="accent5" w:themeTint="99"/>
+          <w:sz w:val="36"/>
+          <w:szCs w:val="36"/>
+        </w:rPr>
+        <w:t>price</w:t>
       </w:r>
       <w:proofErr w:type="spellEnd"/>
       <w:r>
@@ -2640,7 +2900,18 @@
           <w:sz w:val="36"/>
           <w:szCs w:val="36"/>
         </w:rPr>
-        <w:t>() * qty # Data leaked</w:t>
+        <w:t>(</w:t>
+      </w:r>
+      <w:proofErr w:type="gramEnd"/>
+      <w:r>
+        <w:rPr>
+          <w:b/>
+          <w:bCs/>
+          <w:color w:val="D86DCB" w:themeColor="accent5" w:themeTint="99"/>
+          <w:sz w:val="36"/>
+          <w:szCs w:val="36"/>
+        </w:rPr>
+        <w:t>) * qty # Data leaked</w:t>
       </w:r>
     </w:p>
     <w:p>
@@ -2673,7 +2944,18 @@
           <w:sz w:val="36"/>
           <w:szCs w:val="36"/>
         </w:rPr>
-        <w:t>p.get_price</w:t>
+        <w:t>p.get_</w:t>
+      </w:r>
+      <w:proofErr w:type="gramStart"/>
+      <w:r>
+        <w:rPr>
+          <w:b/>
+          <w:bCs/>
+          <w:color w:val="D86DCB" w:themeColor="accent5" w:themeTint="99"/>
+          <w:sz w:val="36"/>
+          <w:szCs w:val="36"/>
+        </w:rPr>
+        <w:t>price</w:t>
       </w:r>
       <w:proofErr w:type="spellEnd"/>
       <w:r>
@@ -2684,7 +2966,18 @@
           <w:sz w:val="36"/>
           <w:szCs w:val="36"/>
         </w:rPr>
-        <w:t>() * rate</w:t>
+        <w:t>(</w:t>
+      </w:r>
+      <w:proofErr w:type="gramEnd"/>
+      <w:r>
+        <w:rPr>
+          <w:b/>
+          <w:bCs/>
+          <w:color w:val="D86DCB" w:themeColor="accent5" w:themeTint="99"/>
+          <w:sz w:val="36"/>
+          <w:szCs w:val="36"/>
+        </w:rPr>
+        <w:t>) * rate</w:t>
       </w:r>
     </w:p>
     <w:p>
@@ -2872,15 +3165,27 @@
         <w:t xml:space="preserve">        return </w:t>
       </w:r>
       <w:proofErr w:type="spellStart"/>
-      <w:r>
-        <w:rPr>
-          <w:b/>
-          <w:bCs/>
-          <w:color w:val="D86DCB" w:themeColor="accent5" w:themeTint="99"/>
-          <w:sz w:val="36"/>
-          <w:szCs w:val="36"/>
-        </w:rPr>
-        <w:t>self.__name</w:t>
+      <w:proofErr w:type="gramStart"/>
+      <w:r>
+        <w:rPr>
+          <w:b/>
+          <w:bCs/>
+          <w:color w:val="D86DCB" w:themeColor="accent5" w:themeTint="99"/>
+          <w:sz w:val="36"/>
+          <w:szCs w:val="36"/>
+        </w:rPr>
+        <w:t>self._</w:t>
+      </w:r>
+      <w:proofErr w:type="gramEnd"/>
+      <w:r>
+        <w:rPr>
+          <w:b/>
+          <w:bCs/>
+          <w:color w:val="D86DCB" w:themeColor="accent5" w:themeTint="99"/>
+          <w:sz w:val="36"/>
+          <w:szCs w:val="36"/>
+        </w:rPr>
+        <w:t>_name</w:t>
       </w:r>
       <w:proofErr w:type="spellEnd"/>
     </w:p>
@@ -2950,15 +3255,27 @@
         <w:t xml:space="preserve">        return </w:t>
       </w:r>
       <w:proofErr w:type="spellStart"/>
-      <w:r>
-        <w:rPr>
-          <w:b/>
-          <w:bCs/>
-          <w:color w:val="D86DCB" w:themeColor="accent5" w:themeTint="99"/>
-          <w:sz w:val="36"/>
-          <w:szCs w:val="36"/>
-        </w:rPr>
-        <w:t>self.__price</w:t>
+      <w:proofErr w:type="gramStart"/>
+      <w:r>
+        <w:rPr>
+          <w:b/>
+          <w:bCs/>
+          <w:color w:val="D86DCB" w:themeColor="accent5" w:themeTint="99"/>
+          <w:sz w:val="36"/>
+          <w:szCs w:val="36"/>
+        </w:rPr>
+        <w:t>self._</w:t>
+      </w:r>
+      <w:proofErr w:type="gramEnd"/>
+      <w:r>
+        <w:rPr>
+          <w:b/>
+          <w:bCs/>
+          <w:color w:val="D86DCB" w:themeColor="accent5" w:themeTint="99"/>
+          <w:sz w:val="36"/>
+          <w:szCs w:val="36"/>
+        </w:rPr>
+        <w:t>_price</w:t>
       </w:r>
       <w:proofErr w:type="spellEnd"/>
     </w:p>
@@ -2992,7 +3309,18 @@
           <w:sz w:val="36"/>
           <w:szCs w:val="36"/>
         </w:rPr>
-        <w:t>set_name</w:t>
+        <w:t>set_</w:t>
+      </w:r>
+      <w:proofErr w:type="gramStart"/>
+      <w:r>
+        <w:rPr>
+          <w:b/>
+          <w:bCs/>
+          <w:color w:val="D86DCB" w:themeColor="accent5" w:themeTint="99"/>
+          <w:sz w:val="36"/>
+          <w:szCs w:val="36"/>
+        </w:rPr>
+        <w:t>name</w:t>
       </w:r>
       <w:proofErr w:type="spellEnd"/>
       <w:r>
@@ -3003,7 +3331,18 @@
           <w:sz w:val="36"/>
           <w:szCs w:val="36"/>
         </w:rPr>
-        <w:t>(self, price):</w:t>
+        <w:t>(</w:t>
+      </w:r>
+      <w:proofErr w:type="gramEnd"/>
+      <w:r>
+        <w:rPr>
+          <w:b/>
+          <w:bCs/>
+          <w:color w:val="D86DCB" w:themeColor="accent5" w:themeTint="99"/>
+          <w:sz w:val="36"/>
+          <w:szCs w:val="36"/>
+        </w:rPr>
+        <w:t>self, price):</w:t>
       </w:r>
     </w:p>
     <w:p>
@@ -3029,15 +3368,27 @@
         <w:t xml:space="preserve">        </w:t>
       </w:r>
       <w:proofErr w:type="spellStart"/>
-      <w:r>
-        <w:rPr>
-          <w:b/>
-          <w:bCs/>
-          <w:color w:val="D86DCB" w:themeColor="accent5" w:themeTint="99"/>
-          <w:sz w:val="36"/>
-          <w:szCs w:val="36"/>
-        </w:rPr>
-        <w:t>self.__price</w:t>
+      <w:proofErr w:type="gramStart"/>
+      <w:r>
+        <w:rPr>
+          <w:b/>
+          <w:bCs/>
+          <w:color w:val="D86DCB" w:themeColor="accent5" w:themeTint="99"/>
+          <w:sz w:val="36"/>
+          <w:szCs w:val="36"/>
+        </w:rPr>
+        <w:t>self._</w:t>
+      </w:r>
+      <w:proofErr w:type="gramEnd"/>
+      <w:r>
+        <w:rPr>
+          <w:b/>
+          <w:bCs/>
+          <w:color w:val="D86DCB" w:themeColor="accent5" w:themeTint="99"/>
+          <w:sz w:val="36"/>
+          <w:szCs w:val="36"/>
+        </w:rPr>
+        <w:t>_price</w:t>
       </w:r>
       <w:proofErr w:type="spellEnd"/>
       <w:r>
@@ -3081,7 +3432,18 @@
           <w:sz w:val="36"/>
           <w:szCs w:val="36"/>
         </w:rPr>
-        <w:t>apply_discount</w:t>
+        <w:t>apply_</w:t>
+      </w:r>
+      <w:proofErr w:type="gramStart"/>
+      <w:r>
+        <w:rPr>
+          <w:b/>
+          <w:bCs/>
+          <w:color w:val="D86DCB" w:themeColor="accent5" w:themeTint="99"/>
+          <w:sz w:val="36"/>
+          <w:szCs w:val="36"/>
+        </w:rPr>
+        <w:t>discount</w:t>
       </w:r>
       <w:proofErr w:type="spellEnd"/>
       <w:r>
@@ -3092,29 +3454,51 @@
           <w:sz w:val="36"/>
           <w:szCs w:val="36"/>
         </w:rPr>
-        <w:t>(self, pct):</w:t>
-      </w:r>
-    </w:p>
-    <w:p>
-      <w:pPr>
-        <w:jc w:val="both"/>
-        <w:rPr>
-          <w:b/>
-          <w:bCs/>
-          <w:color w:val="D86DCB" w:themeColor="accent5" w:themeTint="99"/>
-          <w:sz w:val="36"/>
-          <w:szCs w:val="36"/>
-        </w:rPr>
-      </w:pPr>
-      <w:r>
-        <w:rPr>
-          <w:b/>
-          <w:bCs/>
-          <w:color w:val="D86DCB" w:themeColor="accent5" w:themeTint="99"/>
-          <w:sz w:val="36"/>
-          <w:szCs w:val="36"/>
-        </w:rPr>
-        <w:t xml:space="preserve">        return  </w:t>
+        <w:t>(</w:t>
+      </w:r>
+      <w:proofErr w:type="gramEnd"/>
+      <w:r>
+        <w:rPr>
+          <w:b/>
+          <w:bCs/>
+          <w:color w:val="D86DCB" w:themeColor="accent5" w:themeTint="99"/>
+          <w:sz w:val="36"/>
+          <w:szCs w:val="36"/>
+        </w:rPr>
+        <w:t>self, pct):</w:t>
+      </w:r>
+    </w:p>
+    <w:p>
+      <w:pPr>
+        <w:jc w:val="both"/>
+        <w:rPr>
+          <w:b/>
+          <w:bCs/>
+          <w:color w:val="D86DCB" w:themeColor="accent5" w:themeTint="99"/>
+          <w:sz w:val="36"/>
+          <w:szCs w:val="36"/>
+        </w:rPr>
+      </w:pPr>
+      <w:r>
+        <w:rPr>
+          <w:b/>
+          <w:bCs/>
+          <w:color w:val="D86DCB" w:themeColor="accent5" w:themeTint="99"/>
+          <w:sz w:val="36"/>
+          <w:szCs w:val="36"/>
+        </w:rPr>
+        <w:t xml:space="preserve">        </w:t>
+      </w:r>
+      <w:proofErr w:type="gramStart"/>
+      <w:r>
+        <w:rPr>
+          <w:b/>
+          <w:bCs/>
+          <w:color w:val="D86DCB" w:themeColor="accent5" w:themeTint="99"/>
+          <w:sz w:val="36"/>
+          <w:szCs w:val="36"/>
+        </w:rPr>
+        <w:t xml:space="preserve">return  </w:t>
       </w:r>
       <w:proofErr w:type="spellStart"/>
       <w:r>
@@ -3125,7 +3509,18 @@
           <w:sz w:val="36"/>
           <w:szCs w:val="36"/>
         </w:rPr>
-        <w:t>self.__price</w:t>
+        <w:t>self</w:t>
+      </w:r>
+      <w:proofErr w:type="gramEnd"/>
+      <w:r>
+        <w:rPr>
+          <w:b/>
+          <w:bCs/>
+          <w:color w:val="D86DCB" w:themeColor="accent5" w:themeTint="99"/>
+          <w:sz w:val="36"/>
+          <w:szCs w:val="36"/>
+        </w:rPr>
+        <w:t>.__price</w:t>
       </w:r>
       <w:proofErr w:type="spellEnd"/>
       <w:r>
@@ -3225,7 +3620,18 @@
           <w:sz w:val="36"/>
           <w:szCs w:val="36"/>
         </w:rPr>
-        <w:t>apply_discount</w:t>
+        <w:t>apply_</w:t>
+      </w:r>
+      <w:proofErr w:type="gramStart"/>
+      <w:r>
+        <w:rPr>
+          <w:b/>
+          <w:bCs/>
+          <w:color w:val="D86DCB" w:themeColor="accent5" w:themeTint="99"/>
+          <w:sz w:val="36"/>
+          <w:szCs w:val="36"/>
+        </w:rPr>
+        <w:t>discount</w:t>
       </w:r>
       <w:proofErr w:type="spellEnd"/>
       <w:r>
@@ -3236,7 +3642,18 @@
           <w:sz w:val="36"/>
           <w:szCs w:val="36"/>
         </w:rPr>
-        <w:t>(self, product = Product(), pct = 0.0):</w:t>
+        <w:t>(</w:t>
+      </w:r>
+      <w:proofErr w:type="gramEnd"/>
+      <w:r>
+        <w:rPr>
+          <w:b/>
+          <w:bCs/>
+          <w:color w:val="D86DCB" w:themeColor="accent5" w:themeTint="99"/>
+          <w:sz w:val="36"/>
+          <w:szCs w:val="36"/>
+        </w:rPr>
+        <w:t>self, product = Product(), pct = 0.0):</w:t>
       </w:r>
     </w:p>
     <w:p>
@@ -3269,7 +3686,18 @@
           <w:sz w:val="36"/>
           <w:szCs w:val="36"/>
         </w:rPr>
-        <w:t>product.get_price</w:t>
+        <w:t>product.get_</w:t>
+      </w:r>
+      <w:proofErr w:type="gramStart"/>
+      <w:r>
+        <w:rPr>
+          <w:b/>
+          <w:bCs/>
+          <w:color w:val="D86DCB" w:themeColor="accent5" w:themeTint="99"/>
+          <w:sz w:val="36"/>
+          <w:szCs w:val="36"/>
+        </w:rPr>
+        <w:t>price</w:t>
       </w:r>
       <w:proofErr w:type="spellEnd"/>
       <w:r>
@@ -3280,7 +3708,18 @@
           <w:sz w:val="36"/>
           <w:szCs w:val="36"/>
         </w:rPr>
-        <w:t>() * (1 - pct/100)</w:t>
+        <w:t>(</w:t>
+      </w:r>
+      <w:proofErr w:type="gramEnd"/>
+      <w:r>
+        <w:rPr>
+          <w:b/>
+          <w:bCs/>
+          <w:color w:val="D86DCB" w:themeColor="accent5" w:themeTint="99"/>
+          <w:sz w:val="36"/>
+          <w:szCs w:val="36"/>
+        </w:rPr>
+        <w:t>) * (1 - pct/100)</w:t>
       </w:r>
     </w:p>
     <w:p>
@@ -3918,7 +4357,18 @@
           <w:sz w:val="36"/>
           <w:szCs w:val="36"/>
         </w:rPr>
-        <w:t xml:space="preserve">   if (!</w:t>
+        <w:t xml:space="preserve">   if </w:t>
+      </w:r>
+      <w:proofErr w:type="gramStart"/>
+      <w:r>
+        <w:rPr>
+          <w:b/>
+          <w:bCs/>
+          <w:color w:val="D86DCB" w:themeColor="accent5" w:themeTint="99"/>
+          <w:sz w:val="36"/>
+          <w:szCs w:val="36"/>
+        </w:rPr>
+        <w:t>(!</w:t>
       </w:r>
       <w:proofErr w:type="spellStart"/>
       <w:r>
@@ -3932,6 +4382,7 @@
         <w:t>isSuccess</w:t>
       </w:r>
       <w:proofErr w:type="spellEnd"/>
+      <w:proofErr w:type="gramEnd"/>
       <w:r>
         <w:rPr>
           <w:b/>
@@ -4867,16 +5318,34 @@
           <w:sz w:val="36"/>
           <w:szCs w:val="36"/>
         </w:rPr>
-        <w:t xml:space="preserve">objects held in controllers that never </w:t>
-      </w:r>
-      <w:r>
-        <w:rPr>
-          <w:b/>
-          <w:bCs/>
-          <w:sz w:val="36"/>
-          <w:szCs w:val="36"/>
-        </w:rPr>
-        <w:t>.cancel()</w:t>
+        <w:t xml:space="preserve">objects held in controllers that </w:t>
+      </w:r>
+      <w:proofErr w:type="gramStart"/>
+      <w:r>
+        <w:rPr>
+          <w:sz w:val="36"/>
+          <w:szCs w:val="36"/>
+        </w:rPr>
+        <w:t xml:space="preserve">never </w:t>
+      </w:r>
+      <w:r>
+        <w:rPr>
+          <w:b/>
+          <w:bCs/>
+          <w:sz w:val="36"/>
+          <w:szCs w:val="36"/>
+        </w:rPr>
+        <w:t>.cancel</w:t>
+      </w:r>
+      <w:proofErr w:type="gramEnd"/>
+      <w:r>
+        <w:rPr>
+          <w:b/>
+          <w:bCs/>
+          <w:sz w:val="36"/>
+          <w:szCs w:val="36"/>
+        </w:rPr>
+        <w:t>()</w:t>
       </w:r>
       <w:r>
         <w:rPr>
@@ -5072,6 +5541,540 @@
         </w:rPr>
         <w:t xml:space="preserve"> Objects that survive a few collection cycles are moved here. This area handles longer-lived objects and is collected concurrently using mark-and-sweep or compacting algorithms so it doesn't freeze our app.</w:t>
       </w:r>
+    </w:p>
+    <w:p>
+      <w:pPr>
+        <w:jc w:val="both"/>
+        <w:rPr>
+          <w:sz w:val="36"/>
+          <w:szCs w:val="36"/>
+        </w:rPr>
+      </w:pPr>
+    </w:p>
+    <w:p>
+      <w:pPr>
+        <w:jc w:val="center"/>
+        <w:rPr>
+          <w:sz w:val="36"/>
+          <w:szCs w:val="36"/>
+        </w:rPr>
+      </w:pPr>
+      <w:r>
+        <w:rPr>
+          <w:sz w:val="36"/>
+          <w:szCs w:val="36"/>
+        </w:rPr>
+        <w:t>Break</w:t>
+      </w:r>
+    </w:p>
+    <w:p>
+      <w:pPr>
+        <w:jc w:val="both"/>
+        <w:rPr>
+          <w:sz w:val="36"/>
+          <w:szCs w:val="36"/>
+        </w:rPr>
+      </w:pPr>
+    </w:p>
+    <w:p>
+      <w:pPr>
+        <w:jc w:val="both"/>
+        <w:rPr>
+          <w:b/>
+          <w:bCs/>
+          <w:sz w:val="36"/>
+          <w:szCs w:val="36"/>
+        </w:rPr>
+      </w:pPr>
+      <w:r>
+        <w:rPr>
+          <w:b/>
+          <w:bCs/>
+          <w:sz w:val="36"/>
+          <w:szCs w:val="36"/>
+        </w:rPr>
+        <w:t>SaaS, PaaS &amp; IaaS:</w:t>
+      </w:r>
+    </w:p>
+    <w:p>
+      <w:pPr>
+        <w:jc w:val="both"/>
+        <w:rPr>
+          <w:sz w:val="36"/>
+          <w:szCs w:val="36"/>
+        </w:rPr>
+      </w:pPr>
+      <w:r>
+        <w:rPr>
+          <w:sz w:val="36"/>
+          <w:szCs w:val="36"/>
+        </w:rPr>
+        <w:t># These are 3 cloud models serving different purposes:</w:t>
+      </w:r>
+    </w:p>
+    <w:p>
+      <w:pPr>
+        <w:jc w:val="both"/>
+        <w:rPr>
+          <w:sz w:val="36"/>
+          <w:szCs w:val="36"/>
+        </w:rPr>
+      </w:pPr>
+    </w:p>
+    <w:p>
+      <w:pPr>
+        <w:pStyle w:val="ListParagraph"/>
+        <w:numPr>
+          <w:ilvl w:val="0"/>
+          <w:numId w:val="11"/>
+        </w:numPr>
+        <w:jc w:val="both"/>
+        <w:rPr>
+          <w:sz w:val="36"/>
+          <w:szCs w:val="36"/>
+        </w:rPr>
+      </w:pPr>
+      <w:r>
+        <w:rPr>
+          <w:b/>
+          <w:bCs/>
+          <w:sz w:val="36"/>
+          <w:szCs w:val="36"/>
+        </w:rPr>
+        <w:t xml:space="preserve">SaaS </w:t>
+      </w:r>
+      <w:r>
+        <w:rPr>
+          <w:sz w:val="36"/>
+          <w:szCs w:val="36"/>
+        </w:rPr>
+        <w:t>(Software as a Service):</w:t>
+      </w:r>
+    </w:p>
+    <w:p>
+      <w:pPr>
+        <w:jc w:val="both"/>
+        <w:rPr>
+          <w:sz w:val="36"/>
+          <w:szCs w:val="36"/>
+        </w:rPr>
+      </w:pPr>
+      <w:r>
+        <w:rPr>
+          <w:sz w:val="36"/>
+          <w:szCs w:val="36"/>
+        </w:rPr>
+        <w:t># Ready-to-use software accessed over the internet or website. “Just use the software”</w:t>
+      </w:r>
+    </w:p>
+    <w:p>
+      <w:pPr>
+        <w:jc w:val="both"/>
+        <w:rPr>
+          <w:sz w:val="36"/>
+          <w:szCs w:val="36"/>
+        </w:rPr>
+      </w:pPr>
+      <w:r>
+        <w:rPr>
+          <w:sz w:val="36"/>
+          <w:szCs w:val="36"/>
+        </w:rPr>
+        <w:t># Best for End Users, they consume the software without worrying about the backend</w:t>
+      </w:r>
+    </w:p>
+    <w:p>
+      <w:pPr>
+        <w:jc w:val="both"/>
+        <w:rPr>
+          <w:sz w:val="36"/>
+          <w:szCs w:val="36"/>
+        </w:rPr>
+      </w:pPr>
+      <w:r>
+        <w:rPr>
+          <w:sz w:val="36"/>
+          <w:szCs w:val="36"/>
+        </w:rPr>
+        <w:lastRenderedPageBreak/>
+        <w:t># Examples:</w:t>
+      </w:r>
+    </w:p>
+    <w:p>
+      <w:pPr>
+        <w:pStyle w:val="ListParagraph"/>
+        <w:numPr>
+          <w:ilvl w:val="0"/>
+          <w:numId w:val="12"/>
+        </w:numPr>
+        <w:jc w:val="both"/>
+        <w:rPr>
+          <w:sz w:val="36"/>
+          <w:szCs w:val="36"/>
+        </w:rPr>
+      </w:pPr>
+      <w:r>
+        <w:rPr>
+          <w:sz w:val="36"/>
+          <w:szCs w:val="36"/>
+        </w:rPr>
+        <w:t>Canva</w:t>
+      </w:r>
+    </w:p>
+    <w:p>
+      <w:pPr>
+        <w:pStyle w:val="ListParagraph"/>
+        <w:numPr>
+          <w:ilvl w:val="0"/>
+          <w:numId w:val="12"/>
+        </w:numPr>
+        <w:jc w:val="both"/>
+        <w:rPr>
+          <w:sz w:val="36"/>
+          <w:szCs w:val="36"/>
+        </w:rPr>
+      </w:pPr>
+      <w:r>
+        <w:rPr>
+          <w:sz w:val="36"/>
+          <w:szCs w:val="36"/>
+        </w:rPr>
+        <w:t>Shopify</w:t>
+      </w:r>
+    </w:p>
+    <w:p>
+      <w:pPr>
+        <w:pStyle w:val="ListParagraph"/>
+        <w:numPr>
+          <w:ilvl w:val="0"/>
+          <w:numId w:val="12"/>
+        </w:numPr>
+        <w:jc w:val="both"/>
+        <w:rPr>
+          <w:sz w:val="36"/>
+          <w:szCs w:val="36"/>
+        </w:rPr>
+      </w:pPr>
+      <w:r>
+        <w:rPr>
+          <w:sz w:val="36"/>
+          <w:szCs w:val="36"/>
+        </w:rPr>
+        <w:t>Zoom</w:t>
+      </w:r>
+    </w:p>
+    <w:p>
+      <w:pPr>
+        <w:jc w:val="both"/>
+        <w:rPr>
+          <w:sz w:val="36"/>
+          <w:szCs w:val="36"/>
+        </w:rPr>
+      </w:pPr>
+    </w:p>
+    <w:p>
+      <w:pPr>
+        <w:pStyle w:val="ListParagraph"/>
+        <w:numPr>
+          <w:ilvl w:val="0"/>
+          <w:numId w:val="11"/>
+        </w:numPr>
+        <w:jc w:val="both"/>
+        <w:rPr>
+          <w:sz w:val="36"/>
+          <w:szCs w:val="36"/>
+        </w:rPr>
+      </w:pPr>
+      <w:r>
+        <w:rPr>
+          <w:b/>
+          <w:bCs/>
+          <w:sz w:val="36"/>
+          <w:szCs w:val="36"/>
+        </w:rPr>
+        <w:t>PaaS</w:t>
+      </w:r>
+      <w:r>
+        <w:rPr>
+          <w:sz w:val="36"/>
+          <w:szCs w:val="36"/>
+        </w:rPr>
+        <w:t xml:space="preserve"> (Platform as a Service):</w:t>
+      </w:r>
+    </w:p>
+    <w:p>
+      <w:pPr>
+        <w:jc w:val="both"/>
+        <w:rPr>
+          <w:sz w:val="36"/>
+          <w:szCs w:val="36"/>
+        </w:rPr>
+      </w:pPr>
+      <w:r>
+        <w:rPr>
+          <w:sz w:val="36"/>
+          <w:szCs w:val="36"/>
+        </w:rPr>
+        <w:t># A platform for developers to build, test and deploy applications. “Build the software”</w:t>
+      </w:r>
+    </w:p>
+    <w:p>
+      <w:pPr>
+        <w:jc w:val="both"/>
+        <w:rPr>
+          <w:sz w:val="36"/>
+          <w:szCs w:val="36"/>
+        </w:rPr>
+      </w:pPr>
+      <w:r>
+        <w:rPr>
+          <w:sz w:val="36"/>
+          <w:szCs w:val="36"/>
+        </w:rPr>
+        <w:t># Best for Developers, focused on building apps while the platform handles deployment, scaling and infrastructure</w:t>
+      </w:r>
+    </w:p>
+    <w:p>
+      <w:pPr>
+        <w:jc w:val="both"/>
+        <w:rPr>
+          <w:sz w:val="36"/>
+          <w:szCs w:val="36"/>
+        </w:rPr>
+      </w:pPr>
+      <w:r>
+        <w:rPr>
+          <w:sz w:val="36"/>
+          <w:szCs w:val="36"/>
+        </w:rPr>
+        <w:t># Examples:</w:t>
+      </w:r>
+    </w:p>
+    <w:p>
+      <w:pPr>
+        <w:pStyle w:val="ListParagraph"/>
+        <w:numPr>
+          <w:ilvl w:val="0"/>
+          <w:numId w:val="13"/>
+        </w:numPr>
+        <w:jc w:val="both"/>
+        <w:rPr>
+          <w:sz w:val="36"/>
+          <w:szCs w:val="36"/>
+        </w:rPr>
+      </w:pPr>
+      <w:r>
+        <w:rPr>
+          <w:sz w:val="36"/>
+          <w:szCs w:val="36"/>
+        </w:rPr>
+        <w:t>Firebase</w:t>
+      </w:r>
+    </w:p>
+    <w:p>
+      <w:pPr>
+        <w:pStyle w:val="ListParagraph"/>
+        <w:numPr>
+          <w:ilvl w:val="0"/>
+          <w:numId w:val="13"/>
+        </w:numPr>
+        <w:jc w:val="both"/>
+        <w:rPr>
+          <w:sz w:val="36"/>
+          <w:szCs w:val="36"/>
+        </w:rPr>
+      </w:pPr>
+      <w:proofErr w:type="spellStart"/>
+      <w:r>
+        <w:rPr>
+          <w:sz w:val="36"/>
+          <w:szCs w:val="36"/>
+        </w:rPr>
+        <w:t>Vercel</w:t>
+      </w:r>
+      <w:proofErr w:type="spellEnd"/>
+    </w:p>
+    <w:p>
+      <w:pPr>
+        <w:pStyle w:val="ListParagraph"/>
+        <w:numPr>
+          <w:ilvl w:val="0"/>
+          <w:numId w:val="13"/>
+        </w:numPr>
+        <w:jc w:val="both"/>
+        <w:rPr>
+          <w:sz w:val="36"/>
+          <w:szCs w:val="36"/>
+        </w:rPr>
+      </w:pPr>
+      <w:proofErr w:type="spellStart"/>
+      <w:r>
+        <w:rPr>
+          <w:sz w:val="36"/>
+          <w:szCs w:val="36"/>
+        </w:rPr>
+        <w:t>h</w:t>
+      </w:r>
+      <w:r>
+        <w:rPr>
+          <w:sz w:val="36"/>
+          <w:szCs w:val="36"/>
+        </w:rPr>
+        <w:t>eroku</w:t>
+      </w:r>
+      <w:proofErr w:type="spellEnd"/>
+    </w:p>
+    <w:p>
+      <w:pPr>
+        <w:jc w:val="both"/>
+        <w:rPr>
+          <w:sz w:val="36"/>
+          <w:szCs w:val="36"/>
+        </w:rPr>
+      </w:pPr>
+    </w:p>
+    <w:p>
+      <w:pPr>
+        <w:pStyle w:val="ListParagraph"/>
+        <w:numPr>
+          <w:ilvl w:val="0"/>
+          <w:numId w:val="11"/>
+        </w:numPr>
+        <w:jc w:val="both"/>
+        <w:rPr>
+          <w:sz w:val="36"/>
+          <w:szCs w:val="36"/>
+        </w:rPr>
+      </w:pPr>
+      <w:r>
+        <w:rPr>
+          <w:b/>
+          <w:bCs/>
+          <w:sz w:val="36"/>
+          <w:szCs w:val="36"/>
+        </w:rPr>
+        <w:t>IaaS</w:t>
+      </w:r>
+      <w:r>
+        <w:rPr>
+          <w:sz w:val="36"/>
+          <w:szCs w:val="36"/>
+        </w:rPr>
+        <w:t xml:space="preserve"> (Infrastructure as a Service):</w:t>
+      </w:r>
+    </w:p>
+    <w:p>
+      <w:pPr>
+        <w:jc w:val="both"/>
+        <w:rPr>
+          <w:sz w:val="36"/>
+          <w:szCs w:val="36"/>
+        </w:rPr>
+      </w:pPr>
+      <w:r>
+        <w:rPr>
+          <w:sz w:val="36"/>
+          <w:szCs w:val="36"/>
+        </w:rPr>
+        <w:t># Virtualized infrastructure resources over the internet or web. “Manage the infrastructure”</w:t>
+      </w:r>
+    </w:p>
+    <w:p>
+      <w:pPr>
+        <w:jc w:val="both"/>
+        <w:rPr>
+          <w:sz w:val="36"/>
+          <w:szCs w:val="36"/>
+        </w:rPr>
+      </w:pPr>
+      <w:r>
+        <w:rPr>
+          <w:sz w:val="36"/>
+          <w:szCs w:val="36"/>
+        </w:rPr>
+        <w:t># Best for IT Teams / Businesses, full control over infrastructure, customization and security</w:t>
+      </w:r>
+    </w:p>
+    <w:p>
+      <w:pPr>
+        <w:pStyle w:val="ListParagraph"/>
+        <w:numPr>
+          <w:ilvl w:val="0"/>
+          <w:numId w:val="14"/>
+        </w:numPr>
+        <w:jc w:val="both"/>
+        <w:rPr>
+          <w:sz w:val="36"/>
+          <w:szCs w:val="36"/>
+        </w:rPr>
+      </w:pPr>
+      <w:r>
+        <w:rPr>
+          <w:sz w:val="36"/>
+          <w:szCs w:val="36"/>
+        </w:rPr>
+        <w:t>AWS</w:t>
+      </w:r>
+    </w:p>
+    <w:p>
+      <w:pPr>
+        <w:pStyle w:val="ListParagraph"/>
+        <w:numPr>
+          <w:ilvl w:val="0"/>
+          <w:numId w:val="14"/>
+        </w:numPr>
+        <w:jc w:val="both"/>
+        <w:rPr>
+          <w:sz w:val="36"/>
+          <w:szCs w:val="36"/>
+        </w:rPr>
+      </w:pPr>
+      <w:r>
+        <w:rPr>
+          <w:sz w:val="36"/>
+          <w:szCs w:val="36"/>
+        </w:rPr>
+        <w:t>Google Cloud</w:t>
+      </w:r>
+    </w:p>
+    <w:p>
+      <w:pPr>
+        <w:pStyle w:val="ListParagraph"/>
+        <w:numPr>
+          <w:ilvl w:val="0"/>
+          <w:numId w:val="14"/>
+        </w:numPr>
+        <w:jc w:val="both"/>
+        <w:rPr>
+          <w:sz w:val="36"/>
+          <w:szCs w:val="36"/>
+        </w:rPr>
+      </w:pPr>
+      <w:r>
+        <w:rPr>
+          <w:sz w:val="36"/>
+          <w:szCs w:val="36"/>
+        </w:rPr>
+        <w:t>Microsoft Azure</w:t>
+      </w:r>
+    </w:p>
+    <w:p>
+      <w:pPr>
+        <w:jc w:val="both"/>
+        <w:rPr>
+          <w:sz w:val="36"/>
+          <w:szCs w:val="36"/>
+        </w:rPr>
+      </w:pPr>
+    </w:p>
+    <w:p>
+      <w:pPr>
+        <w:jc w:val="both"/>
+        <w:rPr>
+          <w:sz w:val="36"/>
+          <w:szCs w:val="36"/>
+        </w:rPr>
+      </w:pPr>
     </w:p>
     <w:sectPr>
       <w:footerReference w:type="default" r:id="rId8"/>
@@ -5303,6 +6306,119 @@
     </w:lvl>
   </w:abstractNum>
   <w:abstractNum w:abstractNumId="1" w15:restartNumberingAfterBreak="0">
+    <w:nsid w:val="23A11734"/>
+    <w:multiLevelType w:val="hybridMultilevel"/>
+    <w:tmpl w:val="CCB83A46"/>
+    <w:lvl w:ilvl="0" w:tplc="04090001">
+      <w:start w:val="1"/>
+      <w:numFmt w:val="bullet"/>
+      <w:lvlText w:val=""/>
+      <w:lvlJc w:val="left"/>
+      <w:pPr>
+        <w:ind w:left="360" w:hanging="360"/>
+      </w:pPr>
+      <w:rPr>
+        <w:rFonts w:ascii="Symbol" w:hAnsi="Symbol" w:hint="default"/>
+      </w:rPr>
+    </w:lvl>
+    <w:lvl w:ilvl="1" w:tplc="04090003" w:tentative="1">
+      <w:start w:val="1"/>
+      <w:numFmt w:val="bullet"/>
+      <w:lvlText w:val="o"/>
+      <w:lvlJc w:val="left"/>
+      <w:pPr>
+        <w:ind w:left="1080" w:hanging="360"/>
+      </w:pPr>
+      <w:rPr>
+        <w:rFonts w:ascii="Courier New" w:hAnsi="Courier New" w:cs="Courier New" w:hint="default"/>
+      </w:rPr>
+    </w:lvl>
+    <w:lvl w:ilvl="2" w:tplc="04090005" w:tentative="1">
+      <w:start w:val="1"/>
+      <w:numFmt w:val="bullet"/>
+      <w:lvlText w:val=""/>
+      <w:lvlJc w:val="left"/>
+      <w:pPr>
+        <w:ind w:left="1800" w:hanging="360"/>
+      </w:pPr>
+      <w:rPr>
+        <w:rFonts w:ascii="Wingdings" w:hAnsi="Wingdings" w:hint="default"/>
+      </w:rPr>
+    </w:lvl>
+    <w:lvl w:ilvl="3" w:tplc="04090001" w:tentative="1">
+      <w:start w:val="1"/>
+      <w:numFmt w:val="bullet"/>
+      <w:lvlText w:val=""/>
+      <w:lvlJc w:val="left"/>
+      <w:pPr>
+        <w:ind w:left="2520" w:hanging="360"/>
+      </w:pPr>
+      <w:rPr>
+        <w:rFonts w:ascii="Symbol" w:hAnsi="Symbol" w:hint="default"/>
+      </w:rPr>
+    </w:lvl>
+    <w:lvl w:ilvl="4" w:tplc="04090003" w:tentative="1">
+      <w:start w:val="1"/>
+      <w:numFmt w:val="bullet"/>
+      <w:lvlText w:val="o"/>
+      <w:lvlJc w:val="left"/>
+      <w:pPr>
+        <w:ind w:left="3240" w:hanging="360"/>
+      </w:pPr>
+      <w:rPr>
+        <w:rFonts w:ascii="Courier New" w:hAnsi="Courier New" w:cs="Courier New" w:hint="default"/>
+      </w:rPr>
+    </w:lvl>
+    <w:lvl w:ilvl="5" w:tplc="04090005" w:tentative="1">
+      <w:start w:val="1"/>
+      <w:numFmt w:val="bullet"/>
+      <w:lvlText w:val=""/>
+      <w:lvlJc w:val="left"/>
+      <w:pPr>
+        <w:ind w:left="3960" w:hanging="360"/>
+      </w:pPr>
+      <w:rPr>
+        <w:rFonts w:ascii="Wingdings" w:hAnsi="Wingdings" w:hint="default"/>
+      </w:rPr>
+    </w:lvl>
+    <w:lvl w:ilvl="6" w:tplc="04090001" w:tentative="1">
+      <w:start w:val="1"/>
+      <w:numFmt w:val="bullet"/>
+      <w:lvlText w:val=""/>
+      <w:lvlJc w:val="left"/>
+      <w:pPr>
+        <w:ind w:left="4680" w:hanging="360"/>
+      </w:pPr>
+      <w:rPr>
+        <w:rFonts w:ascii="Symbol" w:hAnsi="Symbol" w:hint="default"/>
+      </w:rPr>
+    </w:lvl>
+    <w:lvl w:ilvl="7" w:tplc="04090003" w:tentative="1">
+      <w:start w:val="1"/>
+      <w:numFmt w:val="bullet"/>
+      <w:lvlText w:val="o"/>
+      <w:lvlJc w:val="left"/>
+      <w:pPr>
+        <w:ind w:left="5400" w:hanging="360"/>
+      </w:pPr>
+      <w:rPr>
+        <w:rFonts w:ascii="Courier New" w:hAnsi="Courier New" w:cs="Courier New" w:hint="default"/>
+      </w:rPr>
+    </w:lvl>
+    <w:lvl w:ilvl="8" w:tplc="04090005" w:tentative="1">
+      <w:start w:val="1"/>
+      <w:numFmt w:val="bullet"/>
+      <w:lvlText w:val=""/>
+      <w:lvlJc w:val="left"/>
+      <w:pPr>
+        <w:ind w:left="6120" w:hanging="360"/>
+      </w:pPr>
+      <w:rPr>
+        <w:rFonts w:ascii="Wingdings" w:hAnsi="Wingdings" w:hint="default"/>
+      </w:rPr>
+    </w:lvl>
+  </w:abstractNum>
+  <w:abstractNum w:abstractNumId="2" w15:restartNumberingAfterBreak="0">
     <w:nsid w:val="2557343A"/>
     <w:multiLevelType w:val="hybridMultilevel"/>
     <w:tmpl w:val="8A30FEE6"/>
@@ -5415,7 +6531,7 @@
       </w:rPr>
     </w:lvl>
   </w:abstractNum>
-  <w:abstractNum w:abstractNumId="2" w15:restartNumberingAfterBreak="0">
+  <w:abstractNum w:abstractNumId="3" w15:restartNumberingAfterBreak="0">
     <w:nsid w:val="2F592B5B"/>
     <w:multiLevelType w:val="hybridMultilevel"/>
     <w:tmpl w:val="FE62C13A"/>
@@ -5528,7 +6644,7 @@
       </w:rPr>
     </w:lvl>
   </w:abstractNum>
-  <w:abstractNum w:abstractNumId="3" w15:restartNumberingAfterBreak="0">
+  <w:abstractNum w:abstractNumId="4" w15:restartNumberingAfterBreak="0">
     <w:nsid w:val="352E72A6"/>
     <w:multiLevelType w:val="hybridMultilevel"/>
     <w:tmpl w:val="36608DA2"/>
@@ -5641,7 +6757,120 @@
       </w:rPr>
     </w:lvl>
   </w:abstractNum>
-  <w:abstractNum w:abstractNumId="4" w15:restartNumberingAfterBreak="0">
+  <w:abstractNum w:abstractNumId="5" w15:restartNumberingAfterBreak="0">
+    <w:nsid w:val="3A64427A"/>
+    <w:multiLevelType w:val="hybridMultilevel"/>
+    <w:tmpl w:val="08061F78"/>
+    <w:lvl w:ilvl="0" w:tplc="04090001">
+      <w:start w:val="1"/>
+      <w:numFmt w:val="bullet"/>
+      <w:lvlText w:val=""/>
+      <w:lvlJc w:val="left"/>
+      <w:pPr>
+        <w:ind w:left="360" w:hanging="360"/>
+      </w:pPr>
+      <w:rPr>
+        <w:rFonts w:ascii="Symbol" w:hAnsi="Symbol" w:hint="default"/>
+      </w:rPr>
+    </w:lvl>
+    <w:lvl w:ilvl="1" w:tplc="04090003" w:tentative="1">
+      <w:start w:val="1"/>
+      <w:numFmt w:val="bullet"/>
+      <w:lvlText w:val="o"/>
+      <w:lvlJc w:val="left"/>
+      <w:pPr>
+        <w:ind w:left="1080" w:hanging="360"/>
+      </w:pPr>
+      <w:rPr>
+        <w:rFonts w:ascii="Courier New" w:hAnsi="Courier New" w:cs="Courier New" w:hint="default"/>
+      </w:rPr>
+    </w:lvl>
+    <w:lvl w:ilvl="2" w:tplc="04090005" w:tentative="1">
+      <w:start w:val="1"/>
+      <w:numFmt w:val="bullet"/>
+      <w:lvlText w:val=""/>
+      <w:lvlJc w:val="left"/>
+      <w:pPr>
+        <w:ind w:left="1800" w:hanging="360"/>
+      </w:pPr>
+      <w:rPr>
+        <w:rFonts w:ascii="Wingdings" w:hAnsi="Wingdings" w:hint="default"/>
+      </w:rPr>
+    </w:lvl>
+    <w:lvl w:ilvl="3" w:tplc="04090001" w:tentative="1">
+      <w:start w:val="1"/>
+      <w:numFmt w:val="bullet"/>
+      <w:lvlText w:val=""/>
+      <w:lvlJc w:val="left"/>
+      <w:pPr>
+        <w:ind w:left="2520" w:hanging="360"/>
+      </w:pPr>
+      <w:rPr>
+        <w:rFonts w:ascii="Symbol" w:hAnsi="Symbol" w:hint="default"/>
+      </w:rPr>
+    </w:lvl>
+    <w:lvl w:ilvl="4" w:tplc="04090003" w:tentative="1">
+      <w:start w:val="1"/>
+      <w:numFmt w:val="bullet"/>
+      <w:lvlText w:val="o"/>
+      <w:lvlJc w:val="left"/>
+      <w:pPr>
+        <w:ind w:left="3240" w:hanging="360"/>
+      </w:pPr>
+      <w:rPr>
+        <w:rFonts w:ascii="Courier New" w:hAnsi="Courier New" w:cs="Courier New" w:hint="default"/>
+      </w:rPr>
+    </w:lvl>
+    <w:lvl w:ilvl="5" w:tplc="04090005" w:tentative="1">
+      <w:start w:val="1"/>
+      <w:numFmt w:val="bullet"/>
+      <w:lvlText w:val=""/>
+      <w:lvlJc w:val="left"/>
+      <w:pPr>
+        <w:ind w:left="3960" w:hanging="360"/>
+      </w:pPr>
+      <w:rPr>
+        <w:rFonts w:ascii="Wingdings" w:hAnsi="Wingdings" w:hint="default"/>
+      </w:rPr>
+    </w:lvl>
+    <w:lvl w:ilvl="6" w:tplc="04090001" w:tentative="1">
+      <w:start w:val="1"/>
+      <w:numFmt w:val="bullet"/>
+      <w:lvlText w:val=""/>
+      <w:lvlJc w:val="left"/>
+      <w:pPr>
+        <w:ind w:left="4680" w:hanging="360"/>
+      </w:pPr>
+      <w:rPr>
+        <w:rFonts w:ascii="Symbol" w:hAnsi="Symbol" w:hint="default"/>
+      </w:rPr>
+    </w:lvl>
+    <w:lvl w:ilvl="7" w:tplc="04090003" w:tentative="1">
+      <w:start w:val="1"/>
+      <w:numFmt w:val="bullet"/>
+      <w:lvlText w:val="o"/>
+      <w:lvlJc w:val="left"/>
+      <w:pPr>
+        <w:ind w:left="5400" w:hanging="360"/>
+      </w:pPr>
+      <w:rPr>
+        <w:rFonts w:ascii="Courier New" w:hAnsi="Courier New" w:cs="Courier New" w:hint="default"/>
+      </w:rPr>
+    </w:lvl>
+    <w:lvl w:ilvl="8" w:tplc="04090005" w:tentative="1">
+      <w:start w:val="1"/>
+      <w:numFmt w:val="bullet"/>
+      <w:lvlText w:val=""/>
+      <w:lvlJc w:val="left"/>
+      <w:pPr>
+        <w:ind w:left="6120" w:hanging="360"/>
+      </w:pPr>
+      <w:rPr>
+        <w:rFonts w:ascii="Wingdings" w:hAnsi="Wingdings" w:hint="default"/>
+      </w:rPr>
+    </w:lvl>
+  </w:abstractNum>
+  <w:abstractNum w:abstractNumId="6" w15:restartNumberingAfterBreak="0">
     <w:nsid w:val="3CE6114A"/>
     <w:multiLevelType w:val="hybridMultilevel"/>
     <w:tmpl w:val="DAC8EAB2"/>
@@ -5754,7 +6983,120 @@
       </w:rPr>
     </w:lvl>
   </w:abstractNum>
-  <w:abstractNum w:abstractNumId="5" w15:restartNumberingAfterBreak="0">
+  <w:abstractNum w:abstractNumId="7" w15:restartNumberingAfterBreak="0">
+    <w:nsid w:val="3EA15ED3"/>
+    <w:multiLevelType w:val="hybridMultilevel"/>
+    <w:tmpl w:val="32A66580"/>
+    <w:lvl w:ilvl="0" w:tplc="04090001">
+      <w:start w:val="1"/>
+      <w:numFmt w:val="bullet"/>
+      <w:lvlText w:val=""/>
+      <w:lvlJc w:val="left"/>
+      <w:pPr>
+        <w:ind w:left="360" w:hanging="360"/>
+      </w:pPr>
+      <w:rPr>
+        <w:rFonts w:ascii="Symbol" w:hAnsi="Symbol" w:hint="default"/>
+      </w:rPr>
+    </w:lvl>
+    <w:lvl w:ilvl="1" w:tplc="04090003" w:tentative="1">
+      <w:start w:val="1"/>
+      <w:numFmt w:val="bullet"/>
+      <w:lvlText w:val="o"/>
+      <w:lvlJc w:val="left"/>
+      <w:pPr>
+        <w:ind w:left="1080" w:hanging="360"/>
+      </w:pPr>
+      <w:rPr>
+        <w:rFonts w:ascii="Courier New" w:hAnsi="Courier New" w:cs="Courier New" w:hint="default"/>
+      </w:rPr>
+    </w:lvl>
+    <w:lvl w:ilvl="2" w:tplc="04090005" w:tentative="1">
+      <w:start w:val="1"/>
+      <w:numFmt w:val="bullet"/>
+      <w:lvlText w:val=""/>
+      <w:lvlJc w:val="left"/>
+      <w:pPr>
+        <w:ind w:left="1800" w:hanging="360"/>
+      </w:pPr>
+      <w:rPr>
+        <w:rFonts w:ascii="Wingdings" w:hAnsi="Wingdings" w:hint="default"/>
+      </w:rPr>
+    </w:lvl>
+    <w:lvl w:ilvl="3" w:tplc="04090001" w:tentative="1">
+      <w:start w:val="1"/>
+      <w:numFmt w:val="bullet"/>
+      <w:lvlText w:val=""/>
+      <w:lvlJc w:val="left"/>
+      <w:pPr>
+        <w:ind w:left="2520" w:hanging="360"/>
+      </w:pPr>
+      <w:rPr>
+        <w:rFonts w:ascii="Symbol" w:hAnsi="Symbol" w:hint="default"/>
+      </w:rPr>
+    </w:lvl>
+    <w:lvl w:ilvl="4" w:tplc="04090003" w:tentative="1">
+      <w:start w:val="1"/>
+      <w:numFmt w:val="bullet"/>
+      <w:lvlText w:val="o"/>
+      <w:lvlJc w:val="left"/>
+      <w:pPr>
+        <w:ind w:left="3240" w:hanging="360"/>
+      </w:pPr>
+      <w:rPr>
+        <w:rFonts w:ascii="Courier New" w:hAnsi="Courier New" w:cs="Courier New" w:hint="default"/>
+      </w:rPr>
+    </w:lvl>
+    <w:lvl w:ilvl="5" w:tplc="04090005" w:tentative="1">
+      <w:start w:val="1"/>
+      <w:numFmt w:val="bullet"/>
+      <w:lvlText w:val=""/>
+      <w:lvlJc w:val="left"/>
+      <w:pPr>
+        <w:ind w:left="3960" w:hanging="360"/>
+      </w:pPr>
+      <w:rPr>
+        <w:rFonts w:ascii="Wingdings" w:hAnsi="Wingdings" w:hint="default"/>
+      </w:rPr>
+    </w:lvl>
+    <w:lvl w:ilvl="6" w:tplc="04090001" w:tentative="1">
+      <w:start w:val="1"/>
+      <w:numFmt w:val="bullet"/>
+      <w:lvlText w:val=""/>
+      <w:lvlJc w:val="left"/>
+      <w:pPr>
+        <w:ind w:left="4680" w:hanging="360"/>
+      </w:pPr>
+      <w:rPr>
+        <w:rFonts w:ascii="Symbol" w:hAnsi="Symbol" w:hint="default"/>
+      </w:rPr>
+    </w:lvl>
+    <w:lvl w:ilvl="7" w:tplc="04090003" w:tentative="1">
+      <w:start w:val="1"/>
+      <w:numFmt w:val="bullet"/>
+      <w:lvlText w:val="o"/>
+      <w:lvlJc w:val="left"/>
+      <w:pPr>
+        <w:ind w:left="5400" w:hanging="360"/>
+      </w:pPr>
+      <w:rPr>
+        <w:rFonts w:ascii="Courier New" w:hAnsi="Courier New" w:cs="Courier New" w:hint="default"/>
+      </w:rPr>
+    </w:lvl>
+    <w:lvl w:ilvl="8" w:tplc="04090005" w:tentative="1">
+      <w:start w:val="1"/>
+      <w:numFmt w:val="bullet"/>
+      <w:lvlText w:val=""/>
+      <w:lvlJc w:val="left"/>
+      <w:pPr>
+        <w:ind w:left="6120" w:hanging="360"/>
+      </w:pPr>
+      <w:rPr>
+        <w:rFonts w:ascii="Wingdings" w:hAnsi="Wingdings" w:hint="default"/>
+      </w:rPr>
+    </w:lvl>
+  </w:abstractNum>
+  <w:abstractNum w:abstractNumId="8" w15:restartNumberingAfterBreak="0">
     <w:nsid w:val="48BC2A2E"/>
     <w:multiLevelType w:val="hybridMultilevel"/>
     <w:tmpl w:val="262A606E"/>
@@ -5845,7 +7187,98 @@
       </w:pPr>
     </w:lvl>
   </w:abstractNum>
-  <w:abstractNum w:abstractNumId="6" w15:restartNumberingAfterBreak="0">
+  <w:abstractNum w:abstractNumId="9" w15:restartNumberingAfterBreak="0">
+    <w:nsid w:val="49767D6F"/>
+    <w:multiLevelType w:val="hybridMultilevel"/>
+    <w:tmpl w:val="4218F1BC"/>
+    <w:lvl w:ilvl="0" w:tplc="4AE6B750">
+      <w:start w:val="1"/>
+      <w:numFmt w:val="decimal"/>
+      <w:lvlText w:val="%1."/>
+      <w:lvlJc w:val="left"/>
+      <w:pPr>
+        <w:ind w:left="360" w:hanging="360"/>
+      </w:pPr>
+      <w:rPr>
+        <w:rFonts w:hint="default"/>
+        <w:b/>
+        <w:bCs/>
+      </w:rPr>
+    </w:lvl>
+    <w:lvl w:ilvl="1" w:tplc="04090019" w:tentative="1">
+      <w:start w:val="1"/>
+      <w:numFmt w:val="lowerLetter"/>
+      <w:lvlText w:val="%2."/>
+      <w:lvlJc w:val="left"/>
+      <w:pPr>
+        <w:ind w:left="1080" w:hanging="360"/>
+      </w:pPr>
+    </w:lvl>
+    <w:lvl w:ilvl="2" w:tplc="0409001B" w:tentative="1">
+      <w:start w:val="1"/>
+      <w:numFmt w:val="lowerRoman"/>
+      <w:lvlText w:val="%3."/>
+      <w:lvlJc w:val="right"/>
+      <w:pPr>
+        <w:ind w:left="1800" w:hanging="180"/>
+      </w:pPr>
+    </w:lvl>
+    <w:lvl w:ilvl="3" w:tplc="0409000F" w:tentative="1">
+      <w:start w:val="1"/>
+      <w:numFmt w:val="decimal"/>
+      <w:lvlText w:val="%4."/>
+      <w:lvlJc w:val="left"/>
+      <w:pPr>
+        <w:ind w:left="2520" w:hanging="360"/>
+      </w:pPr>
+    </w:lvl>
+    <w:lvl w:ilvl="4" w:tplc="04090019" w:tentative="1">
+      <w:start w:val="1"/>
+      <w:numFmt w:val="lowerLetter"/>
+      <w:lvlText w:val="%5."/>
+      <w:lvlJc w:val="left"/>
+      <w:pPr>
+        <w:ind w:left="3240" w:hanging="360"/>
+      </w:pPr>
+    </w:lvl>
+    <w:lvl w:ilvl="5" w:tplc="0409001B" w:tentative="1">
+      <w:start w:val="1"/>
+      <w:numFmt w:val="lowerRoman"/>
+      <w:lvlText w:val="%6."/>
+      <w:lvlJc w:val="right"/>
+      <w:pPr>
+        <w:ind w:left="3960" w:hanging="180"/>
+      </w:pPr>
+    </w:lvl>
+    <w:lvl w:ilvl="6" w:tplc="0409000F" w:tentative="1">
+      <w:start w:val="1"/>
+      <w:numFmt w:val="decimal"/>
+      <w:lvlText w:val="%7."/>
+      <w:lvlJc w:val="left"/>
+      <w:pPr>
+        <w:ind w:left="4680" w:hanging="360"/>
+      </w:pPr>
+    </w:lvl>
+    <w:lvl w:ilvl="7" w:tplc="04090019" w:tentative="1">
+      <w:start w:val="1"/>
+      <w:numFmt w:val="lowerLetter"/>
+      <w:lvlText w:val="%8."/>
+      <w:lvlJc w:val="left"/>
+      <w:pPr>
+        <w:ind w:left="5400" w:hanging="360"/>
+      </w:pPr>
+    </w:lvl>
+    <w:lvl w:ilvl="8" w:tplc="0409001B" w:tentative="1">
+      <w:start w:val="1"/>
+      <w:numFmt w:val="lowerRoman"/>
+      <w:lvlText w:val="%9."/>
+      <w:lvlJc w:val="right"/>
+      <w:pPr>
+        <w:ind w:left="6120" w:hanging="180"/>
+      </w:pPr>
+    </w:lvl>
+  </w:abstractNum>
+  <w:abstractNum w:abstractNumId="10" w15:restartNumberingAfterBreak="0">
     <w:nsid w:val="4A3641F2"/>
     <w:multiLevelType w:val="hybridMultilevel"/>
     <w:tmpl w:val="55A4C6E8"/>
@@ -5958,7 +7391,7 @@
       </w:rPr>
     </w:lvl>
   </w:abstractNum>
-  <w:abstractNum w:abstractNumId="7" w15:restartNumberingAfterBreak="0">
+  <w:abstractNum w:abstractNumId="11" w15:restartNumberingAfterBreak="0">
     <w:nsid w:val="566B2156"/>
     <w:multiLevelType w:val="hybridMultilevel"/>
     <w:tmpl w:val="49A48358"/>
@@ -6071,7 +7504,7 @@
       </w:rPr>
     </w:lvl>
   </w:abstractNum>
-  <w:abstractNum w:abstractNumId="8" w15:restartNumberingAfterBreak="0">
+  <w:abstractNum w:abstractNumId="12" w15:restartNumberingAfterBreak="0">
     <w:nsid w:val="6574689A"/>
     <w:multiLevelType w:val="hybridMultilevel"/>
     <w:tmpl w:val="3040723C"/>
@@ -6184,7 +7617,7 @@
       </w:rPr>
     </w:lvl>
   </w:abstractNum>
-  <w:abstractNum w:abstractNumId="9" w15:restartNumberingAfterBreak="0">
+  <w:abstractNum w:abstractNumId="13" w15:restartNumberingAfterBreak="0">
     <w:nsid w:val="77931365"/>
     <w:multiLevelType w:val="hybridMultilevel"/>
     <w:tmpl w:val="5C26A464"/>
@@ -6298,34 +7731,46 @@
     </w:lvl>
   </w:abstractNum>
   <w:num w:numId="1" w16cid:durableId="664865304">
+    <w:abstractNumId w:val="12"/>
+  </w:num>
+  <w:num w:numId="2" w16cid:durableId="2008902027">
+    <w:abstractNumId w:val="4"/>
+  </w:num>
+  <w:num w:numId="3" w16cid:durableId="704447734">
+    <w:abstractNumId w:val="13"/>
+  </w:num>
+  <w:num w:numId="4" w16cid:durableId="1510021272">
+    <w:abstractNumId w:val="3"/>
+  </w:num>
+  <w:num w:numId="5" w16cid:durableId="359281728">
     <w:abstractNumId w:val="8"/>
   </w:num>
-  <w:num w:numId="2" w16cid:durableId="2008902027">
-    <w:abstractNumId w:val="3"/>
-  </w:num>
-  <w:num w:numId="3" w16cid:durableId="704447734">
-    <w:abstractNumId w:val="9"/>
-  </w:num>
-  <w:num w:numId="4" w16cid:durableId="1510021272">
-    <w:abstractNumId w:val="2"/>
-  </w:num>
-  <w:num w:numId="5" w16cid:durableId="359281728">
-    <w:abstractNumId w:val="5"/>
-  </w:num>
   <w:num w:numId="6" w16cid:durableId="259992389">
-    <w:abstractNumId w:val="4"/>
+    <w:abstractNumId w:val="6"/>
   </w:num>
   <w:num w:numId="7" w16cid:durableId="202402556">
-    <w:abstractNumId w:val="1"/>
+    <w:abstractNumId w:val="2"/>
   </w:num>
   <w:num w:numId="8" w16cid:durableId="879320700">
     <w:abstractNumId w:val="0"/>
   </w:num>
   <w:num w:numId="9" w16cid:durableId="1021131634">
+    <w:abstractNumId w:val="11"/>
+  </w:num>
+  <w:num w:numId="10" w16cid:durableId="1837186236">
+    <w:abstractNumId w:val="10"/>
+  </w:num>
+  <w:num w:numId="11" w16cid:durableId="480124734">
+    <w:abstractNumId w:val="9"/>
+  </w:num>
+  <w:num w:numId="12" w16cid:durableId="1120107619">
     <w:abstractNumId w:val="7"/>
   </w:num>
-  <w:num w:numId="10" w16cid:durableId="1837186236">
-    <w:abstractNumId w:val="6"/>
+  <w:num w:numId="13" w16cid:durableId="2129663888">
+    <w:abstractNumId w:val="1"/>
+  </w:num>
+  <w:num w:numId="14" w16cid:durableId="1609662036">
+    <w:abstractNumId w:val="5"/>
   </w:num>
 </w:numbering>
 </file>

</xml_diff>

<commit_message>
Added SSH key concept
</commit_message>
<xml_diff>
--- a/programming_mental_models/p1_programming_mental_models.docx
+++ b/programming_mental_models/p1_programming_mental_models.docx
@@ -304,6 +304,43 @@
           <w:szCs w:val="36"/>
         </w:rPr>
         <w:t>SaaS, PaaS &amp; IaaS…………………………………………….12</w:t>
+      </w:r>
+    </w:p>
+    <w:p>
+      <w:pPr>
+        <w:pStyle w:val="ListParagraph"/>
+        <w:numPr>
+          <w:ilvl w:val="0"/>
+          <w:numId w:val="5"/>
+        </w:numPr>
+        <w:jc w:val="both"/>
+        <w:rPr>
+          <w:sz w:val="36"/>
+          <w:szCs w:val="36"/>
+        </w:rPr>
+      </w:pPr>
+      <w:r>
+        <w:rPr>
+          <w:sz w:val="36"/>
+          <w:szCs w:val="36"/>
+        </w:rPr>
+        <w:t xml:space="preserve">SSH (Secure </w:t>
+      </w:r>
+      <w:proofErr w:type="gramStart"/>
+      <w:r>
+        <w:rPr>
+          <w:sz w:val="36"/>
+          <w:szCs w:val="36"/>
+        </w:rPr>
+        <w:t>Shell)…</w:t>
+      </w:r>
+      <w:proofErr w:type="gramEnd"/>
+      <w:r>
+        <w:rPr>
+          <w:sz w:val="36"/>
+          <w:szCs w:val="36"/>
+        </w:rPr>
+        <w:t>…………………………………………</w:t>
       </w:r>
     </w:p>
     <w:p>
@@ -6069,6 +6106,2856 @@
     </w:p>
     <w:p>
       <w:pPr>
+        <w:jc w:val="center"/>
+        <w:rPr>
+          <w:sz w:val="36"/>
+          <w:szCs w:val="36"/>
+        </w:rPr>
+      </w:pPr>
+      <w:r>
+        <w:rPr>
+          <w:sz w:val="36"/>
+          <w:szCs w:val="36"/>
+        </w:rPr>
+        <w:t>Break</w:t>
+      </w:r>
+    </w:p>
+    <w:p>
+      <w:pPr>
+        <w:jc w:val="both"/>
+        <w:rPr>
+          <w:sz w:val="36"/>
+          <w:szCs w:val="36"/>
+        </w:rPr>
+      </w:pPr>
+    </w:p>
+    <w:p>
+      <w:pPr>
+        <w:jc w:val="both"/>
+        <w:rPr>
+          <w:b/>
+          <w:bCs/>
+          <w:sz w:val="36"/>
+          <w:szCs w:val="36"/>
+        </w:rPr>
+      </w:pPr>
+      <w:r>
+        <w:rPr>
+          <w:b/>
+          <w:bCs/>
+          <w:sz w:val="36"/>
+          <w:szCs w:val="36"/>
+        </w:rPr>
+        <w:t>SSH (Secure Shell):</w:t>
+      </w:r>
+    </w:p>
+    <w:p>
+      <w:pPr>
+        <w:jc w:val="both"/>
+        <w:rPr>
+          <w:sz w:val="36"/>
+          <w:szCs w:val="36"/>
+        </w:rPr>
+      </w:pPr>
+      <w:r>
+        <w:rPr>
+          <w:sz w:val="36"/>
+          <w:szCs w:val="36"/>
+        </w:rPr>
+        <w:t># SSH is an essential tool for managing remote servers. Use for:</w:t>
+      </w:r>
+    </w:p>
+    <w:p>
+      <w:pPr>
+        <w:pStyle w:val="ListParagraph"/>
+        <w:numPr>
+          <w:ilvl w:val="0"/>
+          <w:numId w:val="18"/>
+        </w:numPr>
+        <w:jc w:val="both"/>
+        <w:rPr>
+          <w:sz w:val="36"/>
+          <w:szCs w:val="36"/>
+        </w:rPr>
+      </w:pPr>
+      <w:r>
+        <w:rPr>
+          <w:sz w:val="36"/>
+          <w:szCs w:val="36"/>
+        </w:rPr>
+        <w:t>Remote command-line access</w:t>
+      </w:r>
+    </w:p>
+    <w:p>
+      <w:pPr>
+        <w:pStyle w:val="ListParagraph"/>
+        <w:numPr>
+          <w:ilvl w:val="0"/>
+          <w:numId w:val="18"/>
+        </w:numPr>
+        <w:jc w:val="both"/>
+        <w:rPr>
+          <w:sz w:val="36"/>
+          <w:szCs w:val="36"/>
+        </w:rPr>
+      </w:pPr>
+      <w:r>
+        <w:rPr>
+          <w:sz w:val="36"/>
+          <w:szCs w:val="36"/>
+        </w:rPr>
+        <w:t>File transfers</w:t>
+      </w:r>
+    </w:p>
+    <w:p>
+      <w:pPr>
+        <w:pStyle w:val="ListParagraph"/>
+        <w:numPr>
+          <w:ilvl w:val="0"/>
+          <w:numId w:val="18"/>
+        </w:numPr>
+        <w:jc w:val="both"/>
+        <w:rPr>
+          <w:sz w:val="36"/>
+          <w:szCs w:val="36"/>
+        </w:rPr>
+      </w:pPr>
+      <w:r>
+        <w:rPr>
+          <w:sz w:val="36"/>
+          <w:szCs w:val="36"/>
+        </w:rPr>
+        <w:t>Tunneling traffic</w:t>
+      </w:r>
+    </w:p>
+    <w:p>
+      <w:pPr>
+        <w:jc w:val="both"/>
+        <w:rPr>
+          <w:sz w:val="36"/>
+          <w:szCs w:val="36"/>
+        </w:rPr>
+      </w:pPr>
+      <w:r>
+        <w:rPr>
+          <w:sz w:val="36"/>
+          <w:szCs w:val="36"/>
+        </w:rPr>
+        <w:t># SSH has two keys:</w:t>
+      </w:r>
+    </w:p>
+    <w:p>
+      <w:pPr>
+        <w:pStyle w:val="ListParagraph"/>
+        <w:numPr>
+          <w:ilvl w:val="0"/>
+          <w:numId w:val="15"/>
+        </w:numPr>
+        <w:jc w:val="both"/>
+        <w:rPr>
+          <w:sz w:val="36"/>
+          <w:szCs w:val="36"/>
+        </w:rPr>
+      </w:pPr>
+      <w:r>
+        <w:rPr>
+          <w:sz w:val="36"/>
+          <w:szCs w:val="36"/>
+        </w:rPr>
+        <w:t>Public Key</w:t>
+      </w:r>
+    </w:p>
+    <w:p>
+      <w:pPr>
+        <w:pStyle w:val="ListParagraph"/>
+        <w:numPr>
+          <w:ilvl w:val="0"/>
+          <w:numId w:val="16"/>
+        </w:numPr>
+        <w:jc w:val="both"/>
+        <w:rPr>
+          <w:sz w:val="36"/>
+          <w:szCs w:val="36"/>
+        </w:rPr>
+      </w:pPr>
+      <w:r>
+        <w:rPr>
+          <w:sz w:val="36"/>
+          <w:szCs w:val="36"/>
+        </w:rPr>
+        <w:t>Can be shared with everyone.</w:t>
+      </w:r>
+    </w:p>
+    <w:p>
+      <w:pPr>
+        <w:pStyle w:val="ListParagraph"/>
+        <w:numPr>
+          <w:ilvl w:val="0"/>
+          <w:numId w:val="16"/>
+        </w:numPr>
+        <w:jc w:val="both"/>
+        <w:rPr>
+          <w:sz w:val="36"/>
+          <w:szCs w:val="36"/>
+        </w:rPr>
+      </w:pPr>
+      <w:r>
+        <w:rPr>
+          <w:sz w:val="36"/>
+          <w:szCs w:val="36"/>
+        </w:rPr>
+        <w:t>Used to encrypt or verify signatures.</w:t>
+      </w:r>
+    </w:p>
+    <w:p>
+      <w:pPr>
+        <w:pStyle w:val="ListParagraph"/>
+        <w:numPr>
+          <w:ilvl w:val="0"/>
+          <w:numId w:val="15"/>
+        </w:numPr>
+        <w:jc w:val="both"/>
+        <w:rPr>
+          <w:sz w:val="36"/>
+          <w:szCs w:val="36"/>
+        </w:rPr>
+      </w:pPr>
+      <w:r>
+        <w:rPr>
+          <w:sz w:val="36"/>
+          <w:szCs w:val="36"/>
+        </w:rPr>
+        <w:t>Private Key</w:t>
+      </w:r>
+    </w:p>
+    <w:p>
+      <w:pPr>
+        <w:pStyle w:val="ListParagraph"/>
+        <w:numPr>
+          <w:ilvl w:val="0"/>
+          <w:numId w:val="17"/>
+        </w:numPr>
+        <w:jc w:val="both"/>
+        <w:rPr>
+          <w:sz w:val="36"/>
+          <w:szCs w:val="36"/>
+        </w:rPr>
+      </w:pPr>
+      <w:r>
+        <w:rPr>
+          <w:sz w:val="36"/>
+          <w:szCs w:val="36"/>
+        </w:rPr>
+        <w:t>Secret.</w:t>
+      </w:r>
+    </w:p>
+    <w:p>
+      <w:pPr>
+        <w:pStyle w:val="ListParagraph"/>
+        <w:numPr>
+          <w:ilvl w:val="0"/>
+          <w:numId w:val="17"/>
+        </w:numPr>
+        <w:jc w:val="both"/>
+        <w:rPr>
+          <w:sz w:val="36"/>
+          <w:szCs w:val="36"/>
+        </w:rPr>
+      </w:pPr>
+      <w:r>
+        <w:rPr>
+          <w:sz w:val="36"/>
+          <w:szCs w:val="36"/>
+        </w:rPr>
+        <w:t>Never leaves our machine.</w:t>
+      </w:r>
+    </w:p>
+    <w:p>
+      <w:pPr>
+        <w:pStyle w:val="ListParagraph"/>
+        <w:numPr>
+          <w:ilvl w:val="0"/>
+          <w:numId w:val="17"/>
+        </w:numPr>
+        <w:jc w:val="both"/>
+        <w:rPr>
+          <w:sz w:val="36"/>
+          <w:szCs w:val="36"/>
+        </w:rPr>
+      </w:pPr>
+      <w:r>
+        <w:rPr>
+          <w:sz w:val="36"/>
+          <w:szCs w:val="36"/>
+        </w:rPr>
+        <w:t>Used to decrypt or create signatures.</w:t>
+      </w:r>
+    </w:p>
+    <w:p>
+      <w:pPr>
+        <w:jc w:val="both"/>
+        <w:rPr>
+          <w:sz w:val="36"/>
+          <w:szCs w:val="36"/>
+        </w:rPr>
+      </w:pPr>
+    </w:p>
+    <w:p>
+      <w:pPr>
+        <w:jc w:val="both"/>
+        <w:rPr>
+          <w:sz w:val="36"/>
+          <w:szCs w:val="36"/>
+        </w:rPr>
+      </w:pPr>
+      <w:r>
+        <w:rPr>
+          <w:sz w:val="36"/>
+          <w:szCs w:val="36"/>
+        </w:rPr>
+        <w:t>The SSH Connection Flow:</w:t>
+      </w:r>
+    </w:p>
+    <w:p>
+      <w:pPr>
+        <w:jc w:val="both"/>
+        <w:rPr>
+          <w:sz w:val="36"/>
+          <w:szCs w:val="36"/>
+        </w:rPr>
+      </w:pPr>
+      <w:r>
+        <w:rPr>
+          <w:sz w:val="36"/>
+          <w:szCs w:val="36"/>
+        </w:rPr>
+        <w:t># When we initiate a SSH connection or run this command:</w:t>
+      </w:r>
+    </w:p>
+    <w:p>
+      <w:pPr>
+        <w:jc w:val="both"/>
+        <w:rPr>
+          <w:b/>
+          <w:bCs/>
+          <w:color w:val="60CAF3" w:themeColor="accent4" w:themeTint="99"/>
+          <w:sz w:val="36"/>
+          <w:szCs w:val="36"/>
+        </w:rPr>
+      </w:pPr>
+      <w:r>
+        <w:rPr>
+          <w:b/>
+          <w:bCs/>
+          <w:color w:val="60CAF3" w:themeColor="accent4" w:themeTint="99"/>
+          <w:sz w:val="36"/>
+          <w:szCs w:val="36"/>
+        </w:rPr>
+        <w:t>ssh user@server.com</w:t>
+      </w:r>
+    </w:p>
+    <w:p>
+      <w:pPr>
+        <w:jc w:val="both"/>
+        <w:rPr>
+          <w:sz w:val="36"/>
+          <w:szCs w:val="36"/>
+        </w:rPr>
+      </w:pPr>
+      <w:r>
+        <w:rPr>
+          <w:sz w:val="36"/>
+          <w:szCs w:val="36"/>
+        </w:rPr>
+        <w:t># Then:</w:t>
+      </w:r>
+    </w:p>
+    <w:p>
+      <w:pPr>
+        <w:jc w:val="both"/>
+        <w:rPr>
+          <w:sz w:val="36"/>
+          <w:szCs w:val="36"/>
+        </w:rPr>
+      </w:pPr>
+    </w:p>
+    <w:p>
+      <w:pPr>
+        <w:jc w:val="both"/>
+        <w:rPr>
+          <w:b/>
+          <w:bCs/>
+          <w:sz w:val="32"/>
+          <w:szCs w:val="32"/>
+        </w:rPr>
+      </w:pPr>
+      <w:r>
+        <w:rPr>
+          <w:b/>
+          <w:bCs/>
+          <w:sz w:val="32"/>
+          <w:szCs w:val="32"/>
+        </w:rPr>
+        <w:lastRenderedPageBreak/>
+        <w:t>Client (Your Laptop)</w:t>
+      </w:r>
+    </w:p>
+    <w:p>
+      <w:pPr>
+        <w:jc w:val="both"/>
+        <w:rPr>
+          <w:b/>
+          <w:bCs/>
+          <w:sz w:val="32"/>
+          <w:szCs w:val="32"/>
+        </w:rPr>
+      </w:pPr>
+      <w:r>
+        <w:rPr>
+          <w:b/>
+          <w:bCs/>
+          <w:sz w:val="32"/>
+          <w:szCs w:val="32"/>
+        </w:rPr>
+        <w:t xml:space="preserve">        |</w:t>
+      </w:r>
+    </w:p>
+    <w:p>
+      <w:pPr>
+        <w:jc w:val="both"/>
+        <w:rPr>
+          <w:b/>
+          <w:bCs/>
+          <w:sz w:val="32"/>
+          <w:szCs w:val="32"/>
+        </w:rPr>
+      </w:pPr>
+      <w:r>
+        <w:rPr>
+          <w:b/>
+          <w:bCs/>
+          <w:sz w:val="32"/>
+          <w:szCs w:val="32"/>
+        </w:rPr>
+        <w:t xml:space="preserve">        |</w:t>
+      </w:r>
+    </w:p>
+    <w:p>
+      <w:pPr>
+        <w:jc w:val="both"/>
+        <w:rPr>
+          <w:b/>
+          <w:bCs/>
+          <w:sz w:val="32"/>
+          <w:szCs w:val="32"/>
+        </w:rPr>
+      </w:pPr>
+      <w:r>
+        <w:rPr>
+          <w:b/>
+          <w:bCs/>
+          <w:sz w:val="32"/>
+          <w:szCs w:val="32"/>
+        </w:rPr>
+        <w:t xml:space="preserve">     Internet</w:t>
+      </w:r>
+    </w:p>
+    <w:p>
+      <w:pPr>
+        <w:jc w:val="both"/>
+        <w:rPr>
+          <w:b/>
+          <w:bCs/>
+          <w:sz w:val="32"/>
+          <w:szCs w:val="32"/>
+        </w:rPr>
+      </w:pPr>
+      <w:r>
+        <w:rPr>
+          <w:b/>
+          <w:bCs/>
+          <w:sz w:val="32"/>
+          <w:szCs w:val="32"/>
+        </w:rPr>
+        <w:t xml:space="preserve">        |</w:t>
+      </w:r>
+    </w:p>
+    <w:p>
+      <w:pPr>
+        <w:jc w:val="both"/>
+        <w:rPr>
+          <w:b/>
+          <w:bCs/>
+          <w:sz w:val="32"/>
+          <w:szCs w:val="32"/>
+        </w:rPr>
+      </w:pPr>
+      <w:r>
+        <w:rPr>
+          <w:b/>
+          <w:bCs/>
+          <w:sz w:val="32"/>
+          <w:szCs w:val="32"/>
+        </w:rPr>
+        <w:t xml:space="preserve">        |</w:t>
+      </w:r>
+    </w:p>
+    <w:p>
+      <w:pPr>
+        <w:jc w:val="both"/>
+        <w:rPr>
+          <w:b/>
+          <w:bCs/>
+          <w:sz w:val="32"/>
+          <w:szCs w:val="32"/>
+        </w:rPr>
+      </w:pPr>
+      <w:r>
+        <w:rPr>
+          <w:b/>
+          <w:bCs/>
+          <w:sz w:val="32"/>
+          <w:szCs w:val="32"/>
+        </w:rPr>
+        <w:t>Server (VPS)</w:t>
+      </w:r>
+    </w:p>
+    <w:p>
+      <w:pPr>
+        <w:jc w:val="both"/>
+        <w:rPr>
+          <w:sz w:val="36"/>
+          <w:szCs w:val="36"/>
+        </w:rPr>
+      </w:pPr>
+    </w:p>
+    <w:p>
+      <w:pPr>
+        <w:jc w:val="both"/>
+        <w:rPr>
+          <w:sz w:val="36"/>
+          <w:szCs w:val="36"/>
+        </w:rPr>
+      </w:pPr>
+      <w:r>
+        <w:rPr>
+          <w:sz w:val="36"/>
+          <w:szCs w:val="36"/>
+        </w:rPr>
+        <w:t>Step-1, Server Provides Its Identity:</w:t>
+      </w:r>
+    </w:p>
+    <w:p>
+      <w:pPr>
+        <w:jc w:val="both"/>
+        <w:rPr>
+          <w:sz w:val="36"/>
+          <w:szCs w:val="36"/>
+        </w:rPr>
+      </w:pPr>
+      <w:r>
+        <w:rPr>
+          <w:sz w:val="36"/>
+          <w:szCs w:val="36"/>
+        </w:rPr>
+        <w:t xml:space="preserve"># </w:t>
+      </w:r>
+      <w:r>
+        <w:rPr>
+          <w:sz w:val="36"/>
+          <w:szCs w:val="36"/>
+        </w:rPr>
+        <w:t>Server sends its public host key.</w:t>
+      </w:r>
+    </w:p>
+    <w:p>
+      <w:pPr>
+        <w:jc w:val="both"/>
+        <w:rPr>
+          <w:b/>
+          <w:bCs/>
+          <w:sz w:val="32"/>
+          <w:szCs w:val="32"/>
+        </w:rPr>
+      </w:pPr>
+      <w:r>
+        <w:rPr>
+          <w:b/>
+          <w:bCs/>
+          <w:sz w:val="32"/>
+          <w:szCs w:val="32"/>
+        </w:rPr>
+        <w:t>Server</w:t>
+      </w:r>
+    </w:p>
+    <w:p>
+      <w:pPr>
+        <w:jc w:val="both"/>
+        <w:rPr>
+          <w:b/>
+          <w:bCs/>
+          <w:sz w:val="32"/>
+          <w:szCs w:val="32"/>
+        </w:rPr>
+      </w:pPr>
+      <w:r>
+        <w:rPr>
+          <w:b/>
+          <w:bCs/>
+          <w:sz w:val="32"/>
+          <w:szCs w:val="32"/>
+        </w:rPr>
+        <w:t xml:space="preserve">  |</w:t>
+      </w:r>
+    </w:p>
+    <w:p>
+      <w:pPr>
+        <w:jc w:val="both"/>
+        <w:rPr>
+          <w:b/>
+          <w:bCs/>
+          <w:sz w:val="32"/>
+          <w:szCs w:val="32"/>
+        </w:rPr>
+      </w:pPr>
+      <w:r>
+        <w:rPr>
+          <w:b/>
+          <w:bCs/>
+          <w:sz w:val="32"/>
+          <w:szCs w:val="32"/>
+        </w:rPr>
+        <w:t xml:space="preserve">  |-----&gt; Public Host Key</w:t>
+      </w:r>
+    </w:p>
+    <w:p>
+      <w:pPr>
+        <w:jc w:val="both"/>
+        <w:rPr>
+          <w:b/>
+          <w:bCs/>
+          <w:sz w:val="32"/>
+          <w:szCs w:val="32"/>
+        </w:rPr>
+      </w:pPr>
+      <w:r>
+        <w:rPr>
+          <w:b/>
+          <w:bCs/>
+          <w:sz w:val="32"/>
+          <w:szCs w:val="32"/>
+        </w:rPr>
+        <w:t xml:space="preserve">  |</w:t>
+      </w:r>
+    </w:p>
+    <w:p>
+      <w:pPr>
+        <w:jc w:val="both"/>
+        <w:rPr>
+          <w:b/>
+          <w:bCs/>
+          <w:sz w:val="32"/>
+          <w:szCs w:val="32"/>
+        </w:rPr>
+      </w:pPr>
+      <w:r>
+        <w:rPr>
+          <w:b/>
+          <w:bCs/>
+          <w:sz w:val="32"/>
+          <w:szCs w:val="32"/>
+        </w:rPr>
+        <w:t>Client</w:t>
+      </w:r>
+    </w:p>
+    <w:p>
+      <w:pPr>
+        <w:jc w:val="both"/>
+        <w:rPr>
+          <w:sz w:val="36"/>
+          <w:szCs w:val="36"/>
+        </w:rPr>
+      </w:pPr>
+      <w:r>
+        <w:rPr>
+          <w:sz w:val="36"/>
+          <w:szCs w:val="36"/>
+        </w:rPr>
+        <w:t xml:space="preserve"># </w:t>
+      </w:r>
+      <w:r>
+        <w:rPr>
+          <w:sz w:val="36"/>
+          <w:szCs w:val="36"/>
+        </w:rPr>
+        <w:t xml:space="preserve">The first time </w:t>
+      </w:r>
+      <w:r>
+        <w:rPr>
+          <w:sz w:val="36"/>
+          <w:szCs w:val="36"/>
+        </w:rPr>
+        <w:t>we</w:t>
+      </w:r>
+      <w:r>
+        <w:rPr>
+          <w:sz w:val="36"/>
+          <w:szCs w:val="36"/>
+        </w:rPr>
+        <w:t xml:space="preserve"> connect, SSH says</w:t>
+      </w:r>
+      <w:r>
+        <w:rPr>
+          <w:sz w:val="36"/>
+          <w:szCs w:val="36"/>
+        </w:rPr>
+        <w:t xml:space="preserve"> “</w:t>
+      </w:r>
+      <w:r>
+        <w:rPr>
+          <w:sz w:val="36"/>
+          <w:szCs w:val="36"/>
+        </w:rPr>
+        <w:t>The authenticity of host can't be established.</w:t>
+      </w:r>
+      <w:r>
+        <w:rPr>
+          <w:sz w:val="36"/>
+          <w:szCs w:val="36"/>
+        </w:rPr>
+        <w:t xml:space="preserve"> </w:t>
+      </w:r>
+      <w:r>
+        <w:rPr>
+          <w:sz w:val="36"/>
+          <w:szCs w:val="36"/>
+        </w:rPr>
+        <w:t>Are you sure you want to continue?</w:t>
+      </w:r>
+      <w:r>
+        <w:rPr>
+          <w:sz w:val="36"/>
+          <w:szCs w:val="36"/>
+        </w:rPr>
+        <w:t>”</w:t>
+      </w:r>
+    </w:p>
+    <w:p>
+      <w:pPr>
+        <w:jc w:val="both"/>
+        <w:rPr>
+          <w:sz w:val="36"/>
+          <w:szCs w:val="36"/>
+        </w:rPr>
+      </w:pPr>
+      <w:r>
+        <w:rPr>
+          <w:sz w:val="36"/>
+          <w:szCs w:val="36"/>
+        </w:rPr>
+        <w:t xml:space="preserve"># </w:t>
+      </w:r>
+      <w:r>
+        <w:rPr>
+          <w:sz w:val="36"/>
+          <w:szCs w:val="36"/>
+        </w:rPr>
+        <w:t>Because our laptop has never seen this server before.</w:t>
+      </w:r>
+      <w:r>
+        <w:rPr>
+          <w:sz w:val="36"/>
+          <w:szCs w:val="36"/>
+        </w:rPr>
+        <w:t xml:space="preserve"> </w:t>
+      </w:r>
+      <w:r>
+        <w:rPr>
+          <w:sz w:val="36"/>
+          <w:szCs w:val="36"/>
+        </w:rPr>
+        <w:t xml:space="preserve">After </w:t>
+      </w:r>
+      <w:r>
+        <w:rPr>
+          <w:sz w:val="36"/>
+          <w:szCs w:val="36"/>
+        </w:rPr>
+        <w:t>we</w:t>
+      </w:r>
+      <w:r>
+        <w:rPr>
+          <w:sz w:val="36"/>
+          <w:szCs w:val="36"/>
+        </w:rPr>
+        <w:t xml:space="preserve"> accept</w:t>
+      </w:r>
+      <w:r>
+        <w:rPr>
+          <w:sz w:val="36"/>
+          <w:szCs w:val="36"/>
+        </w:rPr>
+        <w:t xml:space="preserve"> using</w:t>
+      </w:r>
+      <w:r>
+        <w:rPr>
+          <w:sz w:val="36"/>
+          <w:szCs w:val="36"/>
+        </w:rPr>
+        <w:t>:</w:t>
+      </w:r>
+    </w:p>
+    <w:p>
+      <w:pPr>
+        <w:jc w:val="both"/>
+        <w:rPr>
+          <w:b/>
+          <w:bCs/>
+          <w:color w:val="60CAF3" w:themeColor="accent4" w:themeTint="99"/>
+          <w:sz w:val="36"/>
+          <w:szCs w:val="36"/>
+        </w:rPr>
+      </w:pPr>
+      <w:r>
+        <w:rPr>
+          <w:b/>
+          <w:bCs/>
+          <w:color w:val="60CAF3" w:themeColor="accent4" w:themeTint="99"/>
+          <w:sz w:val="36"/>
+          <w:szCs w:val="36"/>
+        </w:rPr>
+        <w:t>~/.ssh/</w:t>
+      </w:r>
+      <w:proofErr w:type="spellStart"/>
+      <w:r>
+        <w:rPr>
+          <w:b/>
+          <w:bCs/>
+          <w:color w:val="60CAF3" w:themeColor="accent4" w:themeTint="99"/>
+          <w:sz w:val="36"/>
+          <w:szCs w:val="36"/>
+        </w:rPr>
+        <w:t>known_hosts</w:t>
+      </w:r>
+      <w:proofErr w:type="spellEnd"/>
+    </w:p>
+    <w:p>
+      <w:pPr>
+        <w:jc w:val="both"/>
+        <w:rPr>
+          <w:sz w:val="36"/>
+          <w:szCs w:val="36"/>
+        </w:rPr>
+      </w:pPr>
+      <w:r>
+        <w:rPr>
+          <w:sz w:val="36"/>
+          <w:szCs w:val="36"/>
+        </w:rPr>
+        <w:t># S</w:t>
+      </w:r>
+      <w:r>
+        <w:rPr>
+          <w:sz w:val="36"/>
+          <w:szCs w:val="36"/>
+        </w:rPr>
+        <w:t>tores the server's public key fingerprint.</w:t>
+      </w:r>
+      <w:r>
+        <w:rPr>
+          <w:sz w:val="36"/>
+          <w:szCs w:val="36"/>
+        </w:rPr>
+        <w:t xml:space="preserve"> </w:t>
+      </w:r>
+      <w:r>
+        <w:rPr>
+          <w:sz w:val="36"/>
+          <w:szCs w:val="36"/>
+        </w:rPr>
+        <w:t>Next time:</w:t>
+      </w:r>
+    </w:p>
+    <w:p>
+      <w:pPr>
+        <w:pStyle w:val="ListParagraph"/>
+        <w:numPr>
+          <w:ilvl w:val="0"/>
+          <w:numId w:val="19"/>
+        </w:numPr>
+        <w:jc w:val="both"/>
+        <w:rPr>
+          <w:sz w:val="36"/>
+          <w:szCs w:val="36"/>
+        </w:rPr>
+      </w:pPr>
+      <w:r>
+        <w:rPr>
+          <w:sz w:val="36"/>
+          <w:szCs w:val="36"/>
+        </w:rPr>
+        <w:lastRenderedPageBreak/>
+        <w:t>Server sends key</w:t>
+      </w:r>
+    </w:p>
+    <w:p>
+      <w:pPr>
+        <w:pStyle w:val="ListParagraph"/>
+        <w:numPr>
+          <w:ilvl w:val="0"/>
+          <w:numId w:val="19"/>
+        </w:numPr>
+        <w:jc w:val="both"/>
+        <w:rPr>
+          <w:sz w:val="36"/>
+          <w:szCs w:val="36"/>
+        </w:rPr>
+      </w:pPr>
+      <w:r>
+        <w:rPr>
+          <w:sz w:val="36"/>
+          <w:szCs w:val="36"/>
+        </w:rPr>
+        <w:t>Client compares with stored key</w:t>
+      </w:r>
+    </w:p>
+    <w:p>
+      <w:pPr>
+        <w:jc w:val="both"/>
+        <w:rPr>
+          <w:sz w:val="36"/>
+          <w:szCs w:val="36"/>
+        </w:rPr>
+      </w:pPr>
+      <w:r>
+        <w:rPr>
+          <w:sz w:val="36"/>
+          <w:szCs w:val="36"/>
+        </w:rPr>
+        <w:t xml:space="preserve"># </w:t>
+      </w:r>
+      <w:r>
+        <w:rPr>
+          <w:sz w:val="36"/>
+          <w:szCs w:val="36"/>
+        </w:rPr>
+        <w:t>If different</w:t>
+      </w:r>
+      <w:r>
+        <w:rPr>
+          <w:sz w:val="36"/>
+          <w:szCs w:val="36"/>
+        </w:rPr>
+        <w:t xml:space="preserve"> “</w:t>
+      </w:r>
+      <w:r>
+        <w:rPr>
+          <w:sz w:val="36"/>
+          <w:szCs w:val="36"/>
+        </w:rPr>
+        <w:t>WARNING: REMOTE HOST IDENTIFICATION HAS CHANGED!</w:t>
+      </w:r>
+      <w:r>
+        <w:rPr>
+          <w:sz w:val="36"/>
+          <w:szCs w:val="36"/>
+        </w:rPr>
+        <w:t xml:space="preserve">”. </w:t>
+      </w:r>
+      <w:r>
+        <w:rPr>
+          <w:sz w:val="36"/>
+          <w:szCs w:val="36"/>
+        </w:rPr>
+        <w:t>This protects against a fake server pretending to be ours.</w:t>
+      </w:r>
+    </w:p>
+    <w:p>
+      <w:pPr>
+        <w:jc w:val="both"/>
+        <w:rPr>
+          <w:sz w:val="36"/>
+          <w:szCs w:val="36"/>
+        </w:rPr>
+      </w:pPr>
+    </w:p>
+    <w:p>
+      <w:pPr>
+        <w:jc w:val="both"/>
+        <w:rPr>
+          <w:sz w:val="36"/>
+          <w:szCs w:val="36"/>
+        </w:rPr>
+      </w:pPr>
+      <w:r>
+        <w:rPr>
+          <w:sz w:val="36"/>
+          <w:szCs w:val="36"/>
+        </w:rPr>
+        <w:t xml:space="preserve">Step-2, </w:t>
+      </w:r>
+      <w:r>
+        <w:rPr>
+          <w:sz w:val="36"/>
+          <w:szCs w:val="36"/>
+        </w:rPr>
+        <w:t>Secure Key Exchange</w:t>
+      </w:r>
+      <w:r>
+        <w:rPr>
+          <w:sz w:val="36"/>
+          <w:szCs w:val="36"/>
+        </w:rPr>
+        <w:t>:</w:t>
+      </w:r>
+    </w:p>
+    <w:p>
+      <w:pPr>
+        <w:jc w:val="both"/>
+        <w:rPr>
+          <w:sz w:val="36"/>
+          <w:szCs w:val="36"/>
+        </w:rPr>
+      </w:pPr>
+      <w:r>
+        <w:rPr>
+          <w:sz w:val="36"/>
+          <w:szCs w:val="36"/>
+        </w:rPr>
+        <w:t xml:space="preserve"># </w:t>
+      </w:r>
+      <w:r>
+        <w:rPr>
+          <w:sz w:val="36"/>
+          <w:szCs w:val="36"/>
+        </w:rPr>
+        <w:t>SSH does not encrypt all traffic using public/private keys.</w:t>
+      </w:r>
+      <w:r>
+        <w:rPr>
+          <w:sz w:val="36"/>
+          <w:szCs w:val="36"/>
+        </w:rPr>
+        <w:t xml:space="preserve"> </w:t>
+      </w:r>
+      <w:r>
+        <w:rPr>
+          <w:sz w:val="36"/>
+          <w:szCs w:val="36"/>
+        </w:rPr>
+        <w:t>That would be too slow.</w:t>
+      </w:r>
+    </w:p>
+    <w:p>
+      <w:pPr>
+        <w:jc w:val="both"/>
+        <w:rPr>
+          <w:sz w:val="36"/>
+          <w:szCs w:val="36"/>
+        </w:rPr>
+      </w:pPr>
+      <w:r>
+        <w:rPr>
+          <w:sz w:val="36"/>
+          <w:szCs w:val="36"/>
+        </w:rPr>
+        <w:t xml:space="preserve"># </w:t>
+      </w:r>
+      <w:r>
+        <w:rPr>
+          <w:sz w:val="36"/>
+          <w:szCs w:val="36"/>
+        </w:rPr>
+        <w:t>Instead SSH creates a temporary secret key called a</w:t>
+      </w:r>
+      <w:r>
+        <w:rPr>
+          <w:sz w:val="36"/>
+          <w:szCs w:val="36"/>
+        </w:rPr>
+        <w:t xml:space="preserve"> </w:t>
+      </w:r>
+      <w:r>
+        <w:rPr>
+          <w:b/>
+          <w:bCs/>
+          <w:sz w:val="36"/>
+          <w:szCs w:val="36"/>
+        </w:rPr>
+        <w:t>Session Key</w:t>
+      </w:r>
+      <w:r>
+        <w:rPr>
+          <w:sz w:val="36"/>
+          <w:szCs w:val="36"/>
+        </w:rPr>
+        <w:t xml:space="preserve"> </w:t>
+      </w:r>
+      <w:r>
+        <w:rPr>
+          <w:sz w:val="36"/>
+          <w:szCs w:val="36"/>
+        </w:rPr>
+        <w:t>using algorithms like:</w:t>
+      </w:r>
+    </w:p>
+    <w:p>
+      <w:pPr>
+        <w:pStyle w:val="ListParagraph"/>
+        <w:numPr>
+          <w:ilvl w:val="0"/>
+          <w:numId w:val="22"/>
+        </w:numPr>
+        <w:jc w:val="both"/>
+        <w:rPr>
+          <w:sz w:val="36"/>
+          <w:szCs w:val="36"/>
+        </w:rPr>
+      </w:pPr>
+      <w:r>
+        <w:rPr>
+          <w:sz w:val="36"/>
+          <w:szCs w:val="36"/>
+        </w:rPr>
+        <w:t>Diffie-Hellman</w:t>
+      </w:r>
+    </w:p>
+    <w:p>
+      <w:pPr>
+        <w:pStyle w:val="ListParagraph"/>
+        <w:numPr>
+          <w:ilvl w:val="0"/>
+          <w:numId w:val="22"/>
+        </w:numPr>
+        <w:jc w:val="both"/>
+        <w:rPr>
+          <w:sz w:val="36"/>
+          <w:szCs w:val="36"/>
+        </w:rPr>
+      </w:pPr>
+      <w:r>
+        <w:rPr>
+          <w:sz w:val="36"/>
+          <w:szCs w:val="36"/>
+        </w:rPr>
+        <w:t>ECDH</w:t>
+      </w:r>
+    </w:p>
+    <w:p>
+      <w:pPr>
+        <w:pStyle w:val="ListParagraph"/>
+        <w:numPr>
+          <w:ilvl w:val="0"/>
+          <w:numId w:val="22"/>
+        </w:numPr>
+        <w:jc w:val="both"/>
+        <w:rPr>
+          <w:sz w:val="36"/>
+          <w:szCs w:val="36"/>
+        </w:rPr>
+      </w:pPr>
+      <w:r>
+        <w:rPr>
+          <w:sz w:val="36"/>
+          <w:szCs w:val="36"/>
+        </w:rPr>
+        <w:t>Curve25519</w:t>
+      </w:r>
+    </w:p>
+    <w:p>
+      <w:pPr>
+        <w:jc w:val="both"/>
+        <w:rPr>
+          <w:sz w:val="36"/>
+          <w:szCs w:val="36"/>
+        </w:rPr>
+      </w:pPr>
+      <w:r>
+        <w:rPr>
+          <w:sz w:val="36"/>
+          <w:szCs w:val="36"/>
+        </w:rPr>
+        <w:t xml:space="preserve"># </w:t>
+      </w:r>
+      <w:r>
+        <w:rPr>
+          <w:sz w:val="36"/>
+          <w:szCs w:val="36"/>
+        </w:rPr>
+        <w:t>The client and server mathematically agree on the same secret key without ever sending that secret across the network.</w:t>
+      </w:r>
+    </w:p>
+    <w:p>
+      <w:pPr>
+        <w:jc w:val="both"/>
+        <w:rPr>
+          <w:b/>
+          <w:bCs/>
+          <w:sz w:val="32"/>
+          <w:szCs w:val="32"/>
+        </w:rPr>
+      </w:pPr>
+      <w:r>
+        <w:rPr>
+          <w:b/>
+          <w:bCs/>
+          <w:sz w:val="32"/>
+          <w:szCs w:val="32"/>
+        </w:rPr>
+        <w:t>Client ------------ Server</w:t>
+      </w:r>
+    </w:p>
+    <w:p>
+      <w:pPr>
+        <w:jc w:val="both"/>
+        <w:rPr>
+          <w:b/>
+          <w:bCs/>
+          <w:sz w:val="32"/>
+          <w:szCs w:val="32"/>
+        </w:rPr>
+      </w:pPr>
+      <w:r>
+        <w:rPr>
+          <w:b/>
+          <w:bCs/>
+          <w:sz w:val="32"/>
+          <w:szCs w:val="32"/>
+        </w:rPr>
+        <w:t xml:space="preserve">   </w:t>
+      </w:r>
+      <w:r>
+        <w:rPr>
+          <w:b/>
+          <w:bCs/>
+          <w:sz w:val="32"/>
+          <w:szCs w:val="32"/>
+        </w:rPr>
+        <w:t xml:space="preserve">        </w:t>
+      </w:r>
+      <w:r>
+        <w:rPr>
+          <w:b/>
+          <w:bCs/>
+          <w:sz w:val="32"/>
+          <w:szCs w:val="32"/>
+        </w:rPr>
+        <w:t xml:space="preserve"> </w:t>
+      </w:r>
+      <w:r>
+        <w:rPr>
+          <w:b/>
+          <w:bCs/>
+          <w:sz w:val="32"/>
+          <w:szCs w:val="32"/>
+        </w:rPr>
+        <w:t xml:space="preserve"> </w:t>
+      </w:r>
+      <w:r>
+        <w:rPr>
+          <w:b/>
+          <w:bCs/>
+          <w:sz w:val="32"/>
+          <w:szCs w:val="32"/>
+        </w:rPr>
+        <w:t>\                 /</w:t>
+      </w:r>
+    </w:p>
+    <w:p>
+      <w:pPr>
+        <w:jc w:val="both"/>
+        <w:rPr>
+          <w:b/>
+          <w:bCs/>
+          <w:sz w:val="32"/>
+          <w:szCs w:val="32"/>
+        </w:rPr>
+      </w:pPr>
+      <w:r>
+        <w:rPr>
+          <w:b/>
+          <w:bCs/>
+          <w:sz w:val="32"/>
+          <w:szCs w:val="32"/>
+        </w:rPr>
+        <w:t xml:space="preserve">    </w:t>
+      </w:r>
+      <w:r>
+        <w:rPr>
+          <w:b/>
+          <w:bCs/>
+          <w:sz w:val="32"/>
+          <w:szCs w:val="32"/>
+        </w:rPr>
+        <w:t xml:space="preserve">          </w:t>
+      </w:r>
+      <w:r>
+        <w:rPr>
+          <w:b/>
+          <w:bCs/>
+          <w:sz w:val="32"/>
+          <w:szCs w:val="32"/>
+        </w:rPr>
+        <w:t xml:space="preserve"> </w:t>
+      </w:r>
+      <w:r>
+        <w:rPr>
+          <w:b/>
+          <w:bCs/>
+          <w:sz w:val="32"/>
+          <w:szCs w:val="32"/>
+        </w:rPr>
+        <w:t xml:space="preserve"> </w:t>
+      </w:r>
+      <w:r>
+        <w:rPr>
+          <w:b/>
+          <w:bCs/>
+          <w:sz w:val="32"/>
+          <w:szCs w:val="32"/>
+        </w:rPr>
+        <w:t xml:space="preserve">\        </w:t>
+      </w:r>
+      <w:r>
+        <w:rPr>
+          <w:b/>
+          <w:bCs/>
+          <w:sz w:val="32"/>
+          <w:szCs w:val="32"/>
+        </w:rPr>
+        <w:t xml:space="preserve"> </w:t>
+      </w:r>
+      <w:r>
+        <w:rPr>
+          <w:b/>
+          <w:bCs/>
+          <w:sz w:val="32"/>
+          <w:szCs w:val="32"/>
+        </w:rPr>
+        <w:t xml:space="preserve">  /</w:t>
+      </w:r>
+    </w:p>
+    <w:p>
+      <w:pPr>
+        <w:jc w:val="both"/>
+        <w:rPr>
+          <w:b/>
+          <w:bCs/>
+          <w:sz w:val="32"/>
+          <w:szCs w:val="32"/>
+        </w:rPr>
+      </w:pPr>
+      <w:r>
+        <w:rPr>
+          <w:b/>
+          <w:bCs/>
+          <w:sz w:val="32"/>
+          <w:szCs w:val="32"/>
+        </w:rPr>
+        <w:t xml:space="preserve">   </w:t>
+      </w:r>
+      <w:r>
+        <w:rPr>
+          <w:b/>
+          <w:bCs/>
+          <w:sz w:val="32"/>
+          <w:szCs w:val="32"/>
+        </w:rPr>
+        <w:t xml:space="preserve">   </w:t>
+      </w:r>
+      <w:r>
+        <w:rPr>
+          <w:b/>
+          <w:bCs/>
+          <w:sz w:val="32"/>
+          <w:szCs w:val="32"/>
+        </w:rPr>
+        <w:t xml:space="preserve">  Shared Secret</w:t>
+      </w:r>
+    </w:p>
+    <w:p>
+      <w:pPr>
+        <w:jc w:val="both"/>
+        <w:rPr>
+          <w:sz w:val="36"/>
+          <w:szCs w:val="36"/>
+        </w:rPr>
+      </w:pPr>
+      <w:r>
+        <w:rPr>
+          <w:sz w:val="36"/>
+          <w:szCs w:val="36"/>
+        </w:rPr>
+        <w:t xml:space="preserve"># </w:t>
+      </w:r>
+      <w:r>
+        <w:rPr>
+          <w:sz w:val="36"/>
+          <w:szCs w:val="36"/>
+        </w:rPr>
+        <w:t>An attacker can see all exchanged messages but cannot calculate the secret.</w:t>
+      </w:r>
+    </w:p>
+    <w:p>
+      <w:pPr>
+        <w:jc w:val="both"/>
+        <w:rPr>
+          <w:sz w:val="36"/>
+          <w:szCs w:val="36"/>
+        </w:rPr>
+      </w:pPr>
+    </w:p>
+    <w:p>
+      <w:pPr>
+        <w:jc w:val="both"/>
+        <w:rPr>
+          <w:sz w:val="36"/>
+          <w:szCs w:val="36"/>
+        </w:rPr>
+      </w:pPr>
+      <w:r>
+        <w:rPr>
+          <w:sz w:val="36"/>
+          <w:szCs w:val="36"/>
+        </w:rPr>
+        <w:t>Step-</w:t>
+      </w:r>
+      <w:r>
+        <w:rPr>
+          <w:sz w:val="36"/>
+          <w:szCs w:val="36"/>
+        </w:rPr>
+        <w:t>3</w:t>
+      </w:r>
+      <w:r>
+        <w:rPr>
+          <w:sz w:val="36"/>
+          <w:szCs w:val="36"/>
+        </w:rPr>
+        <w:t xml:space="preserve">, </w:t>
+      </w:r>
+      <w:r>
+        <w:rPr>
+          <w:sz w:val="36"/>
+          <w:szCs w:val="36"/>
+        </w:rPr>
+        <w:t>Server Authenticates You</w:t>
+      </w:r>
+      <w:r>
+        <w:rPr>
+          <w:sz w:val="36"/>
+          <w:szCs w:val="36"/>
+        </w:rPr>
+        <w:t>:</w:t>
+      </w:r>
+    </w:p>
+    <w:p>
+      <w:pPr>
+        <w:jc w:val="both"/>
+        <w:rPr>
+          <w:sz w:val="36"/>
+          <w:szCs w:val="36"/>
+        </w:rPr>
+      </w:pPr>
+      <w:r>
+        <w:rPr>
+          <w:sz w:val="36"/>
+          <w:szCs w:val="36"/>
+        </w:rPr>
+        <w:t xml:space="preserve"># </w:t>
+      </w:r>
+      <w:r>
+        <w:rPr>
+          <w:sz w:val="36"/>
+          <w:szCs w:val="36"/>
+        </w:rPr>
+        <w:t>Now the server must know</w:t>
+      </w:r>
+      <w:r>
+        <w:rPr>
+          <w:sz w:val="36"/>
+          <w:szCs w:val="36"/>
+        </w:rPr>
+        <w:t xml:space="preserve"> </w:t>
+      </w:r>
+      <w:r>
+        <w:rPr>
+          <w:sz w:val="36"/>
+          <w:szCs w:val="36"/>
+        </w:rPr>
+        <w:t>"Are you really Nazmul?"</w:t>
+      </w:r>
+      <w:r>
+        <w:rPr>
+          <w:sz w:val="36"/>
+          <w:szCs w:val="36"/>
+        </w:rPr>
+        <w:t xml:space="preserve">. </w:t>
+      </w:r>
+      <w:r>
+        <w:rPr>
+          <w:sz w:val="36"/>
+          <w:szCs w:val="36"/>
+        </w:rPr>
+        <w:t>Suppose you generated:</w:t>
+      </w:r>
+    </w:p>
+    <w:p>
+      <w:pPr>
+        <w:jc w:val="both"/>
+        <w:rPr>
+          <w:b/>
+          <w:bCs/>
+          <w:color w:val="60CAF3" w:themeColor="accent4" w:themeTint="99"/>
+          <w:sz w:val="36"/>
+          <w:szCs w:val="36"/>
+        </w:rPr>
+      </w:pPr>
+      <w:r>
+        <w:rPr>
+          <w:b/>
+          <w:bCs/>
+          <w:color w:val="60CAF3" w:themeColor="accent4" w:themeTint="99"/>
+          <w:sz w:val="36"/>
+          <w:szCs w:val="36"/>
+        </w:rPr>
+        <w:t>ssh-keygen</w:t>
+      </w:r>
+    </w:p>
+    <w:p>
+      <w:pPr>
+        <w:jc w:val="both"/>
+        <w:rPr>
+          <w:sz w:val="36"/>
+          <w:szCs w:val="36"/>
+        </w:rPr>
+      </w:pPr>
+      <w:r>
+        <w:rPr>
+          <w:sz w:val="36"/>
+          <w:szCs w:val="36"/>
+        </w:rPr>
+        <w:t># We</w:t>
+      </w:r>
+      <w:r>
+        <w:rPr>
+          <w:sz w:val="36"/>
+          <w:szCs w:val="36"/>
+        </w:rPr>
+        <w:t xml:space="preserve"> get:</w:t>
+      </w:r>
+    </w:p>
+    <w:p>
+      <w:pPr>
+        <w:jc w:val="both"/>
+        <w:rPr>
+          <w:b/>
+          <w:bCs/>
+          <w:sz w:val="36"/>
+          <w:szCs w:val="36"/>
+        </w:rPr>
+      </w:pPr>
+      <w:r>
+        <w:rPr>
+          <w:b/>
+          <w:bCs/>
+          <w:sz w:val="36"/>
+          <w:szCs w:val="36"/>
+        </w:rPr>
+        <w:t>id_rsa.pub   -&gt; Public Key</w:t>
+      </w:r>
+    </w:p>
+    <w:p>
+      <w:pPr>
+        <w:jc w:val="both"/>
+        <w:rPr>
+          <w:b/>
+          <w:bCs/>
+          <w:sz w:val="36"/>
+          <w:szCs w:val="36"/>
+        </w:rPr>
+      </w:pPr>
+      <w:proofErr w:type="spellStart"/>
+      <w:r>
+        <w:rPr>
+          <w:b/>
+          <w:bCs/>
+          <w:sz w:val="36"/>
+          <w:szCs w:val="36"/>
+        </w:rPr>
+        <w:t>id_rsa</w:t>
+      </w:r>
+      <w:proofErr w:type="spellEnd"/>
+      <w:r>
+        <w:rPr>
+          <w:b/>
+          <w:bCs/>
+          <w:sz w:val="36"/>
+          <w:szCs w:val="36"/>
+        </w:rPr>
+        <w:t xml:space="preserve">       -&gt; Private Key</w:t>
+      </w:r>
+    </w:p>
+    <w:p>
+      <w:pPr>
+        <w:jc w:val="both"/>
+        <w:rPr>
+          <w:sz w:val="36"/>
+          <w:szCs w:val="36"/>
+        </w:rPr>
+      </w:pPr>
+      <w:r>
+        <w:rPr>
+          <w:sz w:val="36"/>
+          <w:szCs w:val="36"/>
+        </w:rPr>
+        <w:t># We</w:t>
+      </w:r>
+      <w:r>
+        <w:rPr>
+          <w:sz w:val="36"/>
+          <w:szCs w:val="36"/>
+        </w:rPr>
+        <w:t xml:space="preserve"> copy</w:t>
+      </w:r>
+      <w:r>
+        <w:rPr>
+          <w:sz w:val="36"/>
+          <w:szCs w:val="36"/>
+        </w:rPr>
+        <w:t xml:space="preserve"> </w:t>
+      </w:r>
+      <w:r>
+        <w:rPr>
+          <w:b/>
+          <w:bCs/>
+          <w:sz w:val="36"/>
+          <w:szCs w:val="36"/>
+        </w:rPr>
+        <w:t>id_rsa.pub</w:t>
+      </w:r>
+      <w:r>
+        <w:rPr>
+          <w:sz w:val="36"/>
+          <w:szCs w:val="36"/>
+        </w:rPr>
+        <w:t xml:space="preserve"> and send </w:t>
+      </w:r>
+      <w:r>
+        <w:rPr>
+          <w:sz w:val="36"/>
+          <w:szCs w:val="36"/>
+        </w:rPr>
+        <w:t>to the server:</w:t>
+      </w:r>
+    </w:p>
+    <w:p>
+      <w:pPr>
+        <w:jc w:val="both"/>
+        <w:rPr>
+          <w:b/>
+          <w:bCs/>
+          <w:color w:val="60CAF3" w:themeColor="accent4" w:themeTint="99"/>
+          <w:sz w:val="36"/>
+          <w:szCs w:val="36"/>
+        </w:rPr>
+      </w:pPr>
+      <w:r>
+        <w:rPr>
+          <w:b/>
+          <w:bCs/>
+          <w:color w:val="60CAF3" w:themeColor="accent4" w:themeTint="99"/>
+          <w:sz w:val="36"/>
+          <w:szCs w:val="36"/>
+        </w:rPr>
+        <w:t>~/.ssh/</w:t>
+      </w:r>
+      <w:proofErr w:type="spellStart"/>
+      <w:r>
+        <w:rPr>
+          <w:b/>
+          <w:bCs/>
+          <w:color w:val="60CAF3" w:themeColor="accent4" w:themeTint="99"/>
+          <w:sz w:val="36"/>
+          <w:szCs w:val="36"/>
+        </w:rPr>
+        <w:t>authorized_keys</w:t>
+      </w:r>
+      <w:proofErr w:type="spellEnd"/>
+    </w:p>
+    <w:p>
+      <w:pPr>
+        <w:jc w:val="both"/>
+        <w:rPr>
+          <w:sz w:val="36"/>
+          <w:szCs w:val="36"/>
+        </w:rPr>
+      </w:pPr>
+      <w:r>
+        <w:rPr>
+          <w:sz w:val="36"/>
+          <w:szCs w:val="36"/>
+        </w:rPr>
+        <w:t xml:space="preserve"># </w:t>
+      </w:r>
+      <w:r>
+        <w:rPr>
+          <w:sz w:val="36"/>
+          <w:szCs w:val="36"/>
+        </w:rPr>
+        <w:t>Server stores our public key.</w:t>
+      </w:r>
+      <w:r>
+        <w:rPr>
+          <w:sz w:val="36"/>
+          <w:szCs w:val="36"/>
+        </w:rPr>
+        <w:t xml:space="preserve"> </w:t>
+      </w:r>
+      <w:r>
+        <w:rPr>
+          <w:sz w:val="36"/>
+          <w:szCs w:val="36"/>
+        </w:rPr>
+        <w:t>Authentication Process</w:t>
+      </w:r>
+      <w:r>
+        <w:rPr>
+          <w:sz w:val="36"/>
+          <w:szCs w:val="36"/>
+        </w:rPr>
+        <w:t>:</w:t>
+      </w:r>
+    </w:p>
+    <w:p>
+      <w:pPr>
+        <w:pStyle w:val="ListParagraph"/>
+        <w:numPr>
+          <w:ilvl w:val="0"/>
+          <w:numId w:val="20"/>
+        </w:numPr>
+        <w:jc w:val="both"/>
+        <w:rPr>
+          <w:sz w:val="36"/>
+          <w:szCs w:val="36"/>
+        </w:rPr>
+      </w:pPr>
+      <w:r>
+        <w:rPr>
+          <w:sz w:val="36"/>
+          <w:szCs w:val="36"/>
+        </w:rPr>
+        <w:t>Server sends a challenge</w:t>
+      </w:r>
+      <w:r>
+        <w:rPr>
+          <w:sz w:val="36"/>
+          <w:szCs w:val="36"/>
+        </w:rPr>
+        <w:t xml:space="preserve"> to p</w:t>
+      </w:r>
+      <w:r>
+        <w:rPr>
+          <w:sz w:val="36"/>
+          <w:szCs w:val="36"/>
+        </w:rPr>
+        <w:t xml:space="preserve">rove </w:t>
+      </w:r>
+      <w:r>
+        <w:rPr>
+          <w:sz w:val="36"/>
+          <w:szCs w:val="36"/>
+        </w:rPr>
+        <w:t>we</w:t>
+      </w:r>
+      <w:r>
+        <w:rPr>
+          <w:sz w:val="36"/>
+          <w:szCs w:val="36"/>
+        </w:rPr>
+        <w:t xml:space="preserve"> own the private key.</w:t>
+      </w:r>
+    </w:p>
+    <w:p>
+      <w:pPr>
+        <w:pStyle w:val="ListParagraph"/>
+        <w:numPr>
+          <w:ilvl w:val="0"/>
+          <w:numId w:val="20"/>
+        </w:numPr>
+        <w:jc w:val="both"/>
+        <w:rPr>
+          <w:sz w:val="36"/>
+          <w:szCs w:val="36"/>
+        </w:rPr>
+      </w:pPr>
+      <w:r>
+        <w:rPr>
+          <w:sz w:val="36"/>
+          <w:szCs w:val="36"/>
+        </w:rPr>
+        <w:t>O</w:t>
+      </w:r>
+      <w:r>
+        <w:rPr>
+          <w:sz w:val="36"/>
+          <w:szCs w:val="36"/>
+        </w:rPr>
+        <w:t>ur laptop signs the challenge</w:t>
+      </w:r>
+      <w:r>
+        <w:rPr>
+          <w:sz w:val="36"/>
+          <w:szCs w:val="36"/>
+        </w:rPr>
+        <w:t>:</w:t>
+      </w:r>
+    </w:p>
+    <w:p>
+      <w:pPr>
+        <w:jc w:val="both"/>
+        <w:rPr>
+          <w:b/>
+          <w:bCs/>
+          <w:sz w:val="32"/>
+          <w:szCs w:val="32"/>
+        </w:rPr>
+      </w:pPr>
+      <w:r>
+        <w:rPr>
+          <w:b/>
+          <w:bCs/>
+          <w:sz w:val="32"/>
+          <w:szCs w:val="32"/>
+        </w:rPr>
+        <w:t>Challenge + Private Key</w:t>
+      </w:r>
+    </w:p>
+    <w:p>
+      <w:pPr>
+        <w:jc w:val="both"/>
+        <w:rPr>
+          <w:b/>
+          <w:bCs/>
+          <w:sz w:val="32"/>
+          <w:szCs w:val="32"/>
+        </w:rPr>
+      </w:pPr>
+      <w:r>
+        <w:rPr>
+          <w:b/>
+          <w:bCs/>
+          <w:sz w:val="32"/>
+          <w:szCs w:val="32"/>
+        </w:rPr>
+        <w:t xml:space="preserve">      ↓</w:t>
+      </w:r>
+    </w:p>
+    <w:p>
+      <w:pPr>
+        <w:jc w:val="both"/>
+        <w:rPr>
+          <w:b/>
+          <w:bCs/>
+          <w:sz w:val="32"/>
+          <w:szCs w:val="32"/>
+        </w:rPr>
+      </w:pPr>
+      <w:r>
+        <w:rPr>
+          <w:b/>
+          <w:bCs/>
+          <w:sz w:val="32"/>
+          <w:szCs w:val="32"/>
+        </w:rPr>
+        <w:t>Digital Signature</w:t>
+      </w:r>
+    </w:p>
+    <w:p>
+      <w:pPr>
+        <w:pStyle w:val="ListParagraph"/>
+        <w:numPr>
+          <w:ilvl w:val="0"/>
+          <w:numId w:val="21"/>
+        </w:numPr>
+        <w:jc w:val="both"/>
+        <w:rPr>
+          <w:sz w:val="36"/>
+          <w:szCs w:val="36"/>
+        </w:rPr>
+      </w:pPr>
+      <w:r>
+        <w:rPr>
+          <w:sz w:val="36"/>
+          <w:szCs w:val="36"/>
+        </w:rPr>
+        <w:t>Then sends</w:t>
+      </w:r>
+      <w:r>
+        <w:rPr>
+          <w:sz w:val="36"/>
+          <w:szCs w:val="36"/>
+        </w:rPr>
+        <w:t xml:space="preserve"> </w:t>
+      </w:r>
+      <w:r>
+        <w:rPr>
+          <w:b/>
+          <w:bCs/>
+          <w:sz w:val="36"/>
+          <w:szCs w:val="36"/>
+        </w:rPr>
+        <w:t>Signature</w:t>
+      </w:r>
+      <w:r>
+        <w:rPr>
+          <w:sz w:val="36"/>
+          <w:szCs w:val="36"/>
+        </w:rPr>
+        <w:t xml:space="preserve"> </w:t>
+      </w:r>
+      <w:r>
+        <w:rPr>
+          <w:sz w:val="36"/>
+          <w:szCs w:val="36"/>
+        </w:rPr>
+        <w:t>to the server.</w:t>
+      </w:r>
+    </w:p>
+    <w:p>
+      <w:pPr>
+        <w:pStyle w:val="ListParagraph"/>
+        <w:numPr>
+          <w:ilvl w:val="0"/>
+          <w:numId w:val="21"/>
+        </w:numPr>
+        <w:jc w:val="both"/>
+        <w:rPr>
+          <w:sz w:val="36"/>
+          <w:szCs w:val="36"/>
+        </w:rPr>
+      </w:pPr>
+      <w:r>
+        <w:rPr>
+          <w:sz w:val="36"/>
+          <w:szCs w:val="36"/>
+        </w:rPr>
+        <w:t>Server verifies it using our public key:</w:t>
+      </w:r>
+    </w:p>
+    <w:p>
+      <w:pPr>
+        <w:jc w:val="both"/>
+        <w:rPr>
+          <w:b/>
+          <w:bCs/>
+          <w:sz w:val="32"/>
+          <w:szCs w:val="32"/>
+        </w:rPr>
+      </w:pPr>
+      <w:r>
+        <w:rPr>
+          <w:b/>
+          <w:bCs/>
+          <w:sz w:val="32"/>
+          <w:szCs w:val="32"/>
+        </w:rPr>
+        <w:t>Public Key + Signature</w:t>
+      </w:r>
+    </w:p>
+    <w:p>
+      <w:pPr>
+        <w:jc w:val="both"/>
+        <w:rPr>
+          <w:b/>
+          <w:bCs/>
+          <w:sz w:val="32"/>
+          <w:szCs w:val="32"/>
+        </w:rPr>
+      </w:pPr>
+      <w:r>
+        <w:rPr>
+          <w:b/>
+          <w:bCs/>
+          <w:sz w:val="32"/>
+          <w:szCs w:val="32"/>
+        </w:rPr>
+        <w:t xml:space="preserve">        ↓</w:t>
+      </w:r>
+    </w:p>
+    <w:p>
+      <w:pPr>
+        <w:jc w:val="both"/>
+        <w:rPr>
+          <w:b/>
+          <w:bCs/>
+          <w:sz w:val="32"/>
+          <w:szCs w:val="32"/>
+        </w:rPr>
+      </w:pPr>
+      <w:r>
+        <w:rPr>
+          <w:b/>
+          <w:bCs/>
+          <w:sz w:val="32"/>
+          <w:szCs w:val="32"/>
+        </w:rPr>
+        <w:t>Valid?</w:t>
+      </w:r>
+    </w:p>
+    <w:p>
+      <w:pPr>
+        <w:jc w:val="both"/>
+        <w:rPr>
+          <w:sz w:val="36"/>
+          <w:szCs w:val="36"/>
+        </w:rPr>
+      </w:pPr>
+      <w:r>
+        <w:rPr>
+          <w:sz w:val="36"/>
+          <w:szCs w:val="36"/>
+        </w:rPr>
+        <w:t xml:space="preserve"># </w:t>
+      </w:r>
+      <w:r>
+        <w:rPr>
+          <w:sz w:val="36"/>
+          <w:szCs w:val="36"/>
+        </w:rPr>
+        <w:t>If valid</w:t>
+      </w:r>
+      <w:r>
+        <w:rPr>
+          <w:sz w:val="36"/>
+          <w:szCs w:val="36"/>
+        </w:rPr>
+        <w:t xml:space="preserve"> a</w:t>
+      </w:r>
+      <w:r>
+        <w:rPr>
+          <w:sz w:val="36"/>
+          <w:szCs w:val="36"/>
+        </w:rPr>
+        <w:t>ccess Granted</w:t>
+      </w:r>
+      <w:r>
+        <w:rPr>
+          <w:sz w:val="36"/>
+          <w:szCs w:val="36"/>
+        </w:rPr>
+        <w:t xml:space="preserve">. </w:t>
+      </w:r>
+      <w:r>
+        <w:rPr>
+          <w:sz w:val="36"/>
+          <w:szCs w:val="36"/>
+        </w:rPr>
+        <w:t>If not</w:t>
+      </w:r>
+      <w:r>
+        <w:rPr>
+          <w:sz w:val="36"/>
+          <w:szCs w:val="36"/>
+        </w:rPr>
+        <w:t xml:space="preserve"> a</w:t>
+      </w:r>
+      <w:r>
+        <w:rPr>
+          <w:sz w:val="36"/>
+          <w:szCs w:val="36"/>
+        </w:rPr>
+        <w:t>ccess Denied</w:t>
+      </w:r>
+      <w:r>
+        <w:rPr>
+          <w:sz w:val="36"/>
+          <w:szCs w:val="36"/>
+        </w:rPr>
+        <w:t>.</w:t>
+      </w:r>
+    </w:p>
+    <w:p>
+      <w:pPr>
+        <w:jc w:val="both"/>
+        <w:rPr>
+          <w:sz w:val="36"/>
+          <w:szCs w:val="36"/>
+        </w:rPr>
+      </w:pPr>
+      <w:r>
+        <w:rPr>
+          <w:sz w:val="36"/>
+          <w:szCs w:val="36"/>
+        </w:rPr>
+        <w:lastRenderedPageBreak/>
+        <w:t xml:space="preserve"># </w:t>
+      </w:r>
+      <w:r>
+        <w:rPr>
+          <w:sz w:val="36"/>
+          <w:szCs w:val="36"/>
+        </w:rPr>
+        <w:t xml:space="preserve">The private key stays </w:t>
+      </w:r>
+      <w:r>
+        <w:rPr>
+          <w:sz w:val="36"/>
+          <w:szCs w:val="36"/>
+        </w:rPr>
+        <w:t>in our local machine</w:t>
+      </w:r>
+      <w:r>
+        <w:rPr>
+          <w:sz w:val="36"/>
+          <w:szCs w:val="36"/>
+        </w:rPr>
+        <w:t>:</w:t>
+      </w:r>
+    </w:p>
+    <w:p>
+      <w:pPr>
+        <w:jc w:val="both"/>
+        <w:rPr>
+          <w:b/>
+          <w:bCs/>
+          <w:sz w:val="36"/>
+          <w:szCs w:val="36"/>
+        </w:rPr>
+      </w:pPr>
+      <w:r>
+        <w:rPr>
+          <w:b/>
+          <w:bCs/>
+          <w:sz w:val="36"/>
+          <w:szCs w:val="36"/>
+        </w:rPr>
+        <w:t xml:space="preserve">Your </w:t>
+      </w:r>
+      <w:proofErr w:type="gramStart"/>
+      <w:r>
+        <w:rPr>
+          <w:b/>
+          <w:bCs/>
+          <w:sz w:val="36"/>
+          <w:szCs w:val="36"/>
+        </w:rPr>
+        <w:t>Laptop</w:t>
+      </w:r>
+      <w:proofErr w:type="gramEnd"/>
+    </w:p>
+    <w:p>
+      <w:pPr>
+        <w:jc w:val="both"/>
+        <w:rPr>
+          <w:b/>
+          <w:bCs/>
+          <w:sz w:val="36"/>
+          <w:szCs w:val="36"/>
+        </w:rPr>
+      </w:pPr>
+      <w:r>
+        <w:rPr>
+          <w:b/>
+          <w:bCs/>
+          <w:sz w:val="36"/>
+          <w:szCs w:val="36"/>
+        </w:rPr>
+        <w:t xml:space="preserve">    |</w:t>
+      </w:r>
+    </w:p>
+    <w:p>
+      <w:pPr>
+        <w:jc w:val="both"/>
+        <w:rPr>
+          <w:b/>
+          <w:bCs/>
+          <w:sz w:val="36"/>
+          <w:szCs w:val="36"/>
+        </w:rPr>
+      </w:pPr>
+      <w:r>
+        <w:rPr>
+          <w:b/>
+          <w:bCs/>
+          <w:sz w:val="36"/>
+          <w:szCs w:val="36"/>
+        </w:rPr>
+        <w:t xml:space="preserve">    | Private Key</w:t>
+      </w:r>
+    </w:p>
+    <w:p>
+      <w:pPr>
+        <w:jc w:val="both"/>
+        <w:rPr>
+          <w:b/>
+          <w:bCs/>
+          <w:sz w:val="36"/>
+          <w:szCs w:val="36"/>
+        </w:rPr>
+      </w:pPr>
+      <w:r>
+        <w:rPr>
+          <w:b/>
+          <w:bCs/>
+          <w:sz w:val="36"/>
+          <w:szCs w:val="36"/>
+        </w:rPr>
+        <w:t xml:space="preserve">    |</w:t>
+      </w:r>
+    </w:p>
+    <w:p>
+      <w:pPr>
+        <w:jc w:val="both"/>
+        <w:rPr>
+          <w:sz w:val="36"/>
+          <w:szCs w:val="36"/>
+        </w:rPr>
+      </w:pPr>
+      <w:r>
+        <w:rPr>
+          <w:sz w:val="36"/>
+          <w:szCs w:val="36"/>
+        </w:rPr>
+        <w:t xml:space="preserve"># </w:t>
+      </w:r>
+      <w:r>
+        <w:rPr>
+          <w:sz w:val="36"/>
+          <w:szCs w:val="36"/>
+        </w:rPr>
+        <w:t>The server never receives it.</w:t>
+      </w:r>
+      <w:r>
+        <w:rPr>
+          <w:sz w:val="36"/>
+          <w:szCs w:val="36"/>
+        </w:rPr>
+        <w:t xml:space="preserve"> </w:t>
+      </w:r>
+      <w:r>
+        <w:rPr>
+          <w:sz w:val="36"/>
+          <w:szCs w:val="36"/>
+        </w:rPr>
+        <w:t>The server only receives</w:t>
+      </w:r>
+      <w:r>
+        <w:rPr>
+          <w:sz w:val="36"/>
+          <w:szCs w:val="36"/>
+        </w:rPr>
+        <w:t xml:space="preserve"> the </w:t>
+      </w:r>
+      <w:r>
+        <w:rPr>
+          <w:b/>
+          <w:bCs/>
+          <w:sz w:val="36"/>
+          <w:szCs w:val="36"/>
+        </w:rPr>
+        <w:t>Signature</w:t>
+      </w:r>
+      <w:r>
+        <w:rPr>
+          <w:sz w:val="36"/>
+          <w:szCs w:val="36"/>
+        </w:rPr>
+        <w:t xml:space="preserve"> </w:t>
+      </w:r>
+      <w:r>
+        <w:rPr>
+          <w:sz w:val="36"/>
+          <w:szCs w:val="36"/>
+        </w:rPr>
+        <w:t>which proves</w:t>
+      </w:r>
+      <w:r>
+        <w:rPr>
+          <w:sz w:val="36"/>
+          <w:szCs w:val="36"/>
+        </w:rPr>
+        <w:t xml:space="preserve"> we</w:t>
+      </w:r>
+      <w:r>
+        <w:rPr>
+          <w:sz w:val="36"/>
+          <w:szCs w:val="36"/>
+        </w:rPr>
+        <w:t xml:space="preserve"> own the private key.</w:t>
+      </w:r>
+      <w:r>
+        <w:rPr>
+          <w:sz w:val="36"/>
+          <w:szCs w:val="36"/>
+        </w:rPr>
+        <w:t xml:space="preserve"> </w:t>
+      </w:r>
+      <w:r>
+        <w:rPr>
+          <w:sz w:val="36"/>
+          <w:szCs w:val="36"/>
+        </w:rPr>
+        <w:t>So even if someone compromises the server, they still don't get our private key.</w:t>
+      </w:r>
+    </w:p>
+    <w:p>
+      <w:pPr>
+        <w:jc w:val="both"/>
+        <w:rPr>
+          <w:sz w:val="36"/>
+          <w:szCs w:val="36"/>
+        </w:rPr>
+      </w:pPr>
+    </w:p>
+    <w:p>
+      <w:pPr>
+        <w:jc w:val="both"/>
+        <w:rPr>
+          <w:sz w:val="36"/>
+          <w:szCs w:val="36"/>
+        </w:rPr>
+      </w:pPr>
+      <w:r>
+        <w:rPr>
+          <w:sz w:val="36"/>
+          <w:szCs w:val="36"/>
+        </w:rPr>
+        <w:t>Prevents Man-in-the-Middle Attack:</w:t>
+      </w:r>
+    </w:p>
+    <w:p>
+      <w:pPr>
+        <w:jc w:val="both"/>
+        <w:rPr>
+          <w:sz w:val="36"/>
+          <w:szCs w:val="36"/>
+        </w:rPr>
+      </w:pPr>
+      <w:r>
+        <w:rPr>
+          <w:sz w:val="36"/>
+          <w:szCs w:val="36"/>
+        </w:rPr>
+        <w:t xml:space="preserve"># </w:t>
+      </w:r>
+      <w:r>
+        <w:rPr>
+          <w:sz w:val="36"/>
+          <w:szCs w:val="36"/>
+        </w:rPr>
+        <w:t xml:space="preserve">Suppose an attacker sits between </w:t>
+      </w:r>
+      <w:r>
+        <w:rPr>
+          <w:sz w:val="36"/>
+          <w:szCs w:val="36"/>
+        </w:rPr>
+        <w:t>us</w:t>
+      </w:r>
+      <w:r>
+        <w:rPr>
+          <w:sz w:val="36"/>
+          <w:szCs w:val="36"/>
+        </w:rPr>
+        <w:t xml:space="preserve"> and the server.</w:t>
+      </w:r>
+    </w:p>
+    <w:p>
+      <w:pPr>
+        <w:jc w:val="both"/>
+        <w:rPr>
+          <w:b/>
+          <w:bCs/>
+          <w:sz w:val="36"/>
+          <w:szCs w:val="36"/>
+        </w:rPr>
+      </w:pPr>
+      <w:r>
+        <w:rPr>
+          <w:b/>
+          <w:bCs/>
+          <w:sz w:val="36"/>
+          <w:szCs w:val="36"/>
+        </w:rPr>
+        <w:t>You &lt;---&gt; Hacker &lt;---&gt; Server</w:t>
+      </w:r>
+    </w:p>
+    <w:p>
+      <w:pPr>
+        <w:jc w:val="both"/>
+        <w:rPr>
+          <w:sz w:val="36"/>
+          <w:szCs w:val="36"/>
+        </w:rPr>
+      </w:pPr>
+      <w:r>
+        <w:rPr>
+          <w:sz w:val="36"/>
+          <w:szCs w:val="36"/>
+        </w:rPr>
+        <w:t xml:space="preserve"># </w:t>
+      </w:r>
+      <w:r>
+        <w:rPr>
+          <w:sz w:val="36"/>
+          <w:szCs w:val="36"/>
+        </w:rPr>
+        <w:t>Without verification</w:t>
+      </w:r>
+      <w:r>
+        <w:rPr>
+          <w:sz w:val="36"/>
+          <w:szCs w:val="36"/>
+        </w:rPr>
+        <w:t xml:space="preserve"> </w:t>
+      </w:r>
+      <w:r>
+        <w:rPr>
+          <w:sz w:val="36"/>
+          <w:szCs w:val="36"/>
+        </w:rPr>
+        <w:t>Hacker sends fake public key</w:t>
+      </w:r>
+      <w:r>
+        <w:rPr>
+          <w:sz w:val="36"/>
+          <w:szCs w:val="36"/>
+        </w:rPr>
+        <w:t>, we</w:t>
+      </w:r>
+      <w:r>
+        <w:rPr>
+          <w:sz w:val="36"/>
+          <w:szCs w:val="36"/>
+        </w:rPr>
+        <w:t xml:space="preserve"> trust it</w:t>
+      </w:r>
+      <w:r>
+        <w:rPr>
+          <w:sz w:val="36"/>
+          <w:szCs w:val="36"/>
+        </w:rPr>
+        <w:t xml:space="preserve">. </w:t>
+      </w:r>
+      <w:r>
+        <w:rPr>
+          <w:sz w:val="36"/>
+          <w:szCs w:val="36"/>
+        </w:rPr>
+        <w:t>SSH prevents this because our laptop remembers the server's public host key.</w:t>
+      </w:r>
+    </w:p>
+    <w:p>
+      <w:pPr>
+        <w:jc w:val="both"/>
+        <w:rPr>
+          <w:b/>
+          <w:bCs/>
+          <w:sz w:val="36"/>
+          <w:szCs w:val="36"/>
+        </w:rPr>
+      </w:pPr>
+      <w:proofErr w:type="spellStart"/>
+      <w:r>
+        <w:rPr>
+          <w:b/>
+          <w:bCs/>
+          <w:sz w:val="36"/>
+          <w:szCs w:val="36"/>
+        </w:rPr>
+        <w:t>known_hosts</w:t>
+      </w:r>
+      <w:proofErr w:type="spellEnd"/>
+    </w:p>
+    <w:p>
+      <w:pPr>
+        <w:jc w:val="both"/>
+        <w:rPr>
+          <w:sz w:val="36"/>
+          <w:szCs w:val="36"/>
+        </w:rPr>
+      </w:pPr>
+      <w:r>
+        <w:rPr>
+          <w:sz w:val="36"/>
+          <w:szCs w:val="36"/>
+        </w:rPr>
+        <w:t xml:space="preserve"># </w:t>
+      </w:r>
+      <w:r>
+        <w:rPr>
+          <w:sz w:val="36"/>
+          <w:szCs w:val="36"/>
+        </w:rPr>
+        <w:t>Next connection:</w:t>
+      </w:r>
+    </w:p>
+    <w:p>
+      <w:pPr>
+        <w:jc w:val="both"/>
+        <w:rPr>
+          <w:b/>
+          <w:bCs/>
+          <w:sz w:val="36"/>
+          <w:szCs w:val="36"/>
+        </w:rPr>
+      </w:pPr>
+      <w:r>
+        <w:rPr>
+          <w:b/>
+          <w:bCs/>
+          <w:sz w:val="36"/>
+          <w:szCs w:val="36"/>
+        </w:rPr>
+        <w:t>Expected Key = ABC123</w:t>
+      </w:r>
+    </w:p>
+    <w:p>
+      <w:pPr>
+        <w:jc w:val="both"/>
+        <w:rPr>
+          <w:b/>
+          <w:bCs/>
+          <w:sz w:val="36"/>
+          <w:szCs w:val="36"/>
+        </w:rPr>
+      </w:pPr>
+      <w:r>
+        <w:rPr>
+          <w:b/>
+          <w:bCs/>
+          <w:sz w:val="36"/>
+          <w:szCs w:val="36"/>
+        </w:rPr>
+        <w:t>Received Key = XYZ999</w:t>
+      </w:r>
+    </w:p>
+    <w:p>
+      <w:pPr>
+        <w:jc w:val="both"/>
+        <w:rPr>
+          <w:sz w:val="36"/>
+          <w:szCs w:val="36"/>
+        </w:rPr>
+      </w:pPr>
+      <w:r>
+        <w:rPr>
+          <w:sz w:val="36"/>
+          <w:szCs w:val="36"/>
+        </w:rPr>
+        <w:t xml:space="preserve"># </w:t>
+      </w:r>
+      <w:r>
+        <w:rPr>
+          <w:sz w:val="36"/>
+          <w:szCs w:val="36"/>
+        </w:rPr>
+        <w:t>Mismatch</w:t>
+      </w:r>
+      <w:r>
+        <w:rPr>
+          <w:sz w:val="36"/>
+          <w:szCs w:val="36"/>
+        </w:rPr>
+        <w:t xml:space="preserve"> “</w:t>
+      </w:r>
+      <w:r>
+        <w:rPr>
+          <w:sz w:val="36"/>
+          <w:szCs w:val="36"/>
+        </w:rPr>
+        <w:t>WARNING!</w:t>
+      </w:r>
+      <w:r>
+        <w:rPr>
+          <w:sz w:val="36"/>
+          <w:szCs w:val="36"/>
+        </w:rPr>
+        <w:t xml:space="preserve"> </w:t>
+      </w:r>
+      <w:r>
+        <w:rPr>
+          <w:sz w:val="36"/>
+          <w:szCs w:val="36"/>
+        </w:rPr>
+        <w:t>Connection is rejected</w:t>
+      </w:r>
+      <w:r>
+        <w:rPr>
+          <w:sz w:val="36"/>
+          <w:szCs w:val="36"/>
+        </w:rPr>
+        <w:t xml:space="preserve">”. </w:t>
+      </w:r>
+      <w:proofErr w:type="gramStart"/>
+      <w:r>
+        <w:rPr>
+          <w:sz w:val="36"/>
+          <w:szCs w:val="36"/>
+        </w:rPr>
+        <w:t>This</w:t>
+      </w:r>
+      <w:proofErr w:type="gramEnd"/>
+      <w:r>
+        <w:rPr>
+          <w:sz w:val="36"/>
+          <w:szCs w:val="36"/>
+        </w:rPr>
+        <w:t xml:space="preserve"> is the main defense against man-in-the-middle attacks.</w:t>
+      </w:r>
+    </w:p>
+    <w:p>
+      <w:pPr>
+        <w:jc w:val="both"/>
+        <w:rPr>
+          <w:sz w:val="36"/>
+          <w:szCs w:val="36"/>
+        </w:rPr>
+      </w:pPr>
+    </w:p>
+    <w:p>
+      <w:pPr>
+        <w:jc w:val="both"/>
+        <w:rPr>
+          <w:sz w:val="36"/>
+          <w:szCs w:val="36"/>
+        </w:rPr>
+      </w:pPr>
+      <w:r>
+        <w:rPr>
+          <w:sz w:val="36"/>
+          <w:szCs w:val="36"/>
+        </w:rPr>
+        <w:t xml:space="preserve">Final </w:t>
+      </w:r>
+      <w:r>
+        <w:rPr>
+          <w:sz w:val="36"/>
+          <w:szCs w:val="36"/>
+        </w:rPr>
+        <w:t>Mental Model</w:t>
+      </w:r>
+      <w:r>
+        <w:rPr>
+          <w:sz w:val="36"/>
+          <w:szCs w:val="36"/>
+        </w:rPr>
+        <w:t>:</w:t>
+      </w:r>
+    </w:p>
+    <w:p>
+      <w:pPr>
+        <w:jc w:val="both"/>
+        <w:rPr>
+          <w:sz w:val="36"/>
+          <w:szCs w:val="36"/>
+        </w:rPr>
+      </w:pPr>
+      <w:r>
+        <w:rPr>
+          <w:sz w:val="36"/>
+          <w:szCs w:val="36"/>
+        </w:rPr>
+        <w:t>Think of SSH in three phases:</w:t>
+      </w:r>
+    </w:p>
+    <w:p>
+      <w:pPr>
+        <w:jc w:val="both"/>
+        <w:rPr>
+          <w:b/>
+          <w:bCs/>
+          <w:sz w:val="32"/>
+          <w:szCs w:val="32"/>
+        </w:rPr>
+      </w:pPr>
+      <w:r>
+        <w:rPr>
+          <w:b/>
+          <w:bCs/>
+          <w:sz w:val="32"/>
+          <w:szCs w:val="32"/>
+        </w:rPr>
+        <w:t>1. Verify Server</w:t>
+      </w:r>
+    </w:p>
+    <w:p>
+      <w:pPr>
+        <w:jc w:val="both"/>
+        <w:rPr>
+          <w:b/>
+          <w:bCs/>
+          <w:sz w:val="32"/>
+          <w:szCs w:val="32"/>
+        </w:rPr>
+      </w:pPr>
+      <w:r>
+        <w:rPr>
+          <w:b/>
+          <w:bCs/>
+          <w:sz w:val="32"/>
+          <w:szCs w:val="32"/>
+        </w:rPr>
+        <w:t xml:space="preserve">      ↓</w:t>
+      </w:r>
+    </w:p>
+    <w:p>
+      <w:pPr>
+        <w:jc w:val="both"/>
+        <w:rPr>
+          <w:b/>
+          <w:bCs/>
+          <w:sz w:val="32"/>
+          <w:szCs w:val="32"/>
+        </w:rPr>
+      </w:pPr>
+      <w:r>
+        <w:rPr>
+          <w:b/>
+          <w:bCs/>
+          <w:sz w:val="32"/>
+          <w:szCs w:val="32"/>
+        </w:rPr>
+        <w:t>2. Create Shared Secret Session Key</w:t>
+      </w:r>
+    </w:p>
+    <w:p>
+      <w:pPr>
+        <w:jc w:val="both"/>
+        <w:rPr>
+          <w:b/>
+          <w:bCs/>
+          <w:sz w:val="32"/>
+          <w:szCs w:val="32"/>
+        </w:rPr>
+      </w:pPr>
+      <w:r>
+        <w:rPr>
+          <w:b/>
+          <w:bCs/>
+          <w:sz w:val="32"/>
+          <w:szCs w:val="32"/>
+        </w:rPr>
+        <w:t xml:space="preserve">      ↓</w:t>
+      </w:r>
+    </w:p>
+    <w:p>
+      <w:pPr>
+        <w:jc w:val="both"/>
+        <w:rPr>
+          <w:b/>
+          <w:bCs/>
+          <w:sz w:val="32"/>
+          <w:szCs w:val="32"/>
+        </w:rPr>
+      </w:pPr>
+      <w:r>
+        <w:rPr>
+          <w:b/>
+          <w:bCs/>
+          <w:sz w:val="32"/>
+          <w:szCs w:val="32"/>
+        </w:rPr>
+        <w:t>3. Authenticate User</w:t>
+      </w:r>
+    </w:p>
+    <w:p>
+      <w:pPr>
+        <w:jc w:val="both"/>
+        <w:rPr>
+          <w:b/>
+          <w:bCs/>
+          <w:sz w:val="32"/>
+          <w:szCs w:val="32"/>
+        </w:rPr>
+      </w:pPr>
+      <w:r>
+        <w:rPr>
+          <w:b/>
+          <w:bCs/>
+          <w:sz w:val="32"/>
+          <w:szCs w:val="32"/>
+        </w:rPr>
+        <w:t xml:space="preserve">      ↓</w:t>
+      </w:r>
+    </w:p>
+    <w:p>
+      <w:pPr>
+        <w:jc w:val="both"/>
+        <w:rPr>
+          <w:b/>
+          <w:bCs/>
+          <w:sz w:val="32"/>
+          <w:szCs w:val="32"/>
+        </w:rPr>
+      </w:pPr>
+      <w:r>
+        <w:rPr>
+          <w:b/>
+          <w:bCs/>
+          <w:sz w:val="32"/>
+          <w:szCs w:val="32"/>
+        </w:rPr>
+        <w:t xml:space="preserve">4. </w:t>
+      </w:r>
+      <w:r>
+        <w:rPr>
+          <w:b/>
+          <w:bCs/>
+          <w:sz w:val="32"/>
+          <w:szCs w:val="32"/>
+        </w:rPr>
+        <w:t>Encrypted Communication</w:t>
+      </w:r>
+    </w:p>
+    <w:p>
+      <w:pPr>
+        <w:jc w:val="both"/>
+        <w:rPr>
+          <w:sz w:val="36"/>
+          <w:szCs w:val="36"/>
+        </w:rPr>
+      </w:pPr>
+    </w:p>
+    <w:p>
+      <w:pPr>
+        <w:jc w:val="both"/>
+        <w:rPr>
+          <w:b/>
+          <w:bCs/>
+          <w:sz w:val="36"/>
+          <w:szCs w:val="36"/>
+        </w:rPr>
+      </w:pPr>
+      <w:r>
+        <w:rPr>
+          <w:b/>
+          <w:bCs/>
+          <w:sz w:val="36"/>
+          <w:szCs w:val="36"/>
+        </w:rPr>
+        <w:t>Implementation of SSH Key:</w:t>
+      </w:r>
+    </w:p>
+    <w:p>
+      <w:pPr>
+        <w:jc w:val="both"/>
+        <w:rPr>
+          <w:sz w:val="36"/>
+          <w:szCs w:val="36"/>
+        </w:rPr>
+      </w:pPr>
+      <w:r>
+        <w:rPr>
+          <w:sz w:val="36"/>
+          <w:szCs w:val="36"/>
+        </w:rPr>
+        <w:t xml:space="preserve"># </w:t>
+      </w:r>
+    </w:p>
+    <w:p>
+      <w:pPr>
         <w:jc w:val="both"/>
         <w:rPr>
           <w:sz w:val="36"/>
@@ -6193,6 +9080,119 @@
 <file path=word/numbering.xml><?xml version="1.0" encoding="utf-8"?>
 <w:numbering xmlns:wpc="http://schemas.microsoft.com/office/word/2010/wordprocessingCanvas" xmlns:cx="http://schemas.microsoft.com/office/drawing/2014/chartex" xmlns:cx1="http://schemas.microsoft.com/office/drawing/2015/9/8/chartex" xmlns:cx2="http://schemas.microsoft.com/office/drawing/2015/10/21/chartex" xmlns:cx3="http://schemas.microsoft.com/office/drawing/2016/5/9/chartex" xmlns:cx4="http://schemas.microsoft.com/office/drawing/2016/5/10/chartex" xmlns:cx5="http://schemas.microsoft.com/office/drawing/2016/5/11/chartex" xmlns:cx6="http://schemas.microsoft.com/office/drawing/2016/5/12/chartex" xmlns:cx7="http://schemas.microsoft.com/office/drawing/2016/5/13/chartex" xmlns:cx8="http://schemas.microsoft.com/office/drawing/2016/5/14/chartex" xmlns:mc="http://schemas.openxmlformats.org/markup-compatibility/2006" xmlns:aink="http://schemas.microsoft.com/office/drawing/2016/ink" xmlns:am3d="http://schemas.microsoft.com/office/drawing/2017/model3d" xmlns:o="urn:schemas-microsoft-com:office:office" xmlns:oel="http://schemas.microsoft.com/office/2019/extlst" xmlns:r="http://schemas.openxmlformats.org/officeDocument/2006/relationships" xmlns:m="http://schemas.openxmlformats.org/officeDocument/2006/math" xmlns:v="urn:schemas-microsoft-com:vml" xmlns:wp14="http://schemas.microsoft.com/office/word/2010/wordprocessingDrawing" xmlns:wp="http://schemas.openxmlformats.org/drawingml/2006/wordprocessingDrawing" xmlns:w10="urn:schemas-microsoft-com:office:word" xmlns:w="http://schemas.openxmlformats.org/wordprocessingml/2006/main" xmlns:w14="http://schemas.microsoft.com/office/word/2010/wordml" xmlns:w15="http://schemas.microsoft.com/office/word/2012/wordml" xmlns:w16cex="http://schemas.microsoft.com/office/word/2018/wordml/cex" xmlns:w16cid="http://schemas.microsoft.com/office/word/2016/wordml/cid" xmlns:w16="http://schemas.microsoft.com/office/word/2018/wordml" xmlns:w16sdtdh="http://schemas.microsoft.com/office/word/2020/wordml/sdtdatahash" xmlns:w16se="http://schemas.microsoft.com/office/word/2015/wordml/symex" xmlns:wpg="http://schemas.microsoft.com/office/word/2010/wordprocessingGroup" xmlns:wpi="http://schemas.microsoft.com/office/word/2010/wordprocessingInk" xmlns:wne="http://schemas.microsoft.com/office/word/2006/wordml" xmlns:wps="http://schemas.microsoft.com/office/word/2010/wordprocessingShape" mc:Ignorable="w14 w15 w16se w16cid w16 w16cex w16sdtdh wp14">
   <w:abstractNum w:abstractNumId="0" w15:restartNumberingAfterBreak="0">
+    <w:nsid w:val="07FF6E1F"/>
+    <w:multiLevelType w:val="hybridMultilevel"/>
+    <w:tmpl w:val="BE845D3E"/>
+    <w:lvl w:ilvl="0" w:tplc="04090001">
+      <w:start w:val="1"/>
+      <w:numFmt w:val="bullet"/>
+      <w:lvlText w:val=""/>
+      <w:lvlJc w:val="left"/>
+      <w:pPr>
+        <w:ind w:left="360" w:hanging="360"/>
+      </w:pPr>
+      <w:rPr>
+        <w:rFonts w:ascii="Symbol" w:hAnsi="Symbol" w:hint="default"/>
+      </w:rPr>
+    </w:lvl>
+    <w:lvl w:ilvl="1" w:tplc="04090003" w:tentative="1">
+      <w:start w:val="1"/>
+      <w:numFmt w:val="bullet"/>
+      <w:lvlText w:val="o"/>
+      <w:lvlJc w:val="left"/>
+      <w:pPr>
+        <w:ind w:left="1080" w:hanging="360"/>
+      </w:pPr>
+      <w:rPr>
+        <w:rFonts w:ascii="Courier New" w:hAnsi="Courier New" w:cs="Courier New" w:hint="default"/>
+      </w:rPr>
+    </w:lvl>
+    <w:lvl w:ilvl="2" w:tplc="04090005" w:tentative="1">
+      <w:start w:val="1"/>
+      <w:numFmt w:val="bullet"/>
+      <w:lvlText w:val=""/>
+      <w:lvlJc w:val="left"/>
+      <w:pPr>
+        <w:ind w:left="1800" w:hanging="360"/>
+      </w:pPr>
+      <w:rPr>
+        <w:rFonts w:ascii="Wingdings" w:hAnsi="Wingdings" w:hint="default"/>
+      </w:rPr>
+    </w:lvl>
+    <w:lvl w:ilvl="3" w:tplc="04090001" w:tentative="1">
+      <w:start w:val="1"/>
+      <w:numFmt w:val="bullet"/>
+      <w:lvlText w:val=""/>
+      <w:lvlJc w:val="left"/>
+      <w:pPr>
+        <w:ind w:left="2520" w:hanging="360"/>
+      </w:pPr>
+      <w:rPr>
+        <w:rFonts w:ascii="Symbol" w:hAnsi="Symbol" w:hint="default"/>
+      </w:rPr>
+    </w:lvl>
+    <w:lvl w:ilvl="4" w:tplc="04090003" w:tentative="1">
+      <w:start w:val="1"/>
+      <w:numFmt w:val="bullet"/>
+      <w:lvlText w:val="o"/>
+      <w:lvlJc w:val="left"/>
+      <w:pPr>
+        <w:ind w:left="3240" w:hanging="360"/>
+      </w:pPr>
+      <w:rPr>
+        <w:rFonts w:ascii="Courier New" w:hAnsi="Courier New" w:cs="Courier New" w:hint="default"/>
+      </w:rPr>
+    </w:lvl>
+    <w:lvl w:ilvl="5" w:tplc="04090005" w:tentative="1">
+      <w:start w:val="1"/>
+      <w:numFmt w:val="bullet"/>
+      <w:lvlText w:val=""/>
+      <w:lvlJc w:val="left"/>
+      <w:pPr>
+        <w:ind w:left="3960" w:hanging="360"/>
+      </w:pPr>
+      <w:rPr>
+        <w:rFonts w:ascii="Wingdings" w:hAnsi="Wingdings" w:hint="default"/>
+      </w:rPr>
+    </w:lvl>
+    <w:lvl w:ilvl="6" w:tplc="04090001" w:tentative="1">
+      <w:start w:val="1"/>
+      <w:numFmt w:val="bullet"/>
+      <w:lvlText w:val=""/>
+      <w:lvlJc w:val="left"/>
+      <w:pPr>
+        <w:ind w:left="4680" w:hanging="360"/>
+      </w:pPr>
+      <w:rPr>
+        <w:rFonts w:ascii="Symbol" w:hAnsi="Symbol" w:hint="default"/>
+      </w:rPr>
+    </w:lvl>
+    <w:lvl w:ilvl="7" w:tplc="04090003" w:tentative="1">
+      <w:start w:val="1"/>
+      <w:numFmt w:val="bullet"/>
+      <w:lvlText w:val="o"/>
+      <w:lvlJc w:val="left"/>
+      <w:pPr>
+        <w:ind w:left="5400" w:hanging="360"/>
+      </w:pPr>
+      <w:rPr>
+        <w:rFonts w:ascii="Courier New" w:hAnsi="Courier New" w:cs="Courier New" w:hint="default"/>
+      </w:rPr>
+    </w:lvl>
+    <w:lvl w:ilvl="8" w:tplc="04090005" w:tentative="1">
+      <w:start w:val="1"/>
+      <w:numFmt w:val="bullet"/>
+      <w:lvlText w:val=""/>
+      <w:lvlJc w:val="left"/>
+      <w:pPr>
+        <w:ind w:left="6120" w:hanging="360"/>
+      </w:pPr>
+      <w:rPr>
+        <w:rFonts w:ascii="Wingdings" w:hAnsi="Wingdings" w:hint="default"/>
+      </w:rPr>
+    </w:lvl>
+  </w:abstractNum>
+  <w:abstractNum w:abstractNumId="1" w15:restartNumberingAfterBreak="0">
     <w:nsid w:val="10A42389"/>
     <w:multiLevelType w:val="hybridMultilevel"/>
     <w:tmpl w:val="1082B6A4"/>
@@ -6305,7 +9305,7 @@
       </w:rPr>
     </w:lvl>
   </w:abstractNum>
-  <w:abstractNum w:abstractNumId="1" w15:restartNumberingAfterBreak="0">
+  <w:abstractNum w:abstractNumId="2" w15:restartNumberingAfterBreak="0">
     <w:nsid w:val="23A11734"/>
     <w:multiLevelType w:val="hybridMultilevel"/>
     <w:tmpl w:val="CCB83A46"/>
@@ -6418,7 +9418,7 @@
       </w:rPr>
     </w:lvl>
   </w:abstractNum>
-  <w:abstractNum w:abstractNumId="2" w15:restartNumberingAfterBreak="0">
+  <w:abstractNum w:abstractNumId="3" w15:restartNumberingAfterBreak="0">
     <w:nsid w:val="2557343A"/>
     <w:multiLevelType w:val="hybridMultilevel"/>
     <w:tmpl w:val="8A30FEE6"/>
@@ -6531,7 +9531,120 @@
       </w:rPr>
     </w:lvl>
   </w:abstractNum>
-  <w:abstractNum w:abstractNumId="3" w15:restartNumberingAfterBreak="0">
+  <w:abstractNum w:abstractNumId="4" w15:restartNumberingAfterBreak="0">
+    <w:nsid w:val="2E007351"/>
+    <w:multiLevelType w:val="hybridMultilevel"/>
+    <w:tmpl w:val="6F2EBE88"/>
+    <w:lvl w:ilvl="0" w:tplc="04090001">
+      <w:start w:val="1"/>
+      <w:numFmt w:val="bullet"/>
+      <w:lvlText w:val=""/>
+      <w:lvlJc w:val="left"/>
+      <w:pPr>
+        <w:ind w:left="720" w:hanging="360"/>
+      </w:pPr>
+      <w:rPr>
+        <w:rFonts w:ascii="Symbol" w:hAnsi="Symbol" w:hint="default"/>
+      </w:rPr>
+    </w:lvl>
+    <w:lvl w:ilvl="1" w:tplc="04090003" w:tentative="1">
+      <w:start w:val="1"/>
+      <w:numFmt w:val="bullet"/>
+      <w:lvlText w:val="o"/>
+      <w:lvlJc w:val="left"/>
+      <w:pPr>
+        <w:ind w:left="1440" w:hanging="360"/>
+      </w:pPr>
+      <w:rPr>
+        <w:rFonts w:ascii="Courier New" w:hAnsi="Courier New" w:cs="Courier New" w:hint="default"/>
+      </w:rPr>
+    </w:lvl>
+    <w:lvl w:ilvl="2" w:tplc="04090005" w:tentative="1">
+      <w:start w:val="1"/>
+      <w:numFmt w:val="bullet"/>
+      <w:lvlText w:val=""/>
+      <w:lvlJc w:val="left"/>
+      <w:pPr>
+        <w:ind w:left="2160" w:hanging="360"/>
+      </w:pPr>
+      <w:rPr>
+        <w:rFonts w:ascii="Wingdings" w:hAnsi="Wingdings" w:hint="default"/>
+      </w:rPr>
+    </w:lvl>
+    <w:lvl w:ilvl="3" w:tplc="04090001" w:tentative="1">
+      <w:start w:val="1"/>
+      <w:numFmt w:val="bullet"/>
+      <w:lvlText w:val=""/>
+      <w:lvlJc w:val="left"/>
+      <w:pPr>
+        <w:ind w:left="2880" w:hanging="360"/>
+      </w:pPr>
+      <w:rPr>
+        <w:rFonts w:ascii="Symbol" w:hAnsi="Symbol" w:hint="default"/>
+      </w:rPr>
+    </w:lvl>
+    <w:lvl w:ilvl="4" w:tplc="04090003" w:tentative="1">
+      <w:start w:val="1"/>
+      <w:numFmt w:val="bullet"/>
+      <w:lvlText w:val="o"/>
+      <w:lvlJc w:val="left"/>
+      <w:pPr>
+        <w:ind w:left="3600" w:hanging="360"/>
+      </w:pPr>
+      <w:rPr>
+        <w:rFonts w:ascii="Courier New" w:hAnsi="Courier New" w:cs="Courier New" w:hint="default"/>
+      </w:rPr>
+    </w:lvl>
+    <w:lvl w:ilvl="5" w:tplc="04090005" w:tentative="1">
+      <w:start w:val="1"/>
+      <w:numFmt w:val="bullet"/>
+      <w:lvlText w:val=""/>
+      <w:lvlJc w:val="left"/>
+      <w:pPr>
+        <w:ind w:left="4320" w:hanging="360"/>
+      </w:pPr>
+      <w:rPr>
+        <w:rFonts w:ascii="Wingdings" w:hAnsi="Wingdings" w:hint="default"/>
+      </w:rPr>
+    </w:lvl>
+    <w:lvl w:ilvl="6" w:tplc="04090001" w:tentative="1">
+      <w:start w:val="1"/>
+      <w:numFmt w:val="bullet"/>
+      <w:lvlText w:val=""/>
+      <w:lvlJc w:val="left"/>
+      <w:pPr>
+        <w:ind w:left="5040" w:hanging="360"/>
+      </w:pPr>
+      <w:rPr>
+        <w:rFonts w:ascii="Symbol" w:hAnsi="Symbol" w:hint="default"/>
+      </w:rPr>
+    </w:lvl>
+    <w:lvl w:ilvl="7" w:tplc="04090003" w:tentative="1">
+      <w:start w:val="1"/>
+      <w:numFmt w:val="bullet"/>
+      <w:lvlText w:val="o"/>
+      <w:lvlJc w:val="left"/>
+      <w:pPr>
+        <w:ind w:left="5760" w:hanging="360"/>
+      </w:pPr>
+      <w:rPr>
+        <w:rFonts w:ascii="Courier New" w:hAnsi="Courier New" w:cs="Courier New" w:hint="default"/>
+      </w:rPr>
+    </w:lvl>
+    <w:lvl w:ilvl="8" w:tplc="04090005" w:tentative="1">
+      <w:start w:val="1"/>
+      <w:numFmt w:val="bullet"/>
+      <w:lvlText w:val=""/>
+      <w:lvlJc w:val="left"/>
+      <w:pPr>
+        <w:ind w:left="6480" w:hanging="360"/>
+      </w:pPr>
+      <w:rPr>
+        <w:rFonts w:ascii="Wingdings" w:hAnsi="Wingdings" w:hint="default"/>
+      </w:rPr>
+    </w:lvl>
+  </w:abstractNum>
+  <w:abstractNum w:abstractNumId="5" w15:restartNumberingAfterBreak="0">
     <w:nsid w:val="2F592B5B"/>
     <w:multiLevelType w:val="hybridMultilevel"/>
     <w:tmpl w:val="FE62C13A"/>
@@ -6644,7 +9757,7 @@
       </w:rPr>
     </w:lvl>
   </w:abstractNum>
-  <w:abstractNum w:abstractNumId="4" w15:restartNumberingAfterBreak="0">
+  <w:abstractNum w:abstractNumId="6" w15:restartNumberingAfterBreak="0">
     <w:nsid w:val="352E72A6"/>
     <w:multiLevelType w:val="hybridMultilevel"/>
     <w:tmpl w:val="36608DA2"/>
@@ -6757,7 +9870,7 @@
       </w:rPr>
     </w:lvl>
   </w:abstractNum>
-  <w:abstractNum w:abstractNumId="5" w15:restartNumberingAfterBreak="0">
+  <w:abstractNum w:abstractNumId="7" w15:restartNumberingAfterBreak="0">
     <w:nsid w:val="3A64427A"/>
     <w:multiLevelType w:val="hybridMultilevel"/>
     <w:tmpl w:val="08061F78"/>
@@ -6870,7 +9983,7 @@
       </w:rPr>
     </w:lvl>
   </w:abstractNum>
-  <w:abstractNum w:abstractNumId="6" w15:restartNumberingAfterBreak="0">
+  <w:abstractNum w:abstractNumId="8" w15:restartNumberingAfterBreak="0">
     <w:nsid w:val="3CE6114A"/>
     <w:multiLevelType w:val="hybridMultilevel"/>
     <w:tmpl w:val="DAC8EAB2"/>
@@ -6983,7 +10096,7 @@
       </w:rPr>
     </w:lvl>
   </w:abstractNum>
-  <w:abstractNum w:abstractNumId="7" w15:restartNumberingAfterBreak="0">
+  <w:abstractNum w:abstractNumId="9" w15:restartNumberingAfterBreak="0">
     <w:nsid w:val="3EA15ED3"/>
     <w:multiLevelType w:val="hybridMultilevel"/>
     <w:tmpl w:val="32A66580"/>
@@ -7096,7 +10209,120 @@
       </w:rPr>
     </w:lvl>
   </w:abstractNum>
-  <w:abstractNum w:abstractNumId="8" w15:restartNumberingAfterBreak="0">
+  <w:abstractNum w:abstractNumId="10" w15:restartNumberingAfterBreak="0">
+    <w:nsid w:val="465D0ED0"/>
+    <w:multiLevelType w:val="hybridMultilevel"/>
+    <w:tmpl w:val="CA2CA59C"/>
+    <w:lvl w:ilvl="0" w:tplc="04090001">
+      <w:start w:val="1"/>
+      <w:numFmt w:val="bullet"/>
+      <w:lvlText w:val=""/>
+      <w:lvlJc w:val="left"/>
+      <w:pPr>
+        <w:ind w:left="360" w:hanging="360"/>
+      </w:pPr>
+      <w:rPr>
+        <w:rFonts w:ascii="Symbol" w:hAnsi="Symbol" w:hint="default"/>
+      </w:rPr>
+    </w:lvl>
+    <w:lvl w:ilvl="1" w:tplc="04090003" w:tentative="1">
+      <w:start w:val="1"/>
+      <w:numFmt w:val="bullet"/>
+      <w:lvlText w:val="o"/>
+      <w:lvlJc w:val="left"/>
+      <w:pPr>
+        <w:ind w:left="1080" w:hanging="360"/>
+      </w:pPr>
+      <w:rPr>
+        <w:rFonts w:ascii="Courier New" w:hAnsi="Courier New" w:cs="Courier New" w:hint="default"/>
+      </w:rPr>
+    </w:lvl>
+    <w:lvl w:ilvl="2" w:tplc="04090005" w:tentative="1">
+      <w:start w:val="1"/>
+      <w:numFmt w:val="bullet"/>
+      <w:lvlText w:val=""/>
+      <w:lvlJc w:val="left"/>
+      <w:pPr>
+        <w:ind w:left="1800" w:hanging="360"/>
+      </w:pPr>
+      <w:rPr>
+        <w:rFonts w:ascii="Wingdings" w:hAnsi="Wingdings" w:hint="default"/>
+      </w:rPr>
+    </w:lvl>
+    <w:lvl w:ilvl="3" w:tplc="04090001" w:tentative="1">
+      <w:start w:val="1"/>
+      <w:numFmt w:val="bullet"/>
+      <w:lvlText w:val=""/>
+      <w:lvlJc w:val="left"/>
+      <w:pPr>
+        <w:ind w:left="2520" w:hanging="360"/>
+      </w:pPr>
+      <w:rPr>
+        <w:rFonts w:ascii="Symbol" w:hAnsi="Symbol" w:hint="default"/>
+      </w:rPr>
+    </w:lvl>
+    <w:lvl w:ilvl="4" w:tplc="04090003" w:tentative="1">
+      <w:start w:val="1"/>
+      <w:numFmt w:val="bullet"/>
+      <w:lvlText w:val="o"/>
+      <w:lvlJc w:val="left"/>
+      <w:pPr>
+        <w:ind w:left="3240" w:hanging="360"/>
+      </w:pPr>
+      <w:rPr>
+        <w:rFonts w:ascii="Courier New" w:hAnsi="Courier New" w:cs="Courier New" w:hint="default"/>
+      </w:rPr>
+    </w:lvl>
+    <w:lvl w:ilvl="5" w:tplc="04090005" w:tentative="1">
+      <w:start w:val="1"/>
+      <w:numFmt w:val="bullet"/>
+      <w:lvlText w:val=""/>
+      <w:lvlJc w:val="left"/>
+      <w:pPr>
+        <w:ind w:left="3960" w:hanging="360"/>
+      </w:pPr>
+      <w:rPr>
+        <w:rFonts w:ascii="Wingdings" w:hAnsi="Wingdings" w:hint="default"/>
+      </w:rPr>
+    </w:lvl>
+    <w:lvl w:ilvl="6" w:tplc="04090001" w:tentative="1">
+      <w:start w:val="1"/>
+      <w:numFmt w:val="bullet"/>
+      <w:lvlText w:val=""/>
+      <w:lvlJc w:val="left"/>
+      <w:pPr>
+        <w:ind w:left="4680" w:hanging="360"/>
+      </w:pPr>
+      <w:rPr>
+        <w:rFonts w:ascii="Symbol" w:hAnsi="Symbol" w:hint="default"/>
+      </w:rPr>
+    </w:lvl>
+    <w:lvl w:ilvl="7" w:tplc="04090003" w:tentative="1">
+      <w:start w:val="1"/>
+      <w:numFmt w:val="bullet"/>
+      <w:lvlText w:val="o"/>
+      <w:lvlJc w:val="left"/>
+      <w:pPr>
+        <w:ind w:left="5400" w:hanging="360"/>
+      </w:pPr>
+      <w:rPr>
+        <w:rFonts w:ascii="Courier New" w:hAnsi="Courier New" w:cs="Courier New" w:hint="default"/>
+      </w:rPr>
+    </w:lvl>
+    <w:lvl w:ilvl="8" w:tplc="04090005" w:tentative="1">
+      <w:start w:val="1"/>
+      <w:numFmt w:val="bullet"/>
+      <w:lvlText w:val=""/>
+      <w:lvlJc w:val="left"/>
+      <w:pPr>
+        <w:ind w:left="6120" w:hanging="360"/>
+      </w:pPr>
+      <w:rPr>
+        <w:rFonts w:ascii="Wingdings" w:hAnsi="Wingdings" w:hint="default"/>
+      </w:rPr>
+    </w:lvl>
+  </w:abstractNum>
+  <w:abstractNum w:abstractNumId="11" w15:restartNumberingAfterBreak="0">
     <w:nsid w:val="48BC2A2E"/>
     <w:multiLevelType w:val="hybridMultilevel"/>
     <w:tmpl w:val="262A606E"/>
@@ -7187,7 +10413,7 @@
       </w:pPr>
     </w:lvl>
   </w:abstractNum>
-  <w:abstractNum w:abstractNumId="9" w15:restartNumberingAfterBreak="0">
+  <w:abstractNum w:abstractNumId="12" w15:restartNumberingAfterBreak="0">
     <w:nsid w:val="49767D6F"/>
     <w:multiLevelType w:val="hybridMultilevel"/>
     <w:tmpl w:val="4218F1BC"/>
@@ -7278,7 +10504,7 @@
       </w:pPr>
     </w:lvl>
   </w:abstractNum>
-  <w:abstractNum w:abstractNumId="10" w15:restartNumberingAfterBreak="0">
+  <w:abstractNum w:abstractNumId="13" w15:restartNumberingAfterBreak="0">
     <w:nsid w:val="4A3641F2"/>
     <w:multiLevelType w:val="hybridMultilevel"/>
     <w:tmpl w:val="55A4C6E8"/>
@@ -7391,7 +10617,120 @@
       </w:rPr>
     </w:lvl>
   </w:abstractNum>
-  <w:abstractNum w:abstractNumId="11" w15:restartNumberingAfterBreak="0">
+  <w:abstractNum w:abstractNumId="14" w15:restartNumberingAfterBreak="0">
+    <w:nsid w:val="51D943C0"/>
+    <w:multiLevelType w:val="hybridMultilevel"/>
+    <w:tmpl w:val="AACCBFFC"/>
+    <w:lvl w:ilvl="0" w:tplc="04090001">
+      <w:start w:val="1"/>
+      <w:numFmt w:val="bullet"/>
+      <w:lvlText w:val=""/>
+      <w:lvlJc w:val="left"/>
+      <w:pPr>
+        <w:ind w:left="360" w:hanging="360"/>
+      </w:pPr>
+      <w:rPr>
+        <w:rFonts w:ascii="Symbol" w:hAnsi="Symbol" w:hint="default"/>
+      </w:rPr>
+    </w:lvl>
+    <w:lvl w:ilvl="1" w:tplc="04090003" w:tentative="1">
+      <w:start w:val="1"/>
+      <w:numFmt w:val="bullet"/>
+      <w:lvlText w:val="o"/>
+      <w:lvlJc w:val="left"/>
+      <w:pPr>
+        <w:ind w:left="1080" w:hanging="360"/>
+      </w:pPr>
+      <w:rPr>
+        <w:rFonts w:ascii="Courier New" w:hAnsi="Courier New" w:cs="Courier New" w:hint="default"/>
+      </w:rPr>
+    </w:lvl>
+    <w:lvl w:ilvl="2" w:tplc="04090005" w:tentative="1">
+      <w:start w:val="1"/>
+      <w:numFmt w:val="bullet"/>
+      <w:lvlText w:val=""/>
+      <w:lvlJc w:val="left"/>
+      <w:pPr>
+        <w:ind w:left="1800" w:hanging="360"/>
+      </w:pPr>
+      <w:rPr>
+        <w:rFonts w:ascii="Wingdings" w:hAnsi="Wingdings" w:hint="default"/>
+      </w:rPr>
+    </w:lvl>
+    <w:lvl w:ilvl="3" w:tplc="04090001" w:tentative="1">
+      <w:start w:val="1"/>
+      <w:numFmt w:val="bullet"/>
+      <w:lvlText w:val=""/>
+      <w:lvlJc w:val="left"/>
+      <w:pPr>
+        <w:ind w:left="2520" w:hanging="360"/>
+      </w:pPr>
+      <w:rPr>
+        <w:rFonts w:ascii="Symbol" w:hAnsi="Symbol" w:hint="default"/>
+      </w:rPr>
+    </w:lvl>
+    <w:lvl w:ilvl="4" w:tplc="04090003" w:tentative="1">
+      <w:start w:val="1"/>
+      <w:numFmt w:val="bullet"/>
+      <w:lvlText w:val="o"/>
+      <w:lvlJc w:val="left"/>
+      <w:pPr>
+        <w:ind w:left="3240" w:hanging="360"/>
+      </w:pPr>
+      <w:rPr>
+        <w:rFonts w:ascii="Courier New" w:hAnsi="Courier New" w:cs="Courier New" w:hint="default"/>
+      </w:rPr>
+    </w:lvl>
+    <w:lvl w:ilvl="5" w:tplc="04090005" w:tentative="1">
+      <w:start w:val="1"/>
+      <w:numFmt w:val="bullet"/>
+      <w:lvlText w:val=""/>
+      <w:lvlJc w:val="left"/>
+      <w:pPr>
+        <w:ind w:left="3960" w:hanging="360"/>
+      </w:pPr>
+      <w:rPr>
+        <w:rFonts w:ascii="Wingdings" w:hAnsi="Wingdings" w:hint="default"/>
+      </w:rPr>
+    </w:lvl>
+    <w:lvl w:ilvl="6" w:tplc="04090001" w:tentative="1">
+      <w:start w:val="1"/>
+      <w:numFmt w:val="bullet"/>
+      <w:lvlText w:val=""/>
+      <w:lvlJc w:val="left"/>
+      <w:pPr>
+        <w:ind w:left="4680" w:hanging="360"/>
+      </w:pPr>
+      <w:rPr>
+        <w:rFonts w:ascii="Symbol" w:hAnsi="Symbol" w:hint="default"/>
+      </w:rPr>
+    </w:lvl>
+    <w:lvl w:ilvl="7" w:tplc="04090003" w:tentative="1">
+      <w:start w:val="1"/>
+      <w:numFmt w:val="bullet"/>
+      <w:lvlText w:val="o"/>
+      <w:lvlJc w:val="left"/>
+      <w:pPr>
+        <w:ind w:left="5400" w:hanging="360"/>
+      </w:pPr>
+      <w:rPr>
+        <w:rFonts w:ascii="Courier New" w:hAnsi="Courier New" w:cs="Courier New" w:hint="default"/>
+      </w:rPr>
+    </w:lvl>
+    <w:lvl w:ilvl="8" w:tplc="04090005" w:tentative="1">
+      <w:start w:val="1"/>
+      <w:numFmt w:val="bullet"/>
+      <w:lvlText w:val=""/>
+      <w:lvlJc w:val="left"/>
+      <w:pPr>
+        <w:ind w:left="6120" w:hanging="360"/>
+      </w:pPr>
+      <w:rPr>
+        <w:rFonts w:ascii="Wingdings" w:hAnsi="Wingdings" w:hint="default"/>
+      </w:rPr>
+    </w:lvl>
+  </w:abstractNum>
+  <w:abstractNum w:abstractNumId="15" w15:restartNumberingAfterBreak="0">
     <w:nsid w:val="566B2156"/>
     <w:multiLevelType w:val="hybridMultilevel"/>
     <w:tmpl w:val="49A48358"/>
@@ -7504,7 +10843,7 @@
       </w:rPr>
     </w:lvl>
   </w:abstractNum>
-  <w:abstractNum w:abstractNumId="12" w15:restartNumberingAfterBreak="0">
+  <w:abstractNum w:abstractNumId="16" w15:restartNumberingAfterBreak="0">
     <w:nsid w:val="6574689A"/>
     <w:multiLevelType w:val="hybridMultilevel"/>
     <w:tmpl w:val="3040723C"/>
@@ -7617,7 +10956,437 @@
       </w:rPr>
     </w:lvl>
   </w:abstractNum>
-  <w:abstractNum w:abstractNumId="13" w15:restartNumberingAfterBreak="0">
+  <w:abstractNum w:abstractNumId="17" w15:restartNumberingAfterBreak="0">
+    <w:nsid w:val="684E54B5"/>
+    <w:multiLevelType w:val="hybridMultilevel"/>
+    <w:tmpl w:val="E238318E"/>
+    <w:lvl w:ilvl="0" w:tplc="04090001">
+      <w:start w:val="1"/>
+      <w:numFmt w:val="bullet"/>
+      <w:lvlText w:val=""/>
+      <w:lvlJc w:val="left"/>
+      <w:pPr>
+        <w:ind w:left="360" w:hanging="360"/>
+      </w:pPr>
+      <w:rPr>
+        <w:rFonts w:ascii="Symbol" w:hAnsi="Symbol" w:hint="default"/>
+      </w:rPr>
+    </w:lvl>
+    <w:lvl w:ilvl="1" w:tplc="04090003" w:tentative="1">
+      <w:start w:val="1"/>
+      <w:numFmt w:val="bullet"/>
+      <w:lvlText w:val="o"/>
+      <w:lvlJc w:val="left"/>
+      <w:pPr>
+        <w:ind w:left="1080" w:hanging="360"/>
+      </w:pPr>
+      <w:rPr>
+        <w:rFonts w:ascii="Courier New" w:hAnsi="Courier New" w:cs="Courier New" w:hint="default"/>
+      </w:rPr>
+    </w:lvl>
+    <w:lvl w:ilvl="2" w:tplc="04090005" w:tentative="1">
+      <w:start w:val="1"/>
+      <w:numFmt w:val="bullet"/>
+      <w:lvlText w:val=""/>
+      <w:lvlJc w:val="left"/>
+      <w:pPr>
+        <w:ind w:left="1800" w:hanging="360"/>
+      </w:pPr>
+      <w:rPr>
+        <w:rFonts w:ascii="Wingdings" w:hAnsi="Wingdings" w:hint="default"/>
+      </w:rPr>
+    </w:lvl>
+    <w:lvl w:ilvl="3" w:tplc="04090001" w:tentative="1">
+      <w:start w:val="1"/>
+      <w:numFmt w:val="bullet"/>
+      <w:lvlText w:val=""/>
+      <w:lvlJc w:val="left"/>
+      <w:pPr>
+        <w:ind w:left="2520" w:hanging="360"/>
+      </w:pPr>
+      <w:rPr>
+        <w:rFonts w:ascii="Symbol" w:hAnsi="Symbol" w:hint="default"/>
+      </w:rPr>
+    </w:lvl>
+    <w:lvl w:ilvl="4" w:tplc="04090003" w:tentative="1">
+      <w:start w:val="1"/>
+      <w:numFmt w:val="bullet"/>
+      <w:lvlText w:val="o"/>
+      <w:lvlJc w:val="left"/>
+      <w:pPr>
+        <w:ind w:left="3240" w:hanging="360"/>
+      </w:pPr>
+      <w:rPr>
+        <w:rFonts w:ascii="Courier New" w:hAnsi="Courier New" w:cs="Courier New" w:hint="default"/>
+      </w:rPr>
+    </w:lvl>
+    <w:lvl w:ilvl="5" w:tplc="04090005" w:tentative="1">
+      <w:start w:val="1"/>
+      <w:numFmt w:val="bullet"/>
+      <w:lvlText w:val=""/>
+      <w:lvlJc w:val="left"/>
+      <w:pPr>
+        <w:ind w:left="3960" w:hanging="360"/>
+      </w:pPr>
+      <w:rPr>
+        <w:rFonts w:ascii="Wingdings" w:hAnsi="Wingdings" w:hint="default"/>
+      </w:rPr>
+    </w:lvl>
+    <w:lvl w:ilvl="6" w:tplc="04090001" w:tentative="1">
+      <w:start w:val="1"/>
+      <w:numFmt w:val="bullet"/>
+      <w:lvlText w:val=""/>
+      <w:lvlJc w:val="left"/>
+      <w:pPr>
+        <w:ind w:left="4680" w:hanging="360"/>
+      </w:pPr>
+      <w:rPr>
+        <w:rFonts w:ascii="Symbol" w:hAnsi="Symbol" w:hint="default"/>
+      </w:rPr>
+    </w:lvl>
+    <w:lvl w:ilvl="7" w:tplc="04090003" w:tentative="1">
+      <w:start w:val="1"/>
+      <w:numFmt w:val="bullet"/>
+      <w:lvlText w:val="o"/>
+      <w:lvlJc w:val="left"/>
+      <w:pPr>
+        <w:ind w:left="5400" w:hanging="360"/>
+      </w:pPr>
+      <w:rPr>
+        <w:rFonts w:ascii="Courier New" w:hAnsi="Courier New" w:cs="Courier New" w:hint="default"/>
+      </w:rPr>
+    </w:lvl>
+    <w:lvl w:ilvl="8" w:tplc="04090005" w:tentative="1">
+      <w:start w:val="1"/>
+      <w:numFmt w:val="bullet"/>
+      <w:lvlText w:val=""/>
+      <w:lvlJc w:val="left"/>
+      <w:pPr>
+        <w:ind w:left="6120" w:hanging="360"/>
+      </w:pPr>
+      <w:rPr>
+        <w:rFonts w:ascii="Wingdings" w:hAnsi="Wingdings" w:hint="default"/>
+      </w:rPr>
+    </w:lvl>
+  </w:abstractNum>
+  <w:abstractNum w:abstractNumId="18" w15:restartNumberingAfterBreak="0">
+    <w:nsid w:val="68F2565C"/>
+    <w:multiLevelType w:val="hybridMultilevel"/>
+    <w:tmpl w:val="8D324286"/>
+    <w:lvl w:ilvl="0" w:tplc="04090001">
+      <w:start w:val="1"/>
+      <w:numFmt w:val="bullet"/>
+      <w:lvlText w:val=""/>
+      <w:lvlJc w:val="left"/>
+      <w:pPr>
+        <w:ind w:left="720" w:hanging="360"/>
+      </w:pPr>
+      <w:rPr>
+        <w:rFonts w:ascii="Symbol" w:hAnsi="Symbol" w:hint="default"/>
+      </w:rPr>
+    </w:lvl>
+    <w:lvl w:ilvl="1" w:tplc="04090003" w:tentative="1">
+      <w:start w:val="1"/>
+      <w:numFmt w:val="bullet"/>
+      <w:lvlText w:val="o"/>
+      <w:lvlJc w:val="left"/>
+      <w:pPr>
+        <w:ind w:left="1440" w:hanging="360"/>
+      </w:pPr>
+      <w:rPr>
+        <w:rFonts w:ascii="Courier New" w:hAnsi="Courier New" w:cs="Courier New" w:hint="default"/>
+      </w:rPr>
+    </w:lvl>
+    <w:lvl w:ilvl="2" w:tplc="04090005" w:tentative="1">
+      <w:start w:val="1"/>
+      <w:numFmt w:val="bullet"/>
+      <w:lvlText w:val=""/>
+      <w:lvlJc w:val="left"/>
+      <w:pPr>
+        <w:ind w:left="2160" w:hanging="360"/>
+      </w:pPr>
+      <w:rPr>
+        <w:rFonts w:ascii="Wingdings" w:hAnsi="Wingdings" w:hint="default"/>
+      </w:rPr>
+    </w:lvl>
+    <w:lvl w:ilvl="3" w:tplc="04090001" w:tentative="1">
+      <w:start w:val="1"/>
+      <w:numFmt w:val="bullet"/>
+      <w:lvlText w:val=""/>
+      <w:lvlJc w:val="left"/>
+      <w:pPr>
+        <w:ind w:left="2880" w:hanging="360"/>
+      </w:pPr>
+      <w:rPr>
+        <w:rFonts w:ascii="Symbol" w:hAnsi="Symbol" w:hint="default"/>
+      </w:rPr>
+    </w:lvl>
+    <w:lvl w:ilvl="4" w:tplc="04090003" w:tentative="1">
+      <w:start w:val="1"/>
+      <w:numFmt w:val="bullet"/>
+      <w:lvlText w:val="o"/>
+      <w:lvlJc w:val="left"/>
+      <w:pPr>
+        <w:ind w:left="3600" w:hanging="360"/>
+      </w:pPr>
+      <w:rPr>
+        <w:rFonts w:ascii="Courier New" w:hAnsi="Courier New" w:cs="Courier New" w:hint="default"/>
+      </w:rPr>
+    </w:lvl>
+    <w:lvl w:ilvl="5" w:tplc="04090005" w:tentative="1">
+      <w:start w:val="1"/>
+      <w:numFmt w:val="bullet"/>
+      <w:lvlText w:val=""/>
+      <w:lvlJc w:val="left"/>
+      <w:pPr>
+        <w:ind w:left="4320" w:hanging="360"/>
+      </w:pPr>
+      <w:rPr>
+        <w:rFonts w:ascii="Wingdings" w:hAnsi="Wingdings" w:hint="default"/>
+      </w:rPr>
+    </w:lvl>
+    <w:lvl w:ilvl="6" w:tplc="04090001" w:tentative="1">
+      <w:start w:val="1"/>
+      <w:numFmt w:val="bullet"/>
+      <w:lvlText w:val=""/>
+      <w:lvlJc w:val="left"/>
+      <w:pPr>
+        <w:ind w:left="5040" w:hanging="360"/>
+      </w:pPr>
+      <w:rPr>
+        <w:rFonts w:ascii="Symbol" w:hAnsi="Symbol" w:hint="default"/>
+      </w:rPr>
+    </w:lvl>
+    <w:lvl w:ilvl="7" w:tplc="04090003" w:tentative="1">
+      <w:start w:val="1"/>
+      <w:numFmt w:val="bullet"/>
+      <w:lvlText w:val="o"/>
+      <w:lvlJc w:val="left"/>
+      <w:pPr>
+        <w:ind w:left="5760" w:hanging="360"/>
+      </w:pPr>
+      <w:rPr>
+        <w:rFonts w:ascii="Courier New" w:hAnsi="Courier New" w:cs="Courier New" w:hint="default"/>
+      </w:rPr>
+    </w:lvl>
+    <w:lvl w:ilvl="8" w:tplc="04090005" w:tentative="1">
+      <w:start w:val="1"/>
+      <w:numFmt w:val="bullet"/>
+      <w:lvlText w:val=""/>
+      <w:lvlJc w:val="left"/>
+      <w:pPr>
+        <w:ind w:left="6480" w:hanging="360"/>
+      </w:pPr>
+      <w:rPr>
+        <w:rFonts w:ascii="Wingdings" w:hAnsi="Wingdings" w:hint="default"/>
+      </w:rPr>
+    </w:lvl>
+  </w:abstractNum>
+  <w:abstractNum w:abstractNumId="19" w15:restartNumberingAfterBreak="0">
+    <w:nsid w:val="6F9908ED"/>
+    <w:multiLevelType w:val="hybridMultilevel"/>
+    <w:tmpl w:val="19A64D52"/>
+    <w:lvl w:ilvl="0" w:tplc="04090001">
+      <w:start w:val="1"/>
+      <w:numFmt w:val="bullet"/>
+      <w:lvlText w:val=""/>
+      <w:lvlJc w:val="left"/>
+      <w:pPr>
+        <w:ind w:left="360" w:hanging="360"/>
+      </w:pPr>
+      <w:rPr>
+        <w:rFonts w:ascii="Symbol" w:hAnsi="Symbol" w:hint="default"/>
+      </w:rPr>
+    </w:lvl>
+    <w:lvl w:ilvl="1" w:tplc="04090003" w:tentative="1">
+      <w:start w:val="1"/>
+      <w:numFmt w:val="bullet"/>
+      <w:lvlText w:val="o"/>
+      <w:lvlJc w:val="left"/>
+      <w:pPr>
+        <w:ind w:left="1080" w:hanging="360"/>
+      </w:pPr>
+      <w:rPr>
+        <w:rFonts w:ascii="Courier New" w:hAnsi="Courier New" w:cs="Courier New" w:hint="default"/>
+      </w:rPr>
+    </w:lvl>
+    <w:lvl w:ilvl="2" w:tplc="04090005" w:tentative="1">
+      <w:start w:val="1"/>
+      <w:numFmt w:val="bullet"/>
+      <w:lvlText w:val=""/>
+      <w:lvlJc w:val="left"/>
+      <w:pPr>
+        <w:ind w:left="1800" w:hanging="360"/>
+      </w:pPr>
+      <w:rPr>
+        <w:rFonts w:ascii="Wingdings" w:hAnsi="Wingdings" w:hint="default"/>
+      </w:rPr>
+    </w:lvl>
+    <w:lvl w:ilvl="3" w:tplc="04090001" w:tentative="1">
+      <w:start w:val="1"/>
+      <w:numFmt w:val="bullet"/>
+      <w:lvlText w:val=""/>
+      <w:lvlJc w:val="left"/>
+      <w:pPr>
+        <w:ind w:left="2520" w:hanging="360"/>
+      </w:pPr>
+      <w:rPr>
+        <w:rFonts w:ascii="Symbol" w:hAnsi="Symbol" w:hint="default"/>
+      </w:rPr>
+    </w:lvl>
+    <w:lvl w:ilvl="4" w:tplc="04090003" w:tentative="1">
+      <w:start w:val="1"/>
+      <w:numFmt w:val="bullet"/>
+      <w:lvlText w:val="o"/>
+      <w:lvlJc w:val="left"/>
+      <w:pPr>
+        <w:ind w:left="3240" w:hanging="360"/>
+      </w:pPr>
+      <w:rPr>
+        <w:rFonts w:ascii="Courier New" w:hAnsi="Courier New" w:cs="Courier New" w:hint="default"/>
+      </w:rPr>
+    </w:lvl>
+    <w:lvl w:ilvl="5" w:tplc="04090005" w:tentative="1">
+      <w:start w:val="1"/>
+      <w:numFmt w:val="bullet"/>
+      <w:lvlText w:val=""/>
+      <w:lvlJc w:val="left"/>
+      <w:pPr>
+        <w:ind w:left="3960" w:hanging="360"/>
+      </w:pPr>
+      <w:rPr>
+        <w:rFonts w:ascii="Wingdings" w:hAnsi="Wingdings" w:hint="default"/>
+      </w:rPr>
+    </w:lvl>
+    <w:lvl w:ilvl="6" w:tplc="04090001" w:tentative="1">
+      <w:start w:val="1"/>
+      <w:numFmt w:val="bullet"/>
+      <w:lvlText w:val=""/>
+      <w:lvlJc w:val="left"/>
+      <w:pPr>
+        <w:ind w:left="4680" w:hanging="360"/>
+      </w:pPr>
+      <w:rPr>
+        <w:rFonts w:ascii="Symbol" w:hAnsi="Symbol" w:hint="default"/>
+      </w:rPr>
+    </w:lvl>
+    <w:lvl w:ilvl="7" w:tplc="04090003" w:tentative="1">
+      <w:start w:val="1"/>
+      <w:numFmt w:val="bullet"/>
+      <w:lvlText w:val="o"/>
+      <w:lvlJc w:val="left"/>
+      <w:pPr>
+        <w:ind w:left="5400" w:hanging="360"/>
+      </w:pPr>
+      <w:rPr>
+        <w:rFonts w:ascii="Courier New" w:hAnsi="Courier New" w:cs="Courier New" w:hint="default"/>
+      </w:rPr>
+    </w:lvl>
+    <w:lvl w:ilvl="8" w:tplc="04090005" w:tentative="1">
+      <w:start w:val="1"/>
+      <w:numFmt w:val="bullet"/>
+      <w:lvlText w:val=""/>
+      <w:lvlJc w:val="left"/>
+      <w:pPr>
+        <w:ind w:left="6120" w:hanging="360"/>
+      </w:pPr>
+      <w:rPr>
+        <w:rFonts w:ascii="Wingdings" w:hAnsi="Wingdings" w:hint="default"/>
+      </w:rPr>
+    </w:lvl>
+  </w:abstractNum>
+  <w:abstractNum w:abstractNumId="20" w15:restartNumberingAfterBreak="0">
+    <w:nsid w:val="73EF6507"/>
+    <w:multiLevelType w:val="hybridMultilevel"/>
+    <w:tmpl w:val="CB3EB4AA"/>
+    <w:lvl w:ilvl="0" w:tplc="53C4DC16">
+      <w:start w:val="1"/>
+      <w:numFmt w:val="decimal"/>
+      <w:lvlText w:val="%1."/>
+      <w:lvlJc w:val="left"/>
+      <w:pPr>
+        <w:ind w:left="360" w:hanging="360"/>
+      </w:pPr>
+      <w:rPr>
+        <w:rFonts w:hint="default"/>
+        <w:b w:val="0"/>
+        <w:bCs w:val="0"/>
+      </w:rPr>
+    </w:lvl>
+    <w:lvl w:ilvl="1" w:tplc="04090019" w:tentative="1">
+      <w:start w:val="1"/>
+      <w:numFmt w:val="lowerLetter"/>
+      <w:lvlText w:val="%2."/>
+      <w:lvlJc w:val="left"/>
+      <w:pPr>
+        <w:ind w:left="1080" w:hanging="360"/>
+      </w:pPr>
+    </w:lvl>
+    <w:lvl w:ilvl="2" w:tplc="0409001B" w:tentative="1">
+      <w:start w:val="1"/>
+      <w:numFmt w:val="lowerRoman"/>
+      <w:lvlText w:val="%3."/>
+      <w:lvlJc w:val="right"/>
+      <w:pPr>
+        <w:ind w:left="1800" w:hanging="180"/>
+      </w:pPr>
+    </w:lvl>
+    <w:lvl w:ilvl="3" w:tplc="0409000F" w:tentative="1">
+      <w:start w:val="1"/>
+      <w:numFmt w:val="decimal"/>
+      <w:lvlText w:val="%4."/>
+      <w:lvlJc w:val="left"/>
+      <w:pPr>
+        <w:ind w:left="2520" w:hanging="360"/>
+      </w:pPr>
+    </w:lvl>
+    <w:lvl w:ilvl="4" w:tplc="04090019" w:tentative="1">
+      <w:start w:val="1"/>
+      <w:numFmt w:val="lowerLetter"/>
+      <w:lvlText w:val="%5."/>
+      <w:lvlJc w:val="left"/>
+      <w:pPr>
+        <w:ind w:left="3240" w:hanging="360"/>
+      </w:pPr>
+    </w:lvl>
+    <w:lvl w:ilvl="5" w:tplc="0409001B" w:tentative="1">
+      <w:start w:val="1"/>
+      <w:numFmt w:val="lowerRoman"/>
+      <w:lvlText w:val="%6."/>
+      <w:lvlJc w:val="right"/>
+      <w:pPr>
+        <w:ind w:left="3960" w:hanging="180"/>
+      </w:pPr>
+    </w:lvl>
+    <w:lvl w:ilvl="6" w:tplc="0409000F" w:tentative="1">
+      <w:start w:val="1"/>
+      <w:numFmt w:val="decimal"/>
+      <w:lvlText w:val="%7."/>
+      <w:lvlJc w:val="left"/>
+      <w:pPr>
+        <w:ind w:left="4680" w:hanging="360"/>
+      </w:pPr>
+    </w:lvl>
+    <w:lvl w:ilvl="7" w:tplc="04090019" w:tentative="1">
+      <w:start w:val="1"/>
+      <w:numFmt w:val="lowerLetter"/>
+      <w:lvlText w:val="%8."/>
+      <w:lvlJc w:val="left"/>
+      <w:pPr>
+        <w:ind w:left="5400" w:hanging="360"/>
+      </w:pPr>
+    </w:lvl>
+    <w:lvl w:ilvl="8" w:tplc="0409001B" w:tentative="1">
+      <w:start w:val="1"/>
+      <w:numFmt w:val="lowerRoman"/>
+      <w:lvlText w:val="%9."/>
+      <w:lvlJc w:val="right"/>
+      <w:pPr>
+        <w:ind w:left="6120" w:hanging="180"/>
+      </w:pPr>
+    </w:lvl>
+  </w:abstractNum>
+  <w:abstractNum w:abstractNumId="21" w15:restartNumberingAfterBreak="0">
     <w:nsid w:val="77931365"/>
     <w:multiLevelType w:val="hybridMultilevel"/>
     <w:tmpl w:val="5C26A464"/>
@@ -7731,46 +11500,70 @@
     </w:lvl>
   </w:abstractNum>
   <w:num w:numId="1" w16cid:durableId="664865304">
+    <w:abstractNumId w:val="16"/>
+  </w:num>
+  <w:num w:numId="2" w16cid:durableId="2008902027">
+    <w:abstractNumId w:val="6"/>
+  </w:num>
+  <w:num w:numId="3" w16cid:durableId="704447734">
+    <w:abstractNumId w:val="21"/>
+  </w:num>
+  <w:num w:numId="4" w16cid:durableId="1510021272">
+    <w:abstractNumId w:val="5"/>
+  </w:num>
+  <w:num w:numId="5" w16cid:durableId="359281728">
+    <w:abstractNumId w:val="11"/>
+  </w:num>
+  <w:num w:numId="6" w16cid:durableId="259992389">
+    <w:abstractNumId w:val="8"/>
+  </w:num>
+  <w:num w:numId="7" w16cid:durableId="202402556">
+    <w:abstractNumId w:val="3"/>
+  </w:num>
+  <w:num w:numId="8" w16cid:durableId="879320700">
+    <w:abstractNumId w:val="1"/>
+  </w:num>
+  <w:num w:numId="9" w16cid:durableId="1021131634">
+    <w:abstractNumId w:val="15"/>
+  </w:num>
+  <w:num w:numId="10" w16cid:durableId="1837186236">
+    <w:abstractNumId w:val="13"/>
+  </w:num>
+  <w:num w:numId="11" w16cid:durableId="480124734">
     <w:abstractNumId w:val="12"/>
   </w:num>
-  <w:num w:numId="2" w16cid:durableId="2008902027">
+  <w:num w:numId="12" w16cid:durableId="1120107619">
+    <w:abstractNumId w:val="9"/>
+  </w:num>
+  <w:num w:numId="13" w16cid:durableId="2129663888">
+    <w:abstractNumId w:val="2"/>
+  </w:num>
+  <w:num w:numId="14" w16cid:durableId="1609662036">
+    <w:abstractNumId w:val="7"/>
+  </w:num>
+  <w:num w:numId="15" w16cid:durableId="473985100">
+    <w:abstractNumId w:val="20"/>
+  </w:num>
+  <w:num w:numId="16" w16cid:durableId="619263971">
     <w:abstractNumId w:val="4"/>
   </w:num>
-  <w:num w:numId="3" w16cid:durableId="704447734">
-    <w:abstractNumId w:val="13"/>
+  <w:num w:numId="17" w16cid:durableId="1712536812">
+    <w:abstractNumId w:val="18"/>
   </w:num>
-  <w:num w:numId="4" w16cid:durableId="1510021272">
-    <w:abstractNumId w:val="3"/>
+  <w:num w:numId="18" w16cid:durableId="553348773">
+    <w:abstractNumId w:val="19"/>
   </w:num>
-  <w:num w:numId="5" w16cid:durableId="359281728">
-    <w:abstractNumId w:val="8"/>
+  <w:num w:numId="19" w16cid:durableId="616566803">
+    <w:abstractNumId w:val="17"/>
   </w:num>
-  <w:num w:numId="6" w16cid:durableId="259992389">
-    <w:abstractNumId w:val="6"/>
-  </w:num>
-  <w:num w:numId="7" w16cid:durableId="202402556">
-    <w:abstractNumId w:val="2"/>
-  </w:num>
-  <w:num w:numId="8" w16cid:durableId="879320700">
+  <w:num w:numId="20" w16cid:durableId="1195458330">
     <w:abstractNumId w:val="0"/>
   </w:num>
-  <w:num w:numId="9" w16cid:durableId="1021131634">
-    <w:abstractNumId w:val="11"/>
-  </w:num>
-  <w:num w:numId="10" w16cid:durableId="1837186236">
+  <w:num w:numId="21" w16cid:durableId="979728643">
     <w:abstractNumId w:val="10"/>
   </w:num>
-  <w:num w:numId="11" w16cid:durableId="480124734">
-    <w:abstractNumId w:val="9"/>
-  </w:num>
-  <w:num w:numId="12" w16cid:durableId="1120107619">
-    <w:abstractNumId w:val="7"/>
-  </w:num>
-  <w:num w:numId="13" w16cid:durableId="2129663888">
-    <w:abstractNumId w:val="1"/>
-  </w:num>
-  <w:num w:numId="14" w16cid:durableId="1609662036">
-    <w:abstractNumId w:val="5"/>
+  <w:num w:numId="22" w16cid:durableId="1781026175">
+    <w:abstractNumId w:val="14"/>
   </w:num>
 </w:numbering>
 </file>
@@ -8378,7 +12171,6 @@
   <w:style w:type="character" w:default="1" w:styleId="DefaultParagraphFont">
     <w:name w:val="Default Paragraph Font"/>
     <w:uiPriority w:val="1"/>
-    <w:semiHidden/>
     <w:unhideWhenUsed/>
   </w:style>
   <w:style w:type="table" w:default="1" w:styleId="TableNormal">
@@ -8755,6 +12547,29 @@
     <w:uiPriority w:val="99"/>
     <w:rsid w:val="0036254A"/>
   </w:style>
+  <w:style w:type="character" w:styleId="Hyperlink">
+    <w:name w:val="Hyperlink"/>
+    <w:basedOn w:val="DefaultParagraphFont"/>
+    <w:uiPriority w:val="99"/>
+    <w:unhideWhenUsed/>
+    <w:rsid w:val="004B2B72"/>
+    <w:rPr>
+      <w:color w:val="467886" w:themeColor="hyperlink"/>
+      <w:u w:val="single"/>
+    </w:rPr>
+  </w:style>
+  <w:style w:type="character" w:styleId="UnresolvedMention">
+    <w:name w:val="Unresolved Mention"/>
+    <w:basedOn w:val="DefaultParagraphFont"/>
+    <w:uiPriority w:val="99"/>
+    <w:semiHidden/>
+    <w:unhideWhenUsed/>
+    <w:rsid w:val="004B2B72"/>
+    <w:rPr>
+      <w:color w:val="605E5C"/>
+      <w:shd w:val="clear" w:color="auto" w:fill="E1DFDD"/>
+    </w:rPr>
+  </w:style>
 </w:styles>
 </file>
 

</xml_diff>

<commit_message>
Just udpated JSON schema so it can be used for JSON validation in the backend
</commit_message>
<xml_diff>
--- a/programming_mental_models/p1_programming_mental_models.docx
+++ b/programming_mental_models/p1_programming_mental_models.docx
@@ -17754,27 +17754,7 @@
           <w:sz w:val="32"/>
           <w:szCs w:val="32"/>
         </w:rPr>
-        <w:t xml:space="preserve">    </w:t>
-      </w:r>
-      <w:r>
-        <w:rPr>
-          <w:rFonts w:ascii="Calibri" w:hAnsi="Calibri" w:cs="Calibri"/>
-          <w:b/>
-          <w:bCs/>
-          <w:sz w:val="32"/>
-          <w:szCs w:val="32"/>
-        </w:rPr>
-        <w:t>i</w:t>
-      </w:r>
-      <w:r>
-        <w:rPr>
-          <w:rFonts w:ascii="Calibri" w:hAnsi="Calibri" w:cs="Calibri"/>
-          <w:b/>
-          <w:bCs/>
-          <w:sz w:val="32"/>
-          <w:szCs w:val="32"/>
-        </w:rPr>
-        <w:t>d</w:t>
+        <w:t xml:space="preserve">    id</w:t>
       </w:r>
       <w:r>
         <w:rPr>
@@ -17795,15 +17775,6 @@
           <w:szCs w:val="32"/>
         </w:rPr>
         <w:tab/>
-      </w:r>
-      <w:r>
-        <w:rPr>
-          <w:rFonts w:ascii="Calibri" w:hAnsi="Calibri" w:cs="Calibri"/>
-          <w:b/>
-          <w:bCs/>
-          <w:sz w:val="32"/>
-          <w:szCs w:val="32"/>
-        </w:rPr>
         <w:t>→ integer</w:t>
       </w:r>
     </w:p>
@@ -17826,27 +17797,7 @@
           <w:sz w:val="32"/>
           <w:szCs w:val="32"/>
         </w:rPr>
-        <w:t xml:space="preserve">    </w:t>
-      </w:r>
-      <w:r>
-        <w:rPr>
-          <w:rFonts w:ascii="Calibri" w:hAnsi="Calibri" w:cs="Calibri"/>
-          <w:b/>
-          <w:bCs/>
-          <w:sz w:val="32"/>
-          <w:szCs w:val="32"/>
-        </w:rPr>
-        <w:t>n</w:t>
-      </w:r>
-      <w:r>
-        <w:rPr>
-          <w:rFonts w:ascii="Calibri" w:hAnsi="Calibri" w:cs="Calibri"/>
-          <w:b/>
-          <w:bCs/>
-          <w:sz w:val="32"/>
-          <w:szCs w:val="32"/>
-        </w:rPr>
-        <w:t>ame</w:t>
+        <w:t xml:space="preserve">    name</w:t>
       </w:r>
       <w:r>
         <w:rPr>
@@ -17857,15 +17808,6 @@
           <w:szCs w:val="32"/>
         </w:rPr>
         <w:tab/>
-      </w:r>
-      <w:r>
-        <w:rPr>
-          <w:rFonts w:ascii="Calibri" w:hAnsi="Calibri" w:cs="Calibri"/>
-          <w:b/>
-          <w:bCs/>
-          <w:sz w:val="32"/>
-          <w:szCs w:val="32"/>
-        </w:rPr>
         <w:t>→ string</w:t>
       </w:r>
     </w:p>
@@ -17888,27 +17830,7 @@
           <w:sz w:val="32"/>
           <w:szCs w:val="32"/>
         </w:rPr>
-        <w:t xml:space="preserve">   </w:t>
-      </w:r>
-      <w:r>
-        <w:rPr>
-          <w:rFonts w:ascii="Calibri" w:hAnsi="Calibri" w:cs="Calibri"/>
-          <w:b/>
-          <w:bCs/>
-          <w:sz w:val="32"/>
-          <w:szCs w:val="32"/>
-        </w:rPr>
-        <w:t xml:space="preserve"> </w:t>
-      </w:r>
-      <w:r>
-        <w:rPr>
-          <w:rFonts w:ascii="Calibri" w:hAnsi="Calibri" w:cs="Calibri"/>
-          <w:b/>
-          <w:bCs/>
-          <w:sz w:val="32"/>
-          <w:szCs w:val="32"/>
-        </w:rPr>
-        <w:t>email</w:t>
+        <w:t xml:space="preserve">    email</w:t>
       </w:r>
       <w:r>
         <w:rPr>
@@ -17919,15 +17841,6 @@
           <w:szCs w:val="32"/>
         </w:rPr>
         <w:tab/>
-      </w:r>
-      <w:r>
-        <w:rPr>
-          <w:rFonts w:ascii="Calibri" w:hAnsi="Calibri" w:cs="Calibri"/>
-          <w:b/>
-          <w:bCs/>
-          <w:sz w:val="32"/>
-          <w:szCs w:val="32"/>
-        </w:rPr>
         <w:t>→ string</w:t>
       </w:r>
     </w:p>
@@ -17961,15 +17874,6 @@
           <w:szCs w:val="32"/>
         </w:rPr>
         <w:tab/>
-      </w:r>
-      <w:r>
-        <w:rPr>
-          <w:rFonts w:ascii="Calibri" w:hAnsi="Calibri" w:cs="Calibri"/>
-          <w:b/>
-          <w:bCs/>
-          <w:sz w:val="32"/>
-          <w:szCs w:val="32"/>
-        </w:rPr>
         <w:t>→ integer</w:t>
       </w:r>
     </w:p>
@@ -19382,47 +19286,23 @@
           <w:sz w:val="36"/>
           <w:szCs w:val="36"/>
         </w:rPr>
-        <w:t xml:space="preserve"># </w:t>
-      </w:r>
-      <w:r>
-        <w:rPr>
-          <w:rFonts w:ascii="Calibri" w:hAnsi="Calibri" w:cs="Calibri"/>
-          <w:sz w:val="36"/>
-          <w:szCs w:val="36"/>
-        </w:rPr>
-        <w:t>Then this</w:t>
-      </w:r>
-      <w:r>
-        <w:rPr>
-          <w:rFonts w:ascii="Calibri" w:hAnsi="Calibri" w:cs="Calibri"/>
-          <w:sz w:val="36"/>
-          <w:szCs w:val="36"/>
-        </w:rPr>
-        <w:t xml:space="preserve"> is valid</w:t>
-      </w:r>
-      <w:r>
-        <w:rPr>
-          <w:rFonts w:ascii="Calibri" w:hAnsi="Calibri" w:cs="Calibri"/>
-          <w:sz w:val="36"/>
-          <w:szCs w:val="36"/>
-        </w:rPr>
-        <w:t xml:space="preserve"> JSON</w:t>
-      </w:r>
-      <w:r>
-        <w:rPr>
-          <w:rFonts w:ascii="Calibri" w:hAnsi="Calibri" w:cs="Calibri"/>
-          <w:sz w:val="36"/>
-          <w:szCs w:val="36"/>
-        </w:rPr>
-        <w:t xml:space="preserve"> data</w:t>
-      </w:r>
-      <w:r>
-        <w:rPr>
-          <w:rFonts w:ascii="Calibri" w:hAnsi="Calibri" w:cs="Calibri"/>
-          <w:sz w:val="36"/>
-          <w:szCs w:val="36"/>
-        </w:rPr>
-        <w:t xml:space="preserve"> where required fields are given and also matches the data type (if not then invalid)</w:t>
+        <w:t># Then this is valid JSON data</w:t>
+      </w:r>
+      <w:r>
+        <w:rPr>
+          <w:rFonts w:ascii="Calibri" w:hAnsi="Calibri" w:cs="Calibri"/>
+          <w:sz w:val="36"/>
+          <w:szCs w:val="36"/>
+        </w:rPr>
+        <w:t xml:space="preserve"> where required fields are given and also matches the data typ</w:t>
+      </w:r>
+      <w:r>
+        <w:rPr>
+          <w:rFonts w:ascii="Calibri" w:hAnsi="Calibri" w:cs="Calibri"/>
+          <w:sz w:val="36"/>
+          <w:szCs w:val="36"/>
+        </w:rPr>
+        <w:t>e</w:t>
       </w:r>
       <w:r>
         <w:rPr>
@@ -19568,6 +19448,132 @@
           <w:sz w:val="36"/>
           <w:szCs w:val="36"/>
         </w:rPr>
+        <w:t xml:space="preserve"># But this is invalid because </w:t>
+      </w:r>
+      <w:r>
+        <w:rPr>
+          <w:rFonts w:ascii="Calibri" w:hAnsi="Calibri" w:cs="Calibri"/>
+          <w:b/>
+          <w:bCs/>
+          <w:sz w:val="36"/>
+          <w:szCs w:val="36"/>
+        </w:rPr>
+        <w:t>id</w:t>
+      </w:r>
+      <w:r>
+        <w:rPr>
+          <w:rFonts w:ascii="Calibri" w:hAnsi="Calibri" w:cs="Calibri"/>
+          <w:sz w:val="36"/>
+          <w:szCs w:val="36"/>
+        </w:rPr>
+        <w:t xml:space="preserve"> was supposed to be an integer and</w:t>
+      </w:r>
+      <w:r>
+        <w:rPr>
+          <w:rFonts w:ascii="Calibri" w:hAnsi="Calibri" w:cs="Calibri"/>
+          <w:b/>
+          <w:bCs/>
+          <w:sz w:val="36"/>
+          <w:szCs w:val="36"/>
+        </w:rPr>
+        <w:t xml:space="preserve"> name</w:t>
+      </w:r>
+      <w:r>
+        <w:rPr>
+          <w:rFonts w:ascii="Calibri" w:hAnsi="Calibri" w:cs="Calibri"/>
+          <w:sz w:val="36"/>
+          <w:szCs w:val="36"/>
+        </w:rPr>
+        <w:t xml:space="preserve"> is required. So, JSON schema is used for VALIDATION in the backend</w:t>
+      </w:r>
+    </w:p>
+    <w:p>
+      <w:pPr>
+        <w:jc w:val="both"/>
+        <w:rPr>
+          <w:rFonts w:ascii="Calibri" w:hAnsi="Calibri" w:cs="Calibri"/>
+          <w:b/>
+          <w:bCs/>
+          <w:color w:val="D86DCB" w:themeColor="accent5" w:themeTint="99"/>
+          <w:sz w:val="36"/>
+          <w:szCs w:val="36"/>
+        </w:rPr>
+      </w:pPr>
+      <w:r>
+        <w:rPr>
+          <w:rFonts w:ascii="Calibri" w:hAnsi="Calibri" w:cs="Calibri"/>
+          <w:b/>
+          <w:bCs/>
+          <w:color w:val="D86DCB" w:themeColor="accent5" w:themeTint="99"/>
+          <w:sz w:val="36"/>
+          <w:szCs w:val="36"/>
+        </w:rPr>
+        <w:t>{</w:t>
+      </w:r>
+    </w:p>
+    <w:p>
+      <w:pPr>
+        <w:jc w:val="both"/>
+        <w:rPr>
+          <w:rFonts w:ascii="Calibri" w:hAnsi="Calibri" w:cs="Calibri"/>
+          <w:b/>
+          <w:bCs/>
+          <w:color w:val="D86DCB" w:themeColor="accent5" w:themeTint="99"/>
+          <w:sz w:val="36"/>
+          <w:szCs w:val="36"/>
+        </w:rPr>
+      </w:pPr>
+      <w:r>
+        <w:rPr>
+          <w:rFonts w:ascii="Calibri" w:hAnsi="Calibri" w:cs="Calibri"/>
+          <w:b/>
+          <w:bCs/>
+          <w:color w:val="D86DCB" w:themeColor="accent5" w:themeTint="99"/>
+          <w:sz w:val="36"/>
+          <w:szCs w:val="36"/>
+        </w:rPr>
+        <w:t xml:space="preserve">  "id": "hello",</w:t>
+      </w:r>
+    </w:p>
+    <w:p>
+      <w:pPr>
+        <w:jc w:val="both"/>
+        <w:rPr>
+          <w:rFonts w:ascii="Calibri" w:hAnsi="Calibri" w:cs="Calibri"/>
+          <w:b/>
+          <w:bCs/>
+          <w:color w:val="D86DCB" w:themeColor="accent5" w:themeTint="99"/>
+          <w:sz w:val="36"/>
+          <w:szCs w:val="36"/>
+        </w:rPr>
+      </w:pPr>
+      <w:r>
+        <w:rPr>
+          <w:rFonts w:ascii="Calibri" w:hAnsi="Calibri" w:cs="Calibri"/>
+          <w:b/>
+          <w:bCs/>
+          <w:color w:val="D86DCB" w:themeColor="accent5" w:themeTint="99"/>
+          <w:sz w:val="36"/>
+          <w:szCs w:val="36"/>
+        </w:rPr>
+        <w:t>}</w:t>
+      </w:r>
+    </w:p>
+    <w:p>
+      <w:pPr>
+        <w:jc w:val="both"/>
+        <w:rPr>
+          <w:rFonts w:ascii="Calibri" w:hAnsi="Calibri" w:cs="Calibri"/>
+          <w:sz w:val="36"/>
+          <w:szCs w:val="36"/>
+        </w:rPr>
+      </w:pPr>
+      <w:r>
+        <w:rPr>
+          <w:rFonts w:ascii="Calibri" w:hAnsi="Calibri" w:cs="Calibri"/>
+          <w:sz w:val="36"/>
+          <w:szCs w:val="36"/>
+        </w:rPr>
         <w:t xml:space="preserve"># </w:t>
       </w:r>
       <w:r>
@@ -19642,6 +19648,7 @@
           <w:sz w:val="32"/>
           <w:szCs w:val="32"/>
         </w:rPr>
+        <w:lastRenderedPageBreak/>
         <w:t>JSON Schema</w:t>
       </w:r>
     </w:p>
@@ -20098,6 +20105,7 @@
           <w:sz w:val="32"/>
           <w:szCs w:val="32"/>
         </w:rPr>
+        <w:lastRenderedPageBreak/>
         <w:t>{</w:t>
       </w:r>
     </w:p>
@@ -20766,6 +20774,7 @@
           <w:sz w:val="32"/>
           <w:szCs w:val="32"/>
         </w:rPr>
+        <w:lastRenderedPageBreak/>
         <w:t xml:space="preserve">      200:</w:t>
       </w:r>
     </w:p>
@@ -20910,7 +20919,6 @@
           <w:sz w:val="32"/>
           <w:szCs w:val="32"/>
         </w:rPr>
-        <w:lastRenderedPageBreak/>
         <w:t xml:space="preserve">                id:</w:t>
       </w:r>
     </w:p>
@@ -21041,23 +21049,7 @@
           <w:sz w:val="36"/>
           <w:szCs w:val="36"/>
         </w:rPr>
-        <w:t xml:space="preserve"> JSON object </w:t>
-      </w:r>
-      <w:r>
-        <w:rPr>
-          <w:rFonts w:ascii="Calibri" w:hAnsi="Calibri" w:cs="Calibri"/>
-          <w:sz w:val="36"/>
-          <w:szCs w:val="36"/>
-        </w:rPr>
-        <w:t>looks</w:t>
-      </w:r>
-      <w:r>
-        <w:rPr>
-          <w:rFonts w:ascii="Calibri" w:hAnsi="Calibri" w:cs="Calibri"/>
-          <w:sz w:val="36"/>
-          <w:szCs w:val="36"/>
-        </w:rPr>
-        <w:t xml:space="preserve"> like</w:t>
+        <w:t xml:space="preserve"> JSON object looks like</w:t>
       </w:r>
       <w:r>
         <w:rPr>
@@ -21399,6 +21391,7 @@
           <w:sz w:val="28"/>
           <w:szCs w:val="28"/>
         </w:rPr>
+        <w:lastRenderedPageBreak/>
         <w:t>│</w:t>
       </w:r>
     </w:p>
@@ -21477,7 +21470,6 @@
           <w:sz w:val="36"/>
           <w:szCs w:val="36"/>
         </w:rPr>
-        <w:lastRenderedPageBreak/>
         <w:t># Database Schema is different it’s the structure/organization of the database</w:t>
       </w:r>
       <w:r>
@@ -21874,6 +21866,7 @@
           <w:sz w:val="28"/>
           <w:szCs w:val="28"/>
         </w:rPr>
+        <w:lastRenderedPageBreak/>
         <w:t>Database</w:t>
       </w:r>
     </w:p>
@@ -22076,7 +22069,6 @@
           <w:sz w:val="28"/>
           <w:szCs w:val="28"/>
         </w:rPr>
-        <w:lastRenderedPageBreak/>
         <w:t>│    └── age</w:t>
       </w:r>
     </w:p>
@@ -22681,6 +22673,7 @@
           <w:sz w:val="32"/>
           <w:szCs w:val="32"/>
         </w:rPr>
+        <w:lastRenderedPageBreak/>
         <w:t>Database Schema</w:t>
       </w:r>
     </w:p>
@@ -22799,7 +22792,6 @@
           <w:sz w:val="36"/>
           <w:szCs w:val="36"/>
         </w:rPr>
-        <w:lastRenderedPageBreak/>
         <w:t xml:space="preserve"># </w:t>
       </w:r>
       <w:r>
@@ -23256,6 +23248,7 @@
           <w:sz w:val="36"/>
           <w:szCs w:val="36"/>
         </w:rPr>
+        <w:lastRenderedPageBreak/>
         <w:t xml:space="preserve"># </w:t>
       </w:r>
       <w:r>
@@ -28917,6 +28910,7 @@
   <w:style w:type="character" w:default="1" w:styleId="DefaultParagraphFont">
     <w:name w:val="Default Paragraph Font"/>
     <w:uiPriority w:val="1"/>
+    <w:semiHidden/>
     <w:unhideWhenUsed/>
   </w:style>
   <w:style w:type="table" w:default="1" w:styleId="TableNormal">

</xml_diff>